<commit_message>
docs: v5.2 — no-margin capital check, daily profit lock-in, futures gate clarification
Co-Authored-By: Claude Sonnet 4.6 <noreply@anthropic.com>
</commit_message>
<xml_diff>
--- a/Trading_Agent_Documentation.docx
+++ b/Trading_Agent_Documentation.docx
@@ -35,7 +35,7 @@
           <w:color w:val="888888"/>
           <w:sz w:val="20"/>
         </w:rPr>
-        <w:t>Amit Garg  ·  May 2026  ·  v5.1  ·  Built with Claude Code + Anthropic API</w:t>
+        <w:t>Amit Garg  ·  May 2026  ·  v5.2  ·  Built with Claude Code + Anthropic API</w:t>
       </w:r>
     </w:p>
     <w:p>
@@ -2654,7 +2654,7 @@
         <w:ind w:left="360"/>
       </w:pPr>
       <w:r>
-        <w:t>Records close reason: TARGET, STOP, or EOD</w:t>
+        <w:t>Records close reason: TARGET, STOP, EOD, or LOCK_IN</w:t>
       </w:r>
     </w:p>
     <w:p>
@@ -2664,6 +2664,69 @@
       </w:pPr>
       <w:r>
         <w:t>No overnight holds — all positions closed by end of day</w:t>
+      </w:r>
+    </w:p>
+    <w:p/>
+    <w:p>
+      <w:pPr>
+        <w:spacing w:after="120"/>
+      </w:pPr>
+      <w:r>
+        <w:t>Daily profit lock-in (runs after every position sync):</w:t>
+      </w:r>
+    </w:p>
+    <w:p>
+      <w:pPr>
+        <w:pStyle w:val="ListBullet"/>
+        <w:ind w:left="360"/>
+      </w:pPr>
+      <w:r>
+        <w:t>Checks today's total realized P&amp;L (excluding CLEANUP, UNFILLED, LOCK_IN positions)</w:t>
+      </w:r>
+    </w:p>
+    <w:p>
+      <w:pPr>
+        <w:pStyle w:val="ListBullet"/>
+        <w:ind w:left="360"/>
+      </w:pPr>
+      <w:r>
+        <w:t>If realized P&amp;L ≥ DAILY_LOCK_IN_TARGET ($716 — the 30-day backtest average), closes ALL remaining open positions immediately via Alpaca with close_reason=LOCK_IN</w:t>
+      </w:r>
+    </w:p>
+    <w:p>
+      <w:pPr>
+        <w:pStyle w:val="ListBullet"/>
+        <w:ind w:left="360"/>
+      </w:pPr>
+      <w:r>
+        <w:t>Books the gain and stops trading for the day — does not wait for EOD</w:t>
+      </w:r>
+    </w:p>
+    <w:p>
+      <w:pPr>
+        <w:pStyle w:val="ListBullet"/>
+        <w:ind w:left="360"/>
+      </w:pPr>
+      <w:r>
+        <w:t>Rationale: realized P&amp;L only (not unrealized) — no slippage risk, gain is fully locked before closing remaining positions</w:t>
+      </w:r>
+    </w:p>
+    <w:p>
+      <w:pPr>
+        <w:pStyle w:val="ListBullet"/>
+        <w:ind w:left="360"/>
+      </w:pPr>
+      <w:r>
+        <w:t>Dashboard shows LOCK_IN positions as "🎯 Day Locked" in Today's Plan status column</w:t>
+      </w:r>
+    </w:p>
+    <w:p>
+      <w:pPr>
+        <w:pStyle w:val="ListBullet"/>
+        <w:ind w:left="360"/>
+      </w:pPr>
+      <w:r>
+        <w:t>Threshold configurable via DAILY_LOCK_IN_TARGET in config/settings.py — raise as capital compounds</w:t>
       </w:r>
     </w:p>
     <w:p>
@@ -5125,31 +5188,19 @@
           <w:tcPr>
             <w:tcW w:type="dxa" w:w="2880"/>
           </w:tcPr>
-          <w:p>
-            <w:r>
-              <w:t>TOTAL_CAPITAL</w:t>
-            </w:r>
-          </w:p>
-        </w:tc>
-        <w:tc>
-          <w:tcPr>
-            <w:tcW w:type="dxa" w:w="2880"/>
-          </w:tcPr>
-          <w:p>
-            <w:r>
-              <w:t>$100,000</w:t>
-            </w:r>
-          </w:p>
-        </w:tc>
-        <w:tc>
-          <w:tcPr>
-            <w:tcW w:type="dxa" w:w="2880"/>
-          </w:tcPr>
-          <w:p>
-            <w:r>
-              <w:t>Starting portfolio size</w:t>
-            </w:r>
-          </w:p>
+          <w:p/>
+        </w:tc>
+        <w:tc>
+          <w:tcPr>
+            <w:tcW w:type="dxa" w:w="2880"/>
+          </w:tcPr>
+          <w:p/>
+        </w:tc>
+        <w:tc>
+          <w:tcPr>
+            <w:tcW w:type="dxa" w:w="2880"/>
+          </w:tcPr>
+          <w:p/>
         </w:tc>
       </w:tr>
       <w:tr>
@@ -5159,27 +5210,27 @@
           </w:tcPr>
           <w:p>
             <w:r>
-              <w:t>DAILY_PROFIT_TARGET</w:t>
-            </w:r>
-          </w:p>
-        </w:tc>
-        <w:tc>
-          <w:tcPr>
-            <w:tcW w:type="dxa" w:w="2880"/>
-          </w:tcPr>
-          <w:p>
-            <w:r>
-              <w:t>$1,000</w:t>
-            </w:r>
-          </w:p>
-        </w:tc>
-        <w:tc>
-          <w:tcPr>
-            <w:tcW w:type="dxa" w:w="2880"/>
-          </w:tcPr>
-          <w:p>
-            <w:r>
-              <w:t>Target P&amp;L shown in dashboard</w:t>
+              <w:t>TOTAL_CAPITAL</w:t>
+            </w:r>
+          </w:p>
+        </w:tc>
+        <w:tc>
+          <w:tcPr>
+            <w:tcW w:type="dxa" w:w="2880"/>
+          </w:tcPr>
+          <w:p>
+            <w:r>
+              <w:t>$100,000</w:t>
+            </w:r>
+          </w:p>
+        </w:tc>
+        <w:tc>
+          <w:tcPr>
+            <w:tcW w:type="dxa" w:w="2880"/>
+          </w:tcPr>
+          <w:p>
+            <w:r>
+              <w:t>Starting portfolio size</w:t>
             </w:r>
           </w:p>
         </w:tc>
@@ -5191,27 +5242,27 @@
           </w:tcPr>
           <w:p>
             <w:r>
-              <w:t>MAX_POSITIONS</w:t>
-            </w:r>
-          </w:p>
-        </w:tc>
-        <w:tc>
-          <w:tcPr>
-            <w:tcW w:type="dxa" w:w="2880"/>
-          </w:tcPr>
-          <w:p>
-            <w:r>
-              <w:t>15</w:t>
-            </w:r>
-          </w:p>
-        </w:tc>
-        <w:tc>
-          <w:tcPr>
-            <w:tcW w:type="dxa" w:w="2880"/>
-          </w:tcPr>
-          <w:p>
-            <w:r>
-              <w:t>Max concurrent open positions (reduced by market conditions)</w:t>
+              <w:t>DAILY_PROFIT_TARGET</w:t>
+            </w:r>
+          </w:p>
+        </w:tc>
+        <w:tc>
+          <w:tcPr>
+            <w:tcW w:type="dxa" w:w="2880"/>
+          </w:tcPr>
+          <w:p>
+            <w:r>
+              <w:t>$1,000</w:t>
+            </w:r>
+          </w:p>
+        </w:tc>
+        <w:tc>
+          <w:tcPr>
+            <w:tcW w:type="dxa" w:w="2880"/>
+          </w:tcPr>
+          <w:p>
+            <w:r>
+              <w:t>Target P&amp;L shown in dashboard</w:t>
             </w:r>
           </w:p>
         </w:tc>
@@ -5223,27 +5274,27 @@
           </w:tcPr>
           <w:p>
             <w:r>
-              <w:t>MAX_POSITION_PCT</w:t>
-            </w:r>
-          </w:p>
-        </w:tc>
-        <w:tc>
-          <w:tcPr>
-            <w:tcW w:type="dxa" w:w="2880"/>
-          </w:tcPr>
-          <w:p>
-            <w:r>
-              <w:t>7%</w:t>
-            </w:r>
-          </w:p>
-        </w:tc>
-        <w:tc>
-          <w:tcPr>
-            <w:tcW w:type="dxa" w:w="2880"/>
-          </w:tcPr>
-          <w:p>
-            <w:r>
-              <w:t>Max capital per single trade ($7K)</w:t>
+              <w:t>MAX_POSITIONS</w:t>
+            </w:r>
+          </w:p>
+        </w:tc>
+        <w:tc>
+          <w:tcPr>
+            <w:tcW w:type="dxa" w:w="2880"/>
+          </w:tcPr>
+          <w:p>
+            <w:r>
+              <w:t>15</w:t>
+            </w:r>
+          </w:p>
+        </w:tc>
+        <w:tc>
+          <w:tcPr>
+            <w:tcW w:type="dxa" w:w="2880"/>
+          </w:tcPr>
+          <w:p>
+            <w:r>
+              <w:t>Max concurrent open positions (reduced by market conditions)</w:t>
             </w:r>
           </w:p>
         </w:tc>
@@ -5255,27 +5306,27 @@
           </w:tcPr>
           <w:p>
             <w:r>
-              <w:t>MIN_POSITION_PCT</w:t>
-            </w:r>
-          </w:p>
-        </w:tc>
-        <w:tc>
-          <w:tcPr>
-            <w:tcW w:type="dxa" w:w="2880"/>
-          </w:tcPr>
-          <w:p>
-            <w:r>
-              <w:t>5%</w:t>
-            </w:r>
-          </w:p>
-        </w:tc>
-        <w:tc>
-          <w:tcPr>
-            <w:tcW w:type="dxa" w:w="2880"/>
-          </w:tcPr>
-          <w:p>
-            <w:r>
-              <w:t>Min capital per single trade ($5K)</w:t>
+              <w:t>MAX_POSITION_PCT</w:t>
+            </w:r>
+          </w:p>
+        </w:tc>
+        <w:tc>
+          <w:tcPr>
+            <w:tcW w:type="dxa" w:w="2880"/>
+          </w:tcPr>
+          <w:p>
+            <w:r>
+              <w:t>7%</w:t>
+            </w:r>
+          </w:p>
+        </w:tc>
+        <w:tc>
+          <w:tcPr>
+            <w:tcW w:type="dxa" w:w="2880"/>
+          </w:tcPr>
+          <w:p>
+            <w:r>
+              <w:t>Max capital per single trade ($7K)</w:t>
             </w:r>
           </w:p>
         </w:tc>
@@ -5287,27 +5338,27 @@
           </w:tcPr>
           <w:p>
             <w:r>
-              <w:t>TARGET_PCT</w:t>
-            </w:r>
-          </w:p>
-        </w:tc>
-        <w:tc>
-          <w:tcPr>
-            <w:tcW w:type="dxa" w:w="2880"/>
-          </w:tcPr>
-          <w:p>
-            <w:r>
-              <w:t>3%</w:t>
-            </w:r>
-          </w:p>
-        </w:tc>
-        <w:tc>
-          <w:tcPr>
-            <w:tcW w:type="dxa" w:w="2880"/>
-          </w:tcPr>
-          <w:p>
-            <w:r>
-              <w:t>Profit target per trade (hard rule — agent must set this exactly)</w:t>
+              <w:t>MIN_POSITION_PCT</w:t>
+            </w:r>
+          </w:p>
+        </w:tc>
+        <w:tc>
+          <w:tcPr>
+            <w:tcW w:type="dxa" w:w="2880"/>
+          </w:tcPr>
+          <w:p>
+            <w:r>
+              <w:t>5%</w:t>
+            </w:r>
+          </w:p>
+        </w:tc>
+        <w:tc>
+          <w:tcPr>
+            <w:tcW w:type="dxa" w:w="2880"/>
+          </w:tcPr>
+          <w:p>
+            <w:r>
+              <w:t>Min capital per single trade ($5K)</w:t>
             </w:r>
           </w:p>
         </w:tc>
@@ -5319,27 +5370,27 @@
           </w:tcPr>
           <w:p>
             <w:r>
-              <w:t>MAX_LOSS_PER_TRADE</w:t>
-            </w:r>
-          </w:p>
-        </w:tc>
-        <w:tc>
-          <w:tcPr>
-            <w:tcW w:type="dxa" w:w="2880"/>
-          </w:tcPr>
-          <w:p>
-            <w:r>
-              <w:t>1%</w:t>
-            </w:r>
-          </w:p>
-        </w:tc>
-        <w:tc>
-          <w:tcPr>
-            <w:tcW w:type="dxa" w:w="2880"/>
-          </w:tcPr>
-          <w:p>
-            <w:r>
-              <w:t>Stop loss threshold — rejects wider stops (hard rule)</w:t>
+              <w:t>TARGET_PCT</w:t>
+            </w:r>
+          </w:p>
+        </w:tc>
+        <w:tc>
+          <w:tcPr>
+            <w:tcW w:type="dxa" w:w="2880"/>
+          </w:tcPr>
+          <w:p>
+            <w:r>
+              <w:t>3%</w:t>
+            </w:r>
+          </w:p>
+        </w:tc>
+        <w:tc>
+          <w:tcPr>
+            <w:tcW w:type="dxa" w:w="2880"/>
+          </w:tcPr>
+          <w:p>
+            <w:r>
+              <w:t>Profit target per trade (hard rule — agent must set this exactly)</w:t>
             </w:r>
           </w:p>
         </w:tc>
@@ -5351,27 +5402,27 @@
           </w:tcPr>
           <w:p>
             <w:r>
-              <w:t>MIN_REWARD_RISK</w:t>
-            </w:r>
-          </w:p>
-        </w:tc>
-        <w:tc>
-          <w:tcPr>
-            <w:tcW w:type="dxa" w:w="2880"/>
-          </w:tcPr>
-          <w:p>
-            <w:r>
-              <w:t>3.0</w:t>
-            </w:r>
-          </w:p>
-        </w:tc>
-        <w:tc>
-          <w:tcPr>
-            <w:tcW w:type="dxa" w:w="2880"/>
-          </w:tcPr>
-          <w:p>
-            <w:r>
-              <w:t>Minimum reward:risk ratio to approve a trade (3:1)</w:t>
+              <w:t>MAX_LOSS_PER_TRADE</w:t>
+            </w:r>
+          </w:p>
+        </w:tc>
+        <w:tc>
+          <w:tcPr>
+            <w:tcW w:type="dxa" w:w="2880"/>
+          </w:tcPr>
+          <w:p>
+            <w:r>
+              <w:t>1%</w:t>
+            </w:r>
+          </w:p>
+        </w:tc>
+        <w:tc>
+          <w:tcPr>
+            <w:tcW w:type="dxa" w:w="2880"/>
+          </w:tcPr>
+          <w:p>
+            <w:r>
+              <w:t>Stop loss threshold — rejects wider stops (hard rule)</w:t>
             </w:r>
           </w:p>
         </w:tc>
@@ -5383,27 +5434,27 @@
           </w:tcPr>
           <w:p>
             <w:r>
-              <w:t>SCORE_THRESHOLD</w:t>
-            </w:r>
-          </w:p>
-        </w:tc>
-        <w:tc>
-          <w:tcPr>
-            <w:tcW w:type="dxa" w:w="2880"/>
-          </w:tcPr>
-          <w:p>
-            <w:r>
-              <w:t>3</w:t>
-            </w:r>
-          </w:p>
-        </w:tc>
-        <w:tc>
-          <w:tcPr>
-            <w:tcW w:type="dxa" w:w="2880"/>
-          </w:tcPr>
-          <w:p>
-            <w:r>
-              <w:t>Minimum scanner score to be a strategy candidate</w:t>
+              <w:t>MIN_REWARD_RISK</w:t>
+            </w:r>
+          </w:p>
+        </w:tc>
+        <w:tc>
+          <w:tcPr>
+            <w:tcW w:type="dxa" w:w="2880"/>
+          </w:tcPr>
+          <w:p>
+            <w:r>
+              <w:t>3.0</w:t>
+            </w:r>
+          </w:p>
+        </w:tc>
+        <w:tc>
+          <w:tcPr>
+            <w:tcW w:type="dxa" w:w="2880"/>
+          </w:tcPr>
+          <w:p>
+            <w:r>
+              <w:t>Minimum reward:risk ratio to approve a trade (3:1)</w:t>
             </w:r>
           </w:p>
         </w:tc>
@@ -5415,27 +5466,27 @@
           </w:tcPr>
           <w:p>
             <w:r>
-              <w:t>RSI_OVERSOLD</w:t>
-            </w:r>
-          </w:p>
-        </w:tc>
-        <w:tc>
-          <w:tcPr>
-            <w:tcW w:type="dxa" w:w="2880"/>
-          </w:tcPr>
-          <w:p>
-            <w:r>
-              <w:t>35</w:t>
-            </w:r>
-          </w:p>
-        </w:tc>
-        <w:tc>
-          <w:tcPr>
-            <w:tcW w:type="dxa" w:w="2880"/>
-          </w:tcPr>
-          <w:p>
-            <w:r>
-              <w:t>RSI level considered oversold (buy signal)</w:t>
+              <w:t>SCORE_THRESHOLD</w:t>
+            </w:r>
+          </w:p>
+        </w:tc>
+        <w:tc>
+          <w:tcPr>
+            <w:tcW w:type="dxa" w:w="2880"/>
+          </w:tcPr>
+          <w:p>
+            <w:r>
+              <w:t>3</w:t>
+            </w:r>
+          </w:p>
+        </w:tc>
+        <w:tc>
+          <w:tcPr>
+            <w:tcW w:type="dxa" w:w="2880"/>
+          </w:tcPr>
+          <w:p>
+            <w:r>
+              <w:t>Minimum scanner score to be a strategy candidate</w:t>
             </w:r>
           </w:p>
         </w:tc>
@@ -5447,27 +5498,27 @@
           </w:tcPr>
           <w:p>
             <w:r>
-              <w:t>RSI_OVERBOUGHT</w:t>
-            </w:r>
-          </w:p>
-        </w:tc>
-        <w:tc>
-          <w:tcPr>
-            <w:tcW w:type="dxa" w:w="2880"/>
-          </w:tcPr>
-          <w:p>
-            <w:r>
-              <w:t>65</w:t>
-            </w:r>
-          </w:p>
-        </w:tc>
-        <w:tc>
-          <w:tcPr>
-            <w:tcW w:type="dxa" w:w="2880"/>
-          </w:tcPr>
-          <w:p>
-            <w:r>
-              <w:t>RSI level considered overbought (sell signal)</w:t>
+              <w:t>RSI_OVERSOLD</w:t>
+            </w:r>
+          </w:p>
+        </w:tc>
+        <w:tc>
+          <w:tcPr>
+            <w:tcW w:type="dxa" w:w="2880"/>
+          </w:tcPr>
+          <w:p>
+            <w:r>
+              <w:t>35</w:t>
+            </w:r>
+          </w:p>
+        </w:tc>
+        <w:tc>
+          <w:tcPr>
+            <w:tcW w:type="dxa" w:w="2880"/>
+          </w:tcPr>
+          <w:p>
+            <w:r>
+              <w:t>RSI level considered oversold (buy signal)</w:t>
             </w:r>
           </w:p>
         </w:tc>
@@ -5479,27 +5530,27 @@
           </w:tcPr>
           <w:p>
             <w:r>
-              <w:t>MIN_VOLUME_RATIO</w:t>
-            </w:r>
-          </w:p>
-        </w:tc>
-        <w:tc>
-          <w:tcPr>
-            <w:tcW w:type="dxa" w:w="2880"/>
-          </w:tcPr>
-          <w:p>
-            <w:r>
-              <w:t>1.5x</w:t>
-            </w:r>
-          </w:p>
-        </w:tc>
-        <w:tc>
-          <w:tcPr>
-            <w:tcW w:type="dxa" w:w="2880"/>
-          </w:tcPr>
-          <w:p>
-            <w:r>
-              <w:t>Volume must be 1.5x the 20-day average</w:t>
+              <w:t>RSI_OVERBOUGHT</w:t>
+            </w:r>
+          </w:p>
+        </w:tc>
+        <w:tc>
+          <w:tcPr>
+            <w:tcW w:type="dxa" w:w="2880"/>
+          </w:tcPr>
+          <w:p>
+            <w:r>
+              <w:t>65</w:t>
+            </w:r>
+          </w:p>
+        </w:tc>
+        <w:tc>
+          <w:tcPr>
+            <w:tcW w:type="dxa" w:w="2880"/>
+          </w:tcPr>
+          <w:p>
+            <w:r>
+              <w:t>RSI level considered overbought (sell signal)</w:t>
             </w:r>
           </w:p>
         </w:tc>
@@ -5511,27 +5562,27 @@
           </w:tcPr>
           <w:p>
             <w:r>
-              <w:t>MIN_AVG_VOLUME</w:t>
-            </w:r>
-          </w:p>
-        </w:tc>
-        <w:tc>
-          <w:tcPr>
-            <w:tcW w:type="dxa" w:w="2880"/>
-          </w:tcPr>
-          <w:p>
-            <w:r>
-              <w:t>500,000</w:t>
-            </w:r>
-          </w:p>
-        </w:tc>
-        <w:tc>
-          <w:tcPr>
-            <w:tcW w:type="dxa" w:w="2880"/>
-          </w:tcPr>
-          <w:p>
-            <w:r>
-              <w:t>Minimum average daily volume (liquidity floor)</w:t>
+              <w:t>MIN_VOLUME_RATIO</w:t>
+            </w:r>
+          </w:p>
+        </w:tc>
+        <w:tc>
+          <w:tcPr>
+            <w:tcW w:type="dxa" w:w="2880"/>
+          </w:tcPr>
+          <w:p>
+            <w:r>
+              <w:t>1.5x</w:t>
+            </w:r>
+          </w:p>
+        </w:tc>
+        <w:tc>
+          <w:tcPr>
+            <w:tcW w:type="dxa" w:w="2880"/>
+          </w:tcPr>
+          <w:p>
+            <w:r>
+              <w:t>Volume must be 1.5x the 20-day average</w:t>
             </w:r>
           </w:p>
         </w:tc>
@@ -5543,27 +5594,27 @@
           </w:tcPr>
           <w:p>
             <w:r>
-              <w:t>MIN_PRICE</w:t>
-            </w:r>
-          </w:p>
-        </w:tc>
-        <w:tc>
-          <w:tcPr>
-            <w:tcW w:type="dxa" w:w="2880"/>
-          </w:tcPr>
-          <w:p>
-            <w:r>
-              <w:t>$5.00</w:t>
-            </w:r>
-          </w:p>
-        </w:tc>
-        <w:tc>
-          <w:tcPr>
-            <w:tcW w:type="dxa" w:w="2880"/>
-          </w:tcPr>
-          <w:p>
-            <w:r>
-              <w:t>Minimum stock price (filters out penny stocks)</w:t>
+              <w:t>MIN_AVG_VOLUME</w:t>
+            </w:r>
+          </w:p>
+        </w:tc>
+        <w:tc>
+          <w:tcPr>
+            <w:tcW w:type="dxa" w:w="2880"/>
+          </w:tcPr>
+          <w:p>
+            <w:r>
+              <w:t>500,000</w:t>
+            </w:r>
+          </w:p>
+        </w:tc>
+        <w:tc>
+          <w:tcPr>
+            <w:tcW w:type="dxa" w:w="2880"/>
+          </w:tcPr>
+          <w:p>
+            <w:r>
+              <w:t>Minimum average daily volume (liquidity floor)</w:t>
             </w:r>
           </w:p>
         </w:tc>
@@ -5575,27 +5626,27 @@
           </w:tcPr>
           <w:p>
             <w:r>
-              <w:t>MAX_PER_SECTOR</w:t>
-            </w:r>
-          </w:p>
-        </w:tc>
-        <w:tc>
-          <w:tcPr>
-            <w:tcW w:type="dxa" w:w="2880"/>
-          </w:tcPr>
-          <w:p>
-            <w:r>
-              <w:t>3</w:t>
-            </w:r>
-          </w:p>
-        </w:tc>
-        <w:tc>
-          <w:tcPr>
-            <w:tcW w:type="dxa" w:w="2880"/>
-          </w:tcPr>
-          <w:p>
-            <w:r>
-              <w:t>V2d: max positions in any single sector per day</w:t>
+              <w:t>MIN_PRICE</w:t>
+            </w:r>
+          </w:p>
+        </w:tc>
+        <w:tc>
+          <w:tcPr>
+            <w:tcW w:type="dxa" w:w="2880"/>
+          </w:tcPr>
+          <w:p>
+            <w:r>
+              <w:t>$5.00</w:t>
+            </w:r>
+          </w:p>
+        </w:tc>
+        <w:tc>
+          <w:tcPr>
+            <w:tcW w:type="dxa" w:w="2880"/>
+          </w:tcPr>
+          <w:p>
+            <w:r>
+              <w:t>Minimum stock price (filters out penny stocks)</w:t>
             </w:r>
           </w:p>
         </w:tc>
@@ -5607,27 +5658,27 @@
           </w:tcPr>
           <w:p>
             <w:r>
-              <w:t>DAILY_LOSS_LIMIT</w:t>
-            </w:r>
-          </w:p>
-        </w:tc>
-        <w:tc>
-          <w:tcPr>
-            <w:tcW w:type="dxa" w:w="2880"/>
-          </w:tcPr>
-          <w:p>
-            <w:r>
-              <w:t>-$300</w:t>
-            </w:r>
-          </w:p>
-        </w:tc>
-        <w:tc>
-          <w:tcPr>
-            <w:tcW w:type="dxa" w:w="2880"/>
-          </w:tcPr>
-          <w:p>
-            <w:r>
-              <w:t>V5: stop opening new trades if today's realized P&amp;L drops below this</w:t>
+              <w:t>MAX_PER_SECTOR</w:t>
+            </w:r>
+          </w:p>
+        </w:tc>
+        <w:tc>
+          <w:tcPr>
+            <w:tcW w:type="dxa" w:w="2880"/>
+          </w:tcPr>
+          <w:p>
+            <w:r>
+              <w:t>3</w:t>
+            </w:r>
+          </w:p>
+        </w:tc>
+        <w:tc>
+          <w:tcPr>
+            <w:tcW w:type="dxa" w:w="2880"/>
+          </w:tcPr>
+          <w:p>
+            <w:r>
+              <w:t>V2d: max positions in any single sector per day</w:t>
             </w:r>
           </w:p>
         </w:tc>
@@ -5639,6 +5690,38 @@
           </w:tcPr>
           <w:p>
             <w:r>
+              <w:t>DAILY_LOSS_LIMIT</w:t>
+            </w:r>
+          </w:p>
+        </w:tc>
+        <w:tc>
+          <w:tcPr>
+            <w:tcW w:type="dxa" w:w="2880"/>
+          </w:tcPr>
+          <w:p>
+            <w:r>
+              <w:t>-$300</w:t>
+            </w:r>
+          </w:p>
+        </w:tc>
+        <w:tc>
+          <w:tcPr>
+            <w:tcW w:type="dxa" w:w="2880"/>
+          </w:tcPr>
+          <w:p>
+            <w:r>
+              <w:t>V5: stop opening new trades if today's realized P&amp;L drops below this</w:t>
+            </w:r>
+          </w:p>
+        </w:tc>
+      </w:tr>
+      <w:tr>
+        <w:tc>
+          <w:tcPr>
+            <w:tcW w:type="dxa" w:w="2880"/>
+          </w:tcPr>
+          <w:p>
+            <w:r>
               <w:t>PRICE_SANITY_PCT</w:t>
             </w:r>
           </w:p>
@@ -5660,6 +5743,38 @@
           <w:p>
             <w:r>
               <w:t>V5: reject trade if entry price is more than 5% from current market price</w:t>
+            </w:r>
+          </w:p>
+        </w:tc>
+      </w:tr>
+      <w:tr>
+        <w:tc>
+          <w:tcPr>
+            <w:tcW w:type="dxa" w:w="2880"/>
+          </w:tcPr>
+          <w:p>
+            <w:r>
+              <w:t>DAILY_LOCK_IN_TARGET</w:t>
+            </w:r>
+          </w:p>
+        </w:tc>
+        <w:tc>
+          <w:tcPr>
+            <w:tcW w:type="dxa" w:w="2880"/>
+          </w:tcPr>
+          <w:p>
+            <w:r>
+              <w:t>$716</w:t>
+            </w:r>
+          </w:p>
+        </w:tc>
+        <w:tc>
+          <w:tcPr>
+            <w:tcW w:type="dxa" w:w="2880"/>
+          </w:tcPr>
+          <w:p>
+            <w:r>
+              <w:t>V5: close all open positions and lock in gains once today's realized P&amp;L hits this threshold — set to 30-day backtest average daily P&amp;L; raise as capital compounds</w:t>
             </w:r>
           </w:p>
         </w:tc>
@@ -6407,7 +6522,7 @@
         <w:ind w:left="360"/>
       </w:pPr>
       <w:r>
-        <w:t>VIX tiered gate: ^VIX from yfinance. VIX &gt;45 → 2 pos; VIX 30–45 → 3 pos; VIX 25–30 → 5 pos; VIX 20–25 → 10 pos; VIX &lt;20 → 15 pos. No hard skip — always trades with reduced positions at high VIX.</w:t>
+        <w:t>VIX tiered gate: ^VIX from yfinance. VIX &gt;45 → 2 pos; VIX 30–45 → 3 pos; VIX 25–30 → 5 pos; VIX 20–25 → 10 pos; VIX &lt;20 → 15 pos. No hard skip on VIX alone — futures gate handles genuine crash days.</w:t>
       </w:r>
     </w:p>
     <w:p>
@@ -6416,7 +6531,7 @@
         <w:ind w:left="360"/>
       </w:pPr>
       <w:r>
-        <w:t>Futures gate: ES=F, NQ=F, YM=F. Skip if average down &gt;1.5% (strong pre-market sell-off). Caution if down &gt;0.5%, bullish bias if up &gt;0.5%.</w:t>
+        <w:t>Futures gate (tiered — two separate thresholds): ES=F, NQ=F, YM=F average change. Below -1.5% → SKIP entire day (strong pre-market sell-off, no trades at all). Between -0.5% and -1.5% → CAUTION, reduce to 8 positions max, futures_bias=BEARISH. Above +0.5% → BULLISH bias. These are distinct tiers, not contradictory: caution band still trades (with fewer positions), hard skip fires only on a genuine crash.</w:t>
       </w:r>
     </w:p>
     <w:p>
@@ -6967,27 +7082,27 @@
           </w:tcPr>
           <w:p>
             <w:r>
-              <w:t>Capital check</w:t>
-            </w:r>
-          </w:p>
-        </w:tc>
-        <w:tc>
-          <w:tcPr>
-            <w:tcW w:type="dxa" w:w="2880"/>
-          </w:tcPr>
-          <w:p>
-            <w:r>
-              <w:t>Alpaca broker only: rejects if Alpaca buying_power &lt; position_size before order submission</w:t>
-            </w:r>
-          </w:p>
-        </w:tc>
-        <w:tc>
-          <w:tcPr>
-            <w:tcW w:type="dxa" w:w="2880"/>
-          </w:tcPr>
-          <w:p>
-            <w:r>
-              <w:t>Calls alpaca_broker.get_buying_power()</w:t>
+              <w:t>Cumulative capital check</w:t>
+            </w:r>
+          </w:p>
+        </w:tc>
+        <w:tc>
+          <w:tcPr>
+            <w:tcW w:type="dxa" w:w="2880"/>
+          </w:tcPr>
+          <w:p>
+            <w:r>
+              <w:t>Tracks total committed capital across the full approved batch — rejects any trade that would push total deployed capital past available buying_power. Applies to both Alpaca and simulation modes. Prevents margin trading and over-deployment.</w:t>
+            </w:r>
+          </w:p>
+        </w:tc>
+        <w:tc>
+          <w:tcPr>
+            <w:tcW w:type="dxa" w:w="2880"/>
+          </w:tcPr>
+          <w:p>
+            <w:r>
+              <w:t>Calls alpaca_broker.get_buying_power() for Alpaca; uses TOTAL_CAPITAL for simulation</w:t>
             </w:r>
           </w:p>
         </w:tc>
@@ -8634,31 +8749,19 @@
           <w:tcPr>
             <w:tcW w:type="dxa" w:w="2880"/>
           </w:tcPr>
-          <w:p>
-            <w:r>
-              <w:t>1</w:t>
-            </w:r>
-          </w:p>
-        </w:tc>
-        <w:tc>
-          <w:tcPr>
-            <w:tcW w:type="dxa" w:w="2880"/>
-          </w:tcPr>
-          <w:p>
-            <w:r>
-              <w:t>Designed the architecture</w:t>
-            </w:r>
-          </w:p>
-        </w:tc>
-        <w:tc>
-          <w:tcPr>
-            <w:tcW w:type="dxa" w:w="2880"/>
-          </w:tcPr>
-          <w:p>
-            <w:r>
-              <w:t>Multi-agent pipeline — scanner → strategy → risk → portfolio</w:t>
-            </w:r>
-          </w:p>
+          <w:p/>
+        </w:tc>
+        <w:tc>
+          <w:tcPr>
+            <w:tcW w:type="dxa" w:w="2880"/>
+          </w:tcPr>
+          <w:p/>
+        </w:tc>
+        <w:tc>
+          <w:tcPr>
+            <w:tcW w:type="dxa" w:w="2880"/>
+          </w:tcPr>
+          <w:p/>
         </w:tc>
       </w:tr>
       <w:tr>
@@ -8668,27 +8771,27 @@
           </w:tcPr>
           <w:p>
             <w:r>
-              <w:t>2</w:t>
-            </w:r>
-          </w:p>
-        </w:tc>
-        <w:tc>
-          <w:tcPr>
-            <w:tcW w:type="dxa" w:w="2880"/>
-          </w:tcPr>
-          <w:p>
-            <w:r>
-              <w:t>Built the market scanner</w:t>
-            </w:r>
-          </w:p>
-        </w:tc>
-        <w:tc>
-          <w:tcPr>
-            <w:tcW w:type="dxa" w:w="2880"/>
-          </w:tcPr>
-          <w:p>
-            <w:r>
-              <w:t>yfinance + ta library, scoring 60+ tickers initially</w:t>
+              <w:t>1</w:t>
+            </w:r>
+          </w:p>
+        </w:tc>
+        <w:tc>
+          <w:tcPr>
+            <w:tcW w:type="dxa" w:w="2880"/>
+          </w:tcPr>
+          <w:p>
+            <w:r>
+              <w:t>Designed the architecture</w:t>
+            </w:r>
+          </w:p>
+        </w:tc>
+        <w:tc>
+          <w:tcPr>
+            <w:tcW w:type="dxa" w:w="2880"/>
+          </w:tcPr>
+          <w:p>
+            <w:r>
+              <w:t>Multi-agent pipeline — scanner → strategy → risk → portfolio</w:t>
             </w:r>
           </w:p>
         </w:tc>
@@ -8700,27 +8803,27 @@
           </w:tcPr>
           <w:p>
             <w:r>
-              <w:t>3</w:t>
-            </w:r>
-          </w:p>
-        </w:tc>
-        <w:tc>
-          <w:tcPr>
-            <w:tcW w:type="dxa" w:w="2880"/>
-          </w:tcPr>
-          <w:p>
-            <w:r>
-              <w:t>Built the strategy agent</w:t>
-            </w:r>
-          </w:p>
-        </w:tc>
-        <w:tc>
-          <w:tcPr>
-            <w:tcW w:type="dxa" w:w="2880"/>
-          </w:tcPr>
-          <w:p>
-            <w:r>
-              <w:t>Claude selects trades with entry/target/stop/reasoning</w:t>
+              <w:t>2</w:t>
+            </w:r>
+          </w:p>
+        </w:tc>
+        <w:tc>
+          <w:tcPr>
+            <w:tcW w:type="dxa" w:w="2880"/>
+          </w:tcPr>
+          <w:p>
+            <w:r>
+              <w:t>Built the market scanner</w:t>
+            </w:r>
+          </w:p>
+        </w:tc>
+        <w:tc>
+          <w:tcPr>
+            <w:tcW w:type="dxa" w:w="2880"/>
+          </w:tcPr>
+          <w:p>
+            <w:r>
+              <w:t>yfinance + ta library, scoring 60+ tickers initially</w:t>
             </w:r>
           </w:p>
         </w:tc>
@@ -8732,27 +8835,27 @@
           </w:tcPr>
           <w:p>
             <w:r>
-              <w:t>4</w:t>
-            </w:r>
-          </w:p>
-        </w:tc>
-        <w:tc>
-          <w:tcPr>
-            <w:tcW w:type="dxa" w:w="2880"/>
-          </w:tcPr>
-          <w:p>
-            <w:r>
-              <w:t>Built the risk agent</w:t>
-            </w:r>
-          </w:p>
-        </w:tc>
-        <w:tc>
-          <w:tcPr>
-            <w:tcW w:type="dxa" w:w="2880"/>
-          </w:tcPr>
-          <w:p>
-            <w:r>
-              <w:t>Claude validates every trade against hard risk rules</w:t>
+              <w:t>3</w:t>
+            </w:r>
+          </w:p>
+        </w:tc>
+        <w:tc>
+          <w:tcPr>
+            <w:tcW w:type="dxa" w:w="2880"/>
+          </w:tcPr>
+          <w:p>
+            <w:r>
+              <w:t>Built the strategy agent</w:t>
+            </w:r>
+          </w:p>
+        </w:tc>
+        <w:tc>
+          <w:tcPr>
+            <w:tcW w:type="dxa" w:w="2880"/>
+          </w:tcPr>
+          <w:p>
+            <w:r>
+              <w:t>Claude selects trades with entry/target/stop/reasoning</w:t>
             </w:r>
           </w:p>
         </w:tc>
@@ -8764,27 +8867,27 @@
           </w:tcPr>
           <w:p>
             <w:r>
-              <w:t>5</w:t>
-            </w:r>
-          </w:p>
-        </w:tc>
-        <w:tc>
-          <w:tcPr>
-            <w:tcW w:type="dxa" w:w="2880"/>
-          </w:tcPr>
-          <w:p>
-            <w:r>
-              <w:t>Built the portfolio agent</w:t>
-            </w:r>
-          </w:p>
-        </w:tc>
-        <w:tc>
-          <w:tcPr>
-            <w:tcW w:type="dxa" w:w="2880"/>
-          </w:tcPr>
-          <w:p>
-            <w:r>
-              <w:t>Opens and tracks simulated positions in Supabase</w:t>
+              <w:t>4</w:t>
+            </w:r>
+          </w:p>
+        </w:tc>
+        <w:tc>
+          <w:tcPr>
+            <w:tcW w:type="dxa" w:w="2880"/>
+          </w:tcPr>
+          <w:p>
+            <w:r>
+              <w:t>Built the risk agent</w:t>
+            </w:r>
+          </w:p>
+        </w:tc>
+        <w:tc>
+          <w:tcPr>
+            <w:tcW w:type="dxa" w:w="2880"/>
+          </w:tcPr>
+          <w:p>
+            <w:r>
+              <w:t>Claude validates every trade against hard risk rules</w:t>
             </w:r>
           </w:p>
         </w:tc>
@@ -8796,27 +8899,27 @@
           </w:tcPr>
           <w:p>
             <w:r>
-              <w:t>6</w:t>
-            </w:r>
-          </w:p>
-        </w:tc>
-        <w:tc>
-          <w:tcPr>
-            <w:tcW w:type="dxa" w:w="2880"/>
-          </w:tcPr>
-          <w:p>
-            <w:r>
-              <w:t>Built the intraday agent</w:t>
-            </w:r>
-          </w:p>
-        </w:tc>
-        <w:tc>
-          <w:tcPr>
-            <w:tcW w:type="dxa" w:w="2880"/>
-          </w:tcPr>
-          <w:p>
-            <w:r>
-              <w:t>Monitors positions every 30 min, closes on target/stop</w:t>
+              <w:t>5</w:t>
+            </w:r>
+          </w:p>
+        </w:tc>
+        <w:tc>
+          <w:tcPr>
+            <w:tcW w:type="dxa" w:w="2880"/>
+          </w:tcPr>
+          <w:p>
+            <w:r>
+              <w:t>Built the portfolio agent</w:t>
+            </w:r>
+          </w:p>
+        </w:tc>
+        <w:tc>
+          <w:tcPr>
+            <w:tcW w:type="dxa" w:w="2880"/>
+          </w:tcPr>
+          <w:p>
+            <w:r>
+              <w:t>Opens and tracks simulated positions in Supabase</w:t>
             </w:r>
           </w:p>
         </w:tc>
@@ -8828,27 +8931,27 @@
           </w:tcPr>
           <w:p>
             <w:r>
-              <w:t>7</w:t>
-            </w:r>
-          </w:p>
-        </w:tc>
-        <w:tc>
-          <w:tcPr>
-            <w:tcW w:type="dxa" w:w="2880"/>
-          </w:tcPr>
-          <w:p>
-            <w:r>
-              <w:t>Built the EOD agent</w:t>
-            </w:r>
-          </w:p>
-        </w:tc>
-        <w:tc>
-          <w:tcPr>
-            <w:tcW w:type="dxa" w:w="2880"/>
-          </w:tcPr>
-          <w:p>
-            <w:r>
-              <w:t>Calculates daily P&amp;L, updates portfolio capital</w:t>
+              <w:t>6</w:t>
+            </w:r>
+          </w:p>
+        </w:tc>
+        <w:tc>
+          <w:tcPr>
+            <w:tcW w:type="dxa" w:w="2880"/>
+          </w:tcPr>
+          <w:p>
+            <w:r>
+              <w:t>Built the intraday agent</w:t>
+            </w:r>
+          </w:p>
+        </w:tc>
+        <w:tc>
+          <w:tcPr>
+            <w:tcW w:type="dxa" w:w="2880"/>
+          </w:tcPr>
+          <w:p>
+            <w:r>
+              <w:t>Monitors positions every 30 min, closes on target/stop</w:t>
             </w:r>
           </w:p>
         </w:tc>
@@ -8860,27 +8963,27 @@
           </w:tcPr>
           <w:p>
             <w:r>
-              <w:t>8</w:t>
-            </w:r>
-          </w:p>
-        </w:tc>
-        <w:tc>
-          <w:tcPr>
-            <w:tcW w:type="dxa" w:w="2880"/>
-          </w:tcPr>
-          <w:p>
-            <w:r>
-              <w:t>Wrote the orchestrator</w:t>
-            </w:r>
-          </w:p>
-        </w:tc>
-        <w:tc>
-          <w:tcPr>
-            <w:tcW w:type="dxa" w:w="2880"/>
-          </w:tcPr>
-          <w:p>
-            <w:r>
-              <w:t>Chains all agents, callable with --mode flag</w:t>
+              <w:t>7</w:t>
+            </w:r>
+          </w:p>
+        </w:tc>
+        <w:tc>
+          <w:tcPr>
+            <w:tcW w:type="dxa" w:w="2880"/>
+          </w:tcPr>
+          <w:p>
+            <w:r>
+              <w:t>Built the EOD agent</w:t>
+            </w:r>
+          </w:p>
+        </w:tc>
+        <w:tc>
+          <w:tcPr>
+            <w:tcW w:type="dxa" w:w="2880"/>
+          </w:tcPr>
+          <w:p>
+            <w:r>
+              <w:t>Calculates daily P&amp;L, updates portfolio capital</w:t>
             </w:r>
           </w:p>
         </w:tc>
@@ -8892,27 +8995,27 @@
           </w:tcPr>
           <w:p>
             <w:r>
-              <w:t>9</w:t>
-            </w:r>
-          </w:p>
-        </w:tc>
-        <w:tc>
-          <w:tcPr>
-            <w:tcW w:type="dxa" w:w="2880"/>
-          </w:tcPr>
-          <w:p>
-            <w:r>
-              <w:t>Created the database schema</w:t>
-            </w:r>
-          </w:p>
-        </w:tc>
-        <w:tc>
-          <w:tcPr>
-            <w:tcW w:type="dxa" w:w="2880"/>
-          </w:tcPr>
-          <w:p>
-            <w:r>
-              <w:t>Five Supabase tables with proper indexes and constraints</w:t>
+              <w:t>8</w:t>
+            </w:r>
+          </w:p>
+        </w:tc>
+        <w:tc>
+          <w:tcPr>
+            <w:tcW w:type="dxa" w:w="2880"/>
+          </w:tcPr>
+          <w:p>
+            <w:r>
+              <w:t>Wrote the orchestrator</w:t>
+            </w:r>
+          </w:p>
+        </w:tc>
+        <w:tc>
+          <w:tcPr>
+            <w:tcW w:type="dxa" w:w="2880"/>
+          </w:tcPr>
+          <w:p>
+            <w:r>
+              <w:t>Chains all agents, callable with --mode flag</w:t>
             </w:r>
           </w:p>
         </w:tc>
@@ -8924,27 +9027,27 @@
           </w:tcPr>
           <w:p>
             <w:r>
-              <w:t>10</w:t>
-            </w:r>
-          </w:p>
-        </w:tc>
-        <w:tc>
-          <w:tcPr>
-            <w:tcW w:type="dxa" w:w="2880"/>
-          </w:tcPr>
-          <w:p>
-            <w:r>
-              <w:t>Set up GitHub Actions</w:t>
-            </w:r>
-          </w:p>
-        </w:tc>
-        <w:tc>
-          <w:tcPr>
-            <w:tcW w:type="dxa" w:w="2880"/>
-          </w:tcPr>
-          <w:p>
-            <w:r>
-              <w:t>Cron workflow running premarket/intraday/EOD on weekdays</w:t>
+              <w:t>9</w:t>
+            </w:r>
+          </w:p>
+        </w:tc>
+        <w:tc>
+          <w:tcPr>
+            <w:tcW w:type="dxa" w:w="2880"/>
+          </w:tcPr>
+          <w:p>
+            <w:r>
+              <w:t>Created the database schema</w:t>
+            </w:r>
+          </w:p>
+        </w:tc>
+        <w:tc>
+          <w:tcPr>
+            <w:tcW w:type="dxa" w:w="2880"/>
+          </w:tcPr>
+          <w:p>
+            <w:r>
+              <w:t>Five Supabase tables with proper indexes and constraints</w:t>
             </w:r>
           </w:p>
         </w:tc>
@@ -8956,27 +9059,27 @@
           </w:tcPr>
           <w:p>
             <w:r>
-              <w:t>11</w:t>
-            </w:r>
-          </w:p>
-        </w:tc>
-        <w:tc>
-          <w:tcPr>
-            <w:tcW w:type="dxa" w:w="2880"/>
-          </w:tcPr>
-          <w:p>
-            <w:r>
-              <w:t>Set up Git + GitHub (SSH)</w:t>
-            </w:r>
-          </w:p>
-        </w:tc>
-        <w:tc>
-          <w:tcPr>
-            <w:tcW w:type="dxa" w:w="2880"/>
-          </w:tcPr>
-          <w:p>
-            <w:r>
-              <w:t>Generated SSH key, added to GitHub, switched remote to SSH</w:t>
+              <w:t>10</w:t>
+            </w:r>
+          </w:p>
+        </w:tc>
+        <w:tc>
+          <w:tcPr>
+            <w:tcW w:type="dxa" w:w="2880"/>
+          </w:tcPr>
+          <w:p>
+            <w:r>
+              <w:t>Set up GitHub Actions</w:t>
+            </w:r>
+          </w:p>
+        </w:tc>
+        <w:tc>
+          <w:tcPr>
+            <w:tcW w:type="dxa" w:w="2880"/>
+          </w:tcPr>
+          <w:p>
+            <w:r>
+              <w:t>Cron workflow running premarket/intraday/EOD on weekdays</w:t>
             </w:r>
           </w:p>
         </w:tc>
@@ -8988,27 +9091,27 @@
           </w:tcPr>
           <w:p>
             <w:r>
-              <w:t>12</w:t>
-            </w:r>
-          </w:p>
-        </w:tc>
-        <w:tc>
-          <w:tcPr>
-            <w:tcW w:type="dxa" w:w="2880"/>
-          </w:tcPr>
-          <w:p>
-            <w:r>
-              <w:t>Set up Supabase</w:t>
-            </w:r>
-          </w:p>
-        </w:tc>
-        <w:tc>
-          <w:tcPr>
-            <w:tcW w:type="dxa" w:w="2880"/>
-          </w:tcPr>
-          <w:p>
-            <w:r>
-              <w:t>Created project, ran schema.sql, obtained URL and service role key</w:t>
+              <w:t>11</w:t>
+            </w:r>
+          </w:p>
+        </w:tc>
+        <w:tc>
+          <w:tcPr>
+            <w:tcW w:type="dxa" w:w="2880"/>
+          </w:tcPr>
+          <w:p>
+            <w:r>
+              <w:t>Set up Git + GitHub (SSH)</w:t>
+            </w:r>
+          </w:p>
+        </w:tc>
+        <w:tc>
+          <w:tcPr>
+            <w:tcW w:type="dxa" w:w="2880"/>
+          </w:tcPr>
+          <w:p>
+            <w:r>
+              <w:t>Generated SSH key, added to GitHub, switched remote to SSH</w:t>
             </w:r>
           </w:p>
         </w:tc>
@@ -9020,27 +9123,27 @@
           </w:tcPr>
           <w:p>
             <w:r>
-              <w:t>13</w:t>
-            </w:r>
-          </w:p>
-        </w:tc>
-        <w:tc>
-          <w:tcPr>
-            <w:tcW w:type="dxa" w:w="2880"/>
-          </w:tcPr>
-          <w:p>
-            <w:r>
-              <w:t>Set GitHub Secrets</w:t>
-            </w:r>
-          </w:p>
-        </w:tc>
-        <w:tc>
-          <w:tcPr>
-            <w:tcW w:type="dxa" w:w="2880"/>
-          </w:tcPr>
-          <w:p>
-            <w:r>
-              <w:t>Added API keys to repo secrets for runtime injection</w:t>
+              <w:t>12</w:t>
+            </w:r>
+          </w:p>
+        </w:tc>
+        <w:tc>
+          <w:tcPr>
+            <w:tcW w:type="dxa" w:w="2880"/>
+          </w:tcPr>
+          <w:p>
+            <w:r>
+              <w:t>Set up Supabase</w:t>
+            </w:r>
+          </w:p>
+        </w:tc>
+        <w:tc>
+          <w:tcPr>
+            <w:tcW w:type="dxa" w:w="2880"/>
+          </w:tcPr>
+          <w:p>
+            <w:r>
+              <w:t>Created project, ran schema.sql, obtained URL and service role key</w:t>
             </w:r>
           </w:p>
         </w:tc>
@@ -9052,27 +9155,27 @@
           </w:tcPr>
           <w:p>
             <w:r>
-              <w:t>14</w:t>
-            </w:r>
-          </w:p>
-        </w:tc>
-        <w:tc>
-          <w:tcPr>
-            <w:tcW w:type="dxa" w:w="2880"/>
-          </w:tcPr>
-          <w:p>
-            <w:r>
-              <w:t>End-to-end test</w:t>
-            </w:r>
-          </w:p>
-        </w:tc>
-        <w:tc>
-          <w:tcPr>
-            <w:tcW w:type="dxa" w:w="2880"/>
-          </w:tcPr>
-          <w:p>
-            <w:r>
-              <w:t>Manual premarket run via GitHub Actions — confirmed full pipeline working</w:t>
+              <w:t>13</w:t>
+            </w:r>
+          </w:p>
+        </w:tc>
+        <w:tc>
+          <w:tcPr>
+            <w:tcW w:type="dxa" w:w="2880"/>
+          </w:tcPr>
+          <w:p>
+            <w:r>
+              <w:t>Set GitHub Secrets</w:t>
+            </w:r>
+          </w:p>
+        </w:tc>
+        <w:tc>
+          <w:tcPr>
+            <w:tcW w:type="dxa" w:w="2880"/>
+          </w:tcPr>
+          <w:p>
+            <w:r>
+              <w:t>Added API keys to repo secrets for runtime injection</w:t>
             </w:r>
           </w:p>
         </w:tc>
@@ -9084,27 +9187,27 @@
           </w:tcPr>
           <w:p>
             <w:r>
-              <w:t>15</w:t>
-            </w:r>
-          </w:p>
-        </w:tc>
-        <w:tc>
-          <w:tcPr>
-            <w:tcW w:type="dxa" w:w="2880"/>
-          </w:tcPr>
-          <w:p>
-            <w:r>
-              <w:t>Built the Streamlit dashboard</w:t>
-            </w:r>
-          </w:p>
-        </w:tc>
-        <w:tc>
-          <w:tcPr>
-            <w:tcW w:type="dxa" w:w="2880"/>
-          </w:tcPr>
-          <w:p>
-            <w:r>
-              <w:t>4-tab app with Today, Positions, Performance, Scan Log</w:t>
+              <w:t>14</w:t>
+            </w:r>
+          </w:p>
+        </w:tc>
+        <w:tc>
+          <w:tcPr>
+            <w:tcW w:type="dxa" w:w="2880"/>
+          </w:tcPr>
+          <w:p>
+            <w:r>
+              <w:t>End-to-end test</w:t>
+            </w:r>
+          </w:p>
+        </w:tc>
+        <w:tc>
+          <w:tcPr>
+            <w:tcW w:type="dxa" w:w="2880"/>
+          </w:tcPr>
+          <w:p>
+            <w:r>
+              <w:t>Manual premarket run via GitHub Actions — confirmed full pipeline working</w:t>
             </w:r>
           </w:p>
         </w:tc>
@@ -9116,27 +9219,27 @@
           </w:tcPr>
           <w:p>
             <w:r>
-              <w:t>16</w:t>
-            </w:r>
-          </w:p>
-        </w:tc>
-        <w:tc>
-          <w:tcPr>
-            <w:tcW w:type="dxa" w:w="2880"/>
-          </w:tcPr>
-          <w:p>
-            <w:r>
-              <w:t>Deployed to Streamlit Cloud</w:t>
-            </w:r>
-          </w:p>
-        </w:tc>
-        <w:tc>
-          <w:tcPr>
-            <w:tcW w:type="dxa" w:w="2880"/>
-          </w:tcPr>
-          <w:p>
-            <w:r>
-              <w:t>Connected repo, set secrets in TOML format, got public URL</w:t>
+              <w:t>15</w:t>
+            </w:r>
+          </w:p>
+        </w:tc>
+        <w:tc>
+          <w:tcPr>
+            <w:tcW w:type="dxa" w:w="2880"/>
+          </w:tcPr>
+          <w:p>
+            <w:r>
+              <w:t>Built the Streamlit dashboard</w:t>
+            </w:r>
+          </w:p>
+        </w:tc>
+        <w:tc>
+          <w:tcPr>
+            <w:tcW w:type="dxa" w:w="2880"/>
+          </w:tcPr>
+          <w:p>
+            <w:r>
+              <w:t>4-tab app with Today, Positions, Performance, Scan Log</w:t>
             </w:r>
           </w:p>
         </w:tc>
@@ -9148,27 +9251,27 @@
           </w:tcPr>
           <w:p>
             <w:r>
-              <w:t>17</w:t>
-            </w:r>
-          </w:p>
-        </w:tc>
-        <w:tc>
-          <w:tcPr>
-            <w:tcW w:type="dxa" w:w="2880"/>
-          </w:tcPr>
-          <w:p>
-            <w:r>
-              <w:t>Added password protection</w:t>
-            </w:r>
-          </w:p>
-        </w:tc>
-        <w:tc>
-          <w:tcPr>
-            <w:tcW w:type="dxa" w:w="2880"/>
-          </w:tcPr>
-          <w:p>
-            <w:r>
-              <w:t>Login screen added — only authorized users can view data</w:t>
+              <w:t>16</w:t>
+            </w:r>
+          </w:p>
+        </w:tc>
+        <w:tc>
+          <w:tcPr>
+            <w:tcW w:type="dxa" w:w="2880"/>
+          </w:tcPr>
+          <w:p>
+            <w:r>
+              <w:t>Deployed to Streamlit Cloud</w:t>
+            </w:r>
+          </w:p>
+        </w:tc>
+        <w:tc>
+          <w:tcPr>
+            <w:tcW w:type="dxa" w:w="2880"/>
+          </w:tcPr>
+          <w:p>
+            <w:r>
+              <w:t>Connected repo, set secrets in TOML format, got public URL</w:t>
             </w:r>
           </w:p>
         </w:tc>
@@ -9180,27 +9283,27 @@
           </w:tcPr>
           <w:p>
             <w:r>
-              <w:t>18</w:t>
-            </w:r>
-          </w:p>
-        </w:tc>
-        <w:tc>
-          <w:tcPr>
-            <w:tcW w:type="dxa" w:w="2880"/>
-          </w:tcPr>
-          <w:p>
-            <w:r>
-              <w:t>Built backtest.py</w:t>
-            </w:r>
-          </w:p>
-        </w:tc>
-        <w:tc>
-          <w:tcPr>
-            <w:tcW w:type="dxa" w:w="2880"/>
-          </w:tcPr>
-          <w:p>
-            <w:r>
-              <w:t>30-day historical replay with real yfinance data, no Claude API</w:t>
+              <w:t>17</w:t>
+            </w:r>
+          </w:p>
+        </w:tc>
+        <w:tc>
+          <w:tcPr>
+            <w:tcW w:type="dxa" w:w="2880"/>
+          </w:tcPr>
+          <w:p>
+            <w:r>
+              <w:t>Added password protection</w:t>
+            </w:r>
+          </w:p>
+        </w:tc>
+        <w:tc>
+          <w:tcPr>
+            <w:tcW w:type="dxa" w:w="2880"/>
+          </w:tcPr>
+          <w:p>
+            <w:r>
+              <w:t>Login screen added — only authorized users can view data</w:t>
             </w:r>
           </w:p>
         </w:tc>
@@ -9212,27 +9315,27 @@
           </w:tcPr>
           <w:p>
             <w:r>
-              <w:t>19</w:t>
-            </w:r>
-          </w:p>
-        </w:tc>
-        <w:tc>
-          <w:tcPr>
-            <w:tcW w:type="dxa" w:w="2880"/>
-          </w:tcPr>
-          <w:p>
-            <w:r>
-              <w:t>Expanded universe to 430+ tickers</w:t>
-            </w:r>
-          </w:p>
-        </w:tc>
-        <w:tc>
-          <w:tcPr>
-            <w:tcW w:type="dxa" w:w="2880"/>
-          </w:tcPr>
-          <w:p>
-            <w:r>
-              <w:t>Removed drags based on backtest, added momentum names</w:t>
+              <w:t>18</w:t>
+            </w:r>
+          </w:p>
+        </w:tc>
+        <w:tc>
+          <w:tcPr>
+            <w:tcW w:type="dxa" w:w="2880"/>
+          </w:tcPr>
+          <w:p>
+            <w:r>
+              <w:t>Built backtest.py</w:t>
+            </w:r>
+          </w:p>
+        </w:tc>
+        <w:tc>
+          <w:tcPr>
+            <w:tcW w:type="dxa" w:w="2880"/>
+          </w:tcPr>
+          <w:p>
+            <w:r>
+              <w:t>30-day historical replay with real yfinance data, no Claude API</w:t>
             </w:r>
           </w:p>
         </w:tc>
@@ -9244,27 +9347,27 @@
           </w:tcPr>
           <w:p>
             <w:r>
-              <w:t>20</w:t>
-            </w:r>
-          </w:p>
-        </w:tc>
-        <w:tc>
-          <w:tcPr>
-            <w:tcW w:type="dxa" w:w="2880"/>
-          </w:tcPr>
-          <w:p>
-            <w:r>
-              <w:t>Tuned to 3% target, 15 positions, 3:1 R:R</w:t>
-            </w:r>
-          </w:p>
-        </w:tc>
-        <w:tc>
-          <w:tcPr>
-            <w:tcW w:type="dxa" w:w="2880"/>
-          </w:tcPr>
-          <w:p>
-            <w:r>
-              <w:t>Backtest showed $750/day avg at B grade (93% win days)</w:t>
+              <w:t>19</w:t>
+            </w:r>
+          </w:p>
+        </w:tc>
+        <w:tc>
+          <w:tcPr>
+            <w:tcW w:type="dxa" w:w="2880"/>
+          </w:tcPr>
+          <w:p>
+            <w:r>
+              <w:t>Expanded universe to 430+ tickers</w:t>
+            </w:r>
+          </w:p>
+        </w:tc>
+        <w:tc>
+          <w:tcPr>
+            <w:tcW w:type="dxa" w:w="2880"/>
+          </w:tcPr>
+          <w:p>
+            <w:r>
+              <w:t>Removed drags based on backtest, added momentum names</w:t>
             </w:r>
           </w:p>
         </w:tc>
@@ -9276,27 +9379,27 @@
           </w:tcPr>
           <w:p>
             <w:r>
-              <w:t>21</w:t>
-            </w:r>
-          </w:p>
-        </w:tc>
-        <w:tc>
-          <w:tcPr>
-            <w:tcW w:type="dxa" w:w="2880"/>
-          </w:tcPr>
-          <w:p>
-            <w:r>
-              <w:t>Built eval.py</w:t>
-            </w:r>
-          </w:p>
-        </w:tc>
-        <w:tc>
-          <w:tcPr>
-            <w:tcW w:type="dxa" w:w="2880"/>
-          </w:tcPr>
-          <w:p>
-            <w:r>
-              <w:t>Weekly grading script: A/B/C/D based on P&amp;L, win rate, reward:risk</w:t>
+              <w:t>20</w:t>
+            </w:r>
+          </w:p>
+        </w:tc>
+        <w:tc>
+          <w:tcPr>
+            <w:tcW w:type="dxa" w:w="2880"/>
+          </w:tcPr>
+          <w:p>
+            <w:r>
+              <w:t>Tuned to 3% target, 15 positions, 3:1 R:R</w:t>
+            </w:r>
+          </w:p>
+        </w:tc>
+        <w:tc>
+          <w:tcPr>
+            <w:tcW w:type="dxa" w:w="2880"/>
+          </w:tcPr>
+          <w:p>
+            <w:r>
+              <w:t>Backtest showed $750/day avg at B grade (93% win days)</w:t>
             </w:r>
           </w:p>
         </w:tc>
@@ -9308,27 +9411,27 @@
           </w:tcPr>
           <w:p>
             <w:r>
-              <w:t>22</w:t>
-            </w:r>
-          </w:p>
-        </w:tc>
-        <w:tc>
-          <w:tcPr>
-            <w:tcW w:type="dxa" w:w="2880"/>
-          </w:tcPr>
-          <w:p>
-            <w:r>
-              <w:t>Built V2a — Market Context Agent</w:t>
-            </w:r>
-          </w:p>
-        </w:tc>
-        <w:tc>
-          <w:tcPr>
-            <w:tcW w:type="dxa" w:w="2880"/>
-          </w:tcPr>
-          <w:p>
-            <w:r>
-              <w:t>VIX gate + futures signal + international markets</w:t>
+              <w:t>21</w:t>
+            </w:r>
+          </w:p>
+        </w:tc>
+        <w:tc>
+          <w:tcPr>
+            <w:tcW w:type="dxa" w:w="2880"/>
+          </w:tcPr>
+          <w:p>
+            <w:r>
+              <w:t>Built eval.py</w:t>
+            </w:r>
+          </w:p>
+        </w:tc>
+        <w:tc>
+          <w:tcPr>
+            <w:tcW w:type="dxa" w:w="2880"/>
+          </w:tcPr>
+          <w:p>
+            <w:r>
+              <w:t>Weekly grading script: A/B/C/D based on P&amp;L, win rate, reward:risk</w:t>
             </w:r>
           </w:p>
         </w:tc>
@@ -9340,27 +9443,27 @@
           </w:tcPr>
           <w:p>
             <w:r>
-              <w:t>23</w:t>
-            </w:r>
-          </w:p>
-        </w:tc>
-        <w:tc>
-          <w:tcPr>
-            <w:tcW w:type="dxa" w:w="2880"/>
-          </w:tcPr>
-          <w:p>
-            <w:r>
-              <w:t>Built V2b — News Intelligence Agent</w:t>
-            </w:r>
-          </w:p>
-        </w:tc>
-        <w:tc>
-          <w:tcPr>
-            <w:tcW w:type="dxa" w:w="2880"/>
-          </w:tcPr>
-          <w:p>
-            <w:r>
-              <w:t>Earnings blackout + news headlines context for Claude</w:t>
+              <w:t>22</w:t>
+            </w:r>
+          </w:p>
+        </w:tc>
+        <w:tc>
+          <w:tcPr>
+            <w:tcW w:type="dxa" w:w="2880"/>
+          </w:tcPr>
+          <w:p>
+            <w:r>
+              <w:t>Built V2a — Market Context Agent</w:t>
+            </w:r>
+          </w:p>
+        </w:tc>
+        <w:tc>
+          <w:tcPr>
+            <w:tcW w:type="dxa" w:w="2880"/>
+          </w:tcPr>
+          <w:p>
+            <w:r>
+              <w:t>VIX gate + futures signal + international markets</w:t>
             </w:r>
           </w:p>
         </w:tc>
@@ -9372,27 +9475,27 @@
           </w:tcPr>
           <w:p>
             <w:r>
-              <w:t>24</w:t>
-            </w:r>
-          </w:p>
-        </w:tc>
-        <w:tc>
-          <w:tcPr>
-            <w:tcW w:type="dxa" w:w="2880"/>
-          </w:tcPr>
-          <w:p>
-            <w:r>
-              <w:t>Redesigned dashboard to workflow view</w:t>
-            </w:r>
-          </w:p>
-        </w:tc>
-        <w:tc>
-          <w:tcPr>
-            <w:tcW w:type="dxa" w:w="2880"/>
-          </w:tcPr>
-          <w:p>
-            <w:r>
-              <w:t>Today tab shows all 4 steps: market → scan → plan → positions</w:t>
+              <w:t>23</w:t>
+            </w:r>
+          </w:p>
+        </w:tc>
+        <w:tc>
+          <w:tcPr>
+            <w:tcW w:type="dxa" w:w="2880"/>
+          </w:tcPr>
+          <w:p>
+            <w:r>
+              <w:t>Built V2b — News Intelligence Agent</w:t>
+            </w:r>
+          </w:p>
+        </w:tc>
+        <w:tc>
+          <w:tcPr>
+            <w:tcW w:type="dxa" w:w="2880"/>
+          </w:tcPr>
+          <w:p>
+            <w:r>
+              <w:t>Earnings blackout + news headlines context for Claude</w:t>
             </w:r>
           </w:p>
         </w:tc>
@@ -9404,27 +9507,27 @@
           </w:tcPr>
           <w:p>
             <w:r>
-              <w:t>25</w:t>
-            </w:r>
-          </w:p>
-        </w:tc>
-        <w:tc>
-          <w:tcPr>
-            <w:tcW w:type="dxa" w:w="2880"/>
-          </w:tcPr>
-          <w:p>
-            <w:r>
-              <w:t>Built V2c — Fear &amp; Greed + economic calendar</w:t>
-            </w:r>
-          </w:p>
-        </w:tc>
-        <w:tc>
-          <w:tcPr>
-            <w:tcW w:type="dxa" w:w="2880"/>
-          </w:tcPr>
-          <w:p>
-            <w:r>
-              <w:t>alternative.me F&amp;G Index + FOMC/CPI/NFP hardcoded dates</w:t>
+              <w:t>24</w:t>
+            </w:r>
+          </w:p>
+        </w:tc>
+        <w:tc>
+          <w:tcPr>
+            <w:tcW w:type="dxa" w:w="2880"/>
+          </w:tcPr>
+          <w:p>
+            <w:r>
+              <w:t>Redesigned dashboard to workflow view</w:t>
+            </w:r>
+          </w:p>
+        </w:tc>
+        <w:tc>
+          <w:tcPr>
+            <w:tcW w:type="dxa" w:w="2880"/>
+          </w:tcPr>
+          <w:p>
+            <w:r>
+              <w:t>Today tab shows all 4 steps: market → scan → plan → positions</w:t>
             </w:r>
           </w:p>
         </w:tc>
@@ -9436,27 +9539,27 @@
           </w:tcPr>
           <w:p>
             <w:r>
-              <w:t>26</w:t>
-            </w:r>
-          </w:p>
-        </w:tc>
-        <w:tc>
-          <w:tcPr>
-            <w:tcW w:type="dxa" w:w="2880"/>
-          </w:tcPr>
-          <w:p>
-            <w:r>
-              <w:t>Tuned V2c to confirming signal (v2.3)</w:t>
-            </w:r>
-          </w:p>
-        </w:tc>
-        <w:tc>
-          <w:tcPr>
-            <w:tcW w:type="dxa" w:w="2880"/>
-          </w:tcPr>
-          <w:p>
-            <w:r>
-              <w:t>F&amp;G standalone gate was too aggressive — now requires VIX or futures confirmation</w:t>
+              <w:t>25</w:t>
+            </w:r>
+          </w:p>
+        </w:tc>
+        <w:tc>
+          <w:tcPr>
+            <w:tcW w:type="dxa" w:w="2880"/>
+          </w:tcPr>
+          <w:p>
+            <w:r>
+              <w:t>Built V2c — Fear &amp; Greed + economic calendar</w:t>
+            </w:r>
+          </w:p>
+        </w:tc>
+        <w:tc>
+          <w:tcPr>
+            <w:tcW w:type="dxa" w:w="2880"/>
+          </w:tcPr>
+          <w:p>
+            <w:r>
+              <w:t>alternative.me F&amp;G Index + FOMC/CPI/NFP hardcoded dates</w:t>
             </w:r>
           </w:p>
         </w:tc>
@@ -9468,27 +9571,27 @@
           </w:tcPr>
           <w:p>
             <w:r>
-              <w:t>27</w:t>
-            </w:r>
-          </w:p>
-        </w:tc>
-        <w:tc>
-          <w:tcPr>
-            <w:tcW w:type="dxa" w:w="2880"/>
-          </w:tcPr>
-          <w:p>
-            <w:r>
-              <w:t>Built V3a — Universe Refresh Agent</w:t>
-            </w:r>
-          </w:p>
-        </w:tc>
-        <w:tc>
-          <w:tcPr>
-            <w:tcW w:type="dxa" w:w="2880"/>
-          </w:tcPr>
-          <w:p>
-            <w:r>
-              <w:t>Weekly S&amp;P500+Nasdaq100 screener; 458 tickers saved to Supabase on first run</w:t>
+              <w:t>26</w:t>
+            </w:r>
+          </w:p>
+        </w:tc>
+        <w:tc>
+          <w:tcPr>
+            <w:tcW w:type="dxa" w:w="2880"/>
+          </w:tcPr>
+          <w:p>
+            <w:r>
+              <w:t>Tuned V2c to confirming signal (v2.3)</w:t>
+            </w:r>
+          </w:p>
+        </w:tc>
+        <w:tc>
+          <w:tcPr>
+            <w:tcW w:type="dxa" w:w="2880"/>
+          </w:tcPr>
+          <w:p>
+            <w:r>
+              <w:t>F&amp;G standalone gate was too aggressive — now requires VIX or futures confirmation</w:t>
             </w:r>
           </w:p>
         </w:tc>
@@ -9500,27 +9603,27 @@
           </w:tcPr>
           <w:p>
             <w:r>
-              <w:t>28</w:t>
-            </w:r>
-          </w:p>
-        </w:tc>
-        <w:tc>
-          <w:tcPr>
-            <w:tcW w:type="dxa" w:w="2880"/>
-          </w:tcPr>
-          <w:p>
-            <w:r>
-              <w:t>Added company names to dashboard tables</w:t>
-            </w:r>
-          </w:p>
-        </w:tc>
-        <w:tc>
-          <w:tcPr>
-            <w:tcW w:type="dxa" w:w="2880"/>
-          </w:tcPr>
-          <w:p>
-            <w:r>
-              <w:t>config/company_names.py static dict, company column in all ticker tables</w:t>
+              <w:t>27</w:t>
+            </w:r>
+          </w:p>
+        </w:tc>
+        <w:tc>
+          <w:tcPr>
+            <w:tcW w:type="dxa" w:w="2880"/>
+          </w:tcPr>
+          <w:p>
+            <w:r>
+              <w:t>Built V3a — Universe Refresh Agent</w:t>
+            </w:r>
+          </w:p>
+        </w:tc>
+        <w:tc>
+          <w:tcPr>
+            <w:tcW w:type="dxa" w:w="2880"/>
+          </w:tcPr>
+          <w:p>
+            <w:r>
+              <w:t>Weekly S&amp;P500+Nasdaq100 screener; 458 tickers saved to Supabase on first run</w:t>
             </w:r>
           </w:p>
         </w:tc>
@@ -9532,27 +9635,27 @@
           </w:tcPr>
           <w:p>
             <w:r>
-              <w:t>29</w:t>
-            </w:r>
-          </w:p>
-        </w:tc>
-        <w:tc>
-          <w:tcPr>
-            <w:tcW w:type="dxa" w:w="2880"/>
-          </w:tcPr>
-          <w:p>
-            <w:r>
-              <w:t>Generated documentation and PRD</w:t>
-            </w:r>
-          </w:p>
-        </w:tc>
-        <w:tc>
-          <w:tcPr>
-            <w:tcW w:type="dxa" w:w="2880"/>
-          </w:tcPr>
-          <w:p>
-            <w:r>
-              <w:t>Word documents updated to v3.0</w:t>
+              <w:t>28</w:t>
+            </w:r>
+          </w:p>
+        </w:tc>
+        <w:tc>
+          <w:tcPr>
+            <w:tcW w:type="dxa" w:w="2880"/>
+          </w:tcPr>
+          <w:p>
+            <w:r>
+              <w:t>Added company names to dashboard tables</w:t>
+            </w:r>
+          </w:p>
+        </w:tc>
+        <w:tc>
+          <w:tcPr>
+            <w:tcW w:type="dxa" w:w="2880"/>
+          </w:tcPr>
+          <w:p>
+            <w:r>
+              <w:t>config/company_names.py static dict, company column in all ticker tables</w:t>
             </w:r>
           </w:p>
         </w:tc>
@@ -9564,27 +9667,27 @@
           </w:tcPr>
           <w:p>
             <w:r>
-              <w:t>30</w:t>
-            </w:r>
-          </w:p>
-        </w:tc>
-        <w:tc>
-          <w:tcPr>
-            <w:tcW w:type="dxa" w:w="2880"/>
-          </w:tcPr>
-          <w:p>
-            <w:r>
-              <w:t>Built V2g — Alpaca broker</w:t>
-            </w:r>
-          </w:p>
-        </w:tc>
-        <w:tc>
-          <w:tcPr>
-            <w:tcW w:type="dxa" w:w="2880"/>
-          </w:tcPr>
-          <w:p>
-            <w:r>
-              <w:t>agents/alpaca_broker.py: bracket orders, position sync, fill price on close</w:t>
+              <w:t>29</w:t>
+            </w:r>
+          </w:p>
+        </w:tc>
+        <w:tc>
+          <w:tcPr>
+            <w:tcW w:type="dxa" w:w="2880"/>
+          </w:tcPr>
+          <w:p>
+            <w:r>
+              <w:t>Generated documentation and PRD</w:t>
+            </w:r>
+          </w:p>
+        </w:tc>
+        <w:tc>
+          <w:tcPr>
+            <w:tcW w:type="dxa" w:w="2880"/>
+          </w:tcPr>
+          <w:p>
+            <w:r>
+              <w:t>Word documents updated to v3.0</w:t>
             </w:r>
           </w:p>
         </w:tc>
@@ -9596,27 +9699,27 @@
           </w:tcPr>
           <w:p>
             <w:r>
-              <w:t>31</w:t>
-            </w:r>
-          </w:p>
-        </w:tc>
-        <w:tc>
-          <w:tcPr>
-            <w:tcW w:type="dxa" w:w="2880"/>
-          </w:tcPr>
-          <w:p>
-            <w:r>
-              <w:t>Updated portfolio.py with broker abstraction</w:t>
-            </w:r>
-          </w:p>
-        </w:tc>
-        <w:tc>
-          <w:tcPr>
-            <w:tcW w:type="dxa" w:w="2880"/>
-          </w:tcPr>
-          <w:p>
-            <w:r>
-              <w:t>simulation default, alpaca mode with order submission and sync</w:t>
+              <w:t>30</w:t>
+            </w:r>
+          </w:p>
+        </w:tc>
+        <w:tc>
+          <w:tcPr>
+            <w:tcW w:type="dxa" w:w="2880"/>
+          </w:tcPr>
+          <w:p>
+            <w:r>
+              <w:t>Built V2g — Alpaca broker</w:t>
+            </w:r>
+          </w:p>
+        </w:tc>
+        <w:tc>
+          <w:tcPr>
+            <w:tcW w:type="dxa" w:w="2880"/>
+          </w:tcPr>
+          <w:p>
+            <w:r>
+              <w:t>agents/alpaca_broker.py: bracket orders, position sync, fill price on close</w:t>
             </w:r>
           </w:p>
         </w:tc>
@@ -9628,27 +9731,27 @@
           </w:tcPr>
           <w:p>
             <w:r>
-              <w:t>32</w:t>
-            </w:r>
-          </w:p>
-        </w:tc>
-        <w:tc>
-          <w:tcPr>
-            <w:tcW w:type="dxa" w:w="2880"/>
-          </w:tcPr>
-          <w:p>
-            <w:r>
-              <w:t>Updated trading.yml with Alpaca secrets and --broker flag</w:t>
-            </w:r>
-          </w:p>
-        </w:tc>
-        <w:tc>
-          <w:tcPr>
-            <w:tcW w:type="dxa" w:w="2880"/>
-          </w:tcPr>
-          <w:p>
-            <w:r>
-              <w:t>default broker=alpaca for scheduled runs; manual dispatch has broker input option</w:t>
+              <w:t>31</w:t>
+            </w:r>
+          </w:p>
+        </w:tc>
+        <w:tc>
+          <w:tcPr>
+            <w:tcW w:type="dxa" w:w="2880"/>
+          </w:tcPr>
+          <w:p>
+            <w:r>
+              <w:t>Updated portfolio.py with broker abstraction</w:t>
+            </w:r>
+          </w:p>
+        </w:tc>
+        <w:tc>
+          <w:tcPr>
+            <w:tcW w:type="dxa" w:w="2880"/>
+          </w:tcPr>
+          <w:p>
+            <w:r>
+              <w:t>simulation default, alpaca mode with order submission and sync</w:t>
             </w:r>
           </w:p>
         </w:tc>
@@ -9660,27 +9763,27 @@
           </w:tcPr>
           <w:p>
             <w:r>
-              <w:t>33</w:t>
-            </w:r>
-          </w:p>
-        </w:tc>
-        <w:tc>
-          <w:tcPr>
-            <w:tcW w:type="dxa" w:w="2880"/>
-          </w:tcPr>
-          <w:p>
-            <w:r>
-              <w:t>Fixed risk agent floating point false rejects</w:t>
-            </w:r>
-          </w:p>
-        </w:tc>
-        <w:tc>
-          <w:tcPr>
-            <w:tcW w:type="dxa" w:w="2880"/>
-          </w:tcPr>
-          <w:p>
-            <w:r>
-              <w:t>stop loss and reward:risk comparison precision; 2dp display in rejection messages</w:t>
+              <w:t>32</w:t>
+            </w:r>
+          </w:p>
+        </w:tc>
+        <w:tc>
+          <w:tcPr>
+            <w:tcW w:type="dxa" w:w="2880"/>
+          </w:tcPr>
+          <w:p>
+            <w:r>
+              <w:t>Updated trading.yml with Alpaca secrets and --broker flag</w:t>
+            </w:r>
+          </w:p>
+        </w:tc>
+        <w:tc>
+          <w:tcPr>
+            <w:tcW w:type="dxa" w:w="2880"/>
+          </w:tcPr>
+          <w:p>
+            <w:r>
+              <w:t>default broker=alpaca for scheduled runs; manual dispatch has broker input option</w:t>
             </w:r>
           </w:p>
         </w:tc>
@@ -9692,27 +9795,27 @@
           </w:tcPr>
           <w:p>
             <w:r>
-              <w:t>34</w:t>
-            </w:r>
-          </w:p>
-        </w:tc>
-        <w:tc>
-          <w:tcPr>
-            <w:tcW w:type="dxa" w:w="2880"/>
-          </w:tcPr>
-          <w:p>
-            <w:r>
-              <w:t>Generated v4.0 documentation and architecture diagrams</w:t>
-            </w:r>
-          </w:p>
-        </w:tc>
-        <w:tc>
-          <w:tcPr>
-            <w:tcW w:type="dxa" w:w="2880"/>
-          </w:tcPr>
-          <w:p>
-            <w:r>
-              <w:t>Word docs updated to v4.0; two PNG architecture diagrams embedded</w:t>
+              <w:t>33</w:t>
+            </w:r>
+          </w:p>
+        </w:tc>
+        <w:tc>
+          <w:tcPr>
+            <w:tcW w:type="dxa" w:w="2880"/>
+          </w:tcPr>
+          <w:p>
+            <w:r>
+              <w:t>Fixed risk agent floating point false rejects</w:t>
+            </w:r>
+          </w:p>
+        </w:tc>
+        <w:tc>
+          <w:tcPr>
+            <w:tcW w:type="dxa" w:w="2880"/>
+          </w:tcPr>
+          <w:p>
+            <w:r>
+              <w:t>stop loss and reward:risk comparison precision; 2dp display in rejection messages</w:t>
             </w:r>
           </w:p>
         </w:tc>
@@ -9724,27 +9827,27 @@
           </w:tcPr>
           <w:p>
             <w:r>
-              <w:t>35</w:t>
-            </w:r>
-          </w:p>
-        </w:tc>
-        <w:tc>
-          <w:tcPr>
-            <w:tcW w:type="dxa" w:w="2880"/>
-          </w:tcPr>
-          <w:p>
-            <w:r>
-              <w:t>Built V2d — Sector correlation guard</w:t>
-            </w:r>
-          </w:p>
-        </w:tc>
-        <w:tc>
-          <w:tcPr>
-            <w:tcW w:type="dxa" w:w="2880"/>
-          </w:tcPr>
-          <w:p>
-            <w:r>
-              <w:t>agents/sector_guard.py: fetches sector via yfinance, caps at 3 per sector, Unknown passes through; MAX_PER_SECTOR=3 in settings.py; step 3.5 in orchestrator; dashboard shows sector-blocked trades</w:t>
+              <w:t>34</w:t>
+            </w:r>
+          </w:p>
+        </w:tc>
+        <w:tc>
+          <w:tcPr>
+            <w:tcW w:type="dxa" w:w="2880"/>
+          </w:tcPr>
+          <w:p>
+            <w:r>
+              <w:t>Generated v4.0 documentation and architecture diagrams</w:t>
+            </w:r>
+          </w:p>
+        </w:tc>
+        <w:tc>
+          <w:tcPr>
+            <w:tcW w:type="dxa" w:w="2880"/>
+          </w:tcPr>
+          <w:p>
+            <w:r>
+              <w:t>Word docs updated to v4.0; two PNG architecture diagrams embedded</w:t>
             </w:r>
           </w:p>
         </w:tc>
@@ -9756,27 +9859,27 @@
           </w:tcPr>
           <w:p>
             <w:r>
-              <w:t>36</w:t>
-            </w:r>
-          </w:p>
-        </w:tc>
-        <w:tc>
-          <w:tcPr>
-            <w:tcW w:type="dxa" w:w="2880"/>
-          </w:tcPr>
-          <w:p>
-            <w:r>
-              <w:t>Fixed strategy.py JSON extraction</w:t>
-            </w:r>
-          </w:p>
-        </w:tc>
-        <w:tc>
-          <w:tcPr>
-            <w:tcW w:type="dxa" w:w="2880"/>
-          </w:tcPr>
-          <w:p>
-            <w:r>
-              <w:t>Regex on outermost { } or [ ] — handles markdown fence edge cases that produced empty string on json.loads</w:t>
+              <w:t>35</w:t>
+            </w:r>
+          </w:p>
+        </w:tc>
+        <w:tc>
+          <w:tcPr>
+            <w:tcW w:type="dxa" w:w="2880"/>
+          </w:tcPr>
+          <w:p>
+            <w:r>
+              <w:t>Built V2d — Sector correlation guard</w:t>
+            </w:r>
+          </w:p>
+        </w:tc>
+        <w:tc>
+          <w:tcPr>
+            <w:tcW w:type="dxa" w:w="2880"/>
+          </w:tcPr>
+          <w:p>
+            <w:r>
+              <w:t>agents/sector_guard.py: fetches sector via yfinance, caps at 3 per sector, Unknown passes through; MAX_PER_SECTOR=3 in settings.py; step 3.5 in orchestrator; dashboard shows sector-blocked trades</w:t>
             </w:r>
           </w:p>
         </w:tc>
@@ -9788,27 +9891,27 @@
           </w:tcPr>
           <w:p>
             <w:r>
-              <w:t>37</w:t>
-            </w:r>
-          </w:p>
-        </w:tc>
-        <w:tc>
-          <w:tcPr>
-            <w:tcW w:type="dxa" w:w="2880"/>
-          </w:tcPr>
-          <w:p>
-            <w:r>
-              <w:t>Built V5 guardrails</w:t>
-            </w:r>
-          </w:p>
-        </w:tc>
-        <w:tc>
-          <w:tcPr>
-            <w:tcW w:type="dxa" w:w="2880"/>
-          </w:tcPr>
-          <w:p>
-            <w:r>
-              <w:t>agents/guardrails.py: 6 safety checks — action whitelist, ticker whitelist, duplicate guard, price sanity (±5%), capital check, daily loss limit (-$300)</w:t>
+              <w:t>36</w:t>
+            </w:r>
+          </w:p>
+        </w:tc>
+        <w:tc>
+          <w:tcPr>
+            <w:tcW w:type="dxa" w:w="2880"/>
+          </w:tcPr>
+          <w:p>
+            <w:r>
+              <w:t>Fixed strategy.py JSON extraction</w:t>
+            </w:r>
+          </w:p>
+        </w:tc>
+        <w:tc>
+          <w:tcPr>
+            <w:tcW w:type="dxa" w:w="2880"/>
+          </w:tcPr>
+          <w:p>
+            <w:r>
+              <w:t>Regex on outermost { } or [ ] — handles markdown fence edge cases that produced empty string on json.loads</w:t>
             </w:r>
           </w:p>
         </w:tc>
@@ -9820,27 +9923,27 @@
           </w:tcPr>
           <w:p>
             <w:r>
-              <w:t>38</w:t>
-            </w:r>
-          </w:p>
-        </w:tc>
-        <w:tc>
-          <w:tcPr>
-            <w:tcW w:type="dxa" w:w="2880"/>
-          </w:tcPr>
-          <w:p>
-            <w:r>
-              <w:t>Added concurrent run lock</w:t>
-            </w:r>
-          </w:p>
-        </w:tc>
-        <w:tc>
-          <w:tcPr>
-            <w:tcW w:type="dxa" w:w="2880"/>
-          </w:tcPr>
-          <w:p>
-            <w:r>
-              <w:t>orchestrator.py checks for existing premarket scan_results at startup — exits immediately if already ran today, preventing duplicate positions from overlapping GitHub Actions runs</w:t>
+              <w:t>37</w:t>
+            </w:r>
+          </w:p>
+        </w:tc>
+        <w:tc>
+          <w:tcPr>
+            <w:tcW w:type="dxa" w:w="2880"/>
+          </w:tcPr>
+          <w:p>
+            <w:r>
+              <w:t>Built V5 guardrails</w:t>
+            </w:r>
+          </w:p>
+        </w:tc>
+        <w:tc>
+          <w:tcPr>
+            <w:tcW w:type="dxa" w:w="2880"/>
+          </w:tcPr>
+          <w:p>
+            <w:r>
+              <w:t>agents/guardrails.py: 6 safety checks — action whitelist, ticker whitelist, duplicate guard, price sanity (±5%), capital check, daily loss limit (-$300)</w:t>
             </w:r>
           </w:p>
         </w:tc>
@@ -9852,27 +9955,27 @@
           </w:tcPr>
           <w:p>
             <w:r>
-              <w:t>39</w:t>
-            </w:r>
-          </w:p>
-        </w:tc>
-        <w:tc>
-          <w:tcPr>
-            <w:tcW w:type="dxa" w:w="2880"/>
-          </w:tcPr>
-          <w:p>
-            <w:r>
-              <w:t>EOD close retry for Alpaca</w:t>
-            </w:r>
-          </w:p>
-        </w:tc>
-        <w:tc>
-          <w:tcPr>
-            <w:tcW w:type="dxa" w:w="2880"/>
-          </w:tcPr>
-          <w:p>
-            <w:r>
-              <w:t>portfolio.py close_all_positions(): retries Alpaca close once after 2s on failure; warns loudly if still failing</w:t>
+              <w:t>38</w:t>
+            </w:r>
+          </w:p>
+        </w:tc>
+        <w:tc>
+          <w:tcPr>
+            <w:tcW w:type="dxa" w:w="2880"/>
+          </w:tcPr>
+          <w:p>
+            <w:r>
+              <w:t>Added concurrent run lock</w:t>
+            </w:r>
+          </w:p>
+        </w:tc>
+        <w:tc>
+          <w:tcPr>
+            <w:tcW w:type="dxa" w:w="2880"/>
+          </w:tcPr>
+          <w:p>
+            <w:r>
+              <w:t>orchestrator.py checks for existing premarket scan_results at startup — exits immediately if already ran today, preventing duplicate positions from overlapping GitHub Actions runs</w:t>
             </w:r>
           </w:p>
         </w:tc>
@@ -9884,27 +9987,27 @@
           </w:tcPr>
           <w:p>
             <w:r>
-              <w:t>40</w:t>
-            </w:r>
-          </w:p>
-        </w:tc>
-        <w:tc>
-          <w:tcPr>
-            <w:tcW w:type="dxa" w:w="2880"/>
-          </w:tcPr>
-          <w:p>
-            <w:r>
-              <w:t>Fixed sector_blocked/guardrail_blocked persistence</w:t>
-            </w:r>
-          </w:p>
-        </w:tc>
-        <w:tc>
-          <w:tcPr>
-            <w:tcW w:type="dxa" w:w="2880"/>
-          </w:tcPr>
-          <w:p>
-            <w:r>
-              <w:t>scan_results JSONB updated with actual values after both sector guard and guardrails (previously always stored as [])</w:t>
+              <w:t>39</w:t>
+            </w:r>
+          </w:p>
+        </w:tc>
+        <w:tc>
+          <w:tcPr>
+            <w:tcW w:type="dxa" w:w="2880"/>
+          </w:tcPr>
+          <w:p>
+            <w:r>
+              <w:t>EOD close retry for Alpaca</w:t>
+            </w:r>
+          </w:p>
+        </w:tc>
+        <w:tc>
+          <w:tcPr>
+            <w:tcW w:type="dxa" w:w="2880"/>
+          </w:tcPr>
+          <w:p>
+            <w:r>
+              <w:t>portfolio.py close_all_positions(): retries Alpaca close once after 2s on failure; warns loudly if still failing</w:t>
             </w:r>
           </w:p>
         </w:tc>
@@ -9916,27 +10019,27 @@
           </w:tcPr>
           <w:p>
             <w:r>
-              <w:t>41</w:t>
-            </w:r>
-          </w:p>
-        </w:tc>
-        <w:tc>
-          <w:tcPr>
-            <w:tcW w:type="dxa" w:w="2880"/>
-          </w:tcPr>
-          <w:p>
-            <w:r>
-              <w:t>Updated docs to v5.0</w:t>
-            </w:r>
-          </w:p>
-        </w:tc>
-        <w:tc>
-          <w:tcPr>
-            <w:tcW w:type="dxa" w:w="2880"/>
-          </w:tcPr>
-          <w:p>
-            <w:r>
-              <w:t>Trading_Agent_Documentation.docx and Trading_Agent_PRD.docx regenerated with V5 guardrails</w:t>
+              <w:t>40</w:t>
+            </w:r>
+          </w:p>
+        </w:tc>
+        <w:tc>
+          <w:tcPr>
+            <w:tcW w:type="dxa" w:w="2880"/>
+          </w:tcPr>
+          <w:p>
+            <w:r>
+              <w:t>Fixed sector_blocked/guardrail_blocked persistence</w:t>
+            </w:r>
+          </w:p>
+        </w:tc>
+        <w:tc>
+          <w:tcPr>
+            <w:tcW w:type="dxa" w:w="2880"/>
+          </w:tcPr>
+          <w:p>
+            <w:r>
+              <w:t>scan_results JSONB updated with actual values after both sector guard and guardrails (previously always stored as [])</w:t>
             </w:r>
           </w:p>
         </w:tc>
@@ -9948,27 +10051,27 @@
           </w:tcPr>
           <w:p>
             <w:r>
-              <w:t>42</w:t>
-            </w:r>
-          </w:p>
-        </w:tc>
-        <w:tc>
-          <w:tcPr>
-            <w:tcW w:type="dxa" w:w="2880"/>
-          </w:tcPr>
-          <w:p>
-            <w:r>
-              <w:t>Redesigned Summary tab</w:t>
-            </w:r>
-          </w:p>
-        </w:tc>
-        <w:tc>
-          <w:tcPr>
-            <w:tcW w:type="dxa" w:w="2880"/>
-          </w:tcPr>
-          <w:p>
-            <w:r>
-              <w:t>Replaced Trades by Sector with three sections: In Flight (live position cards), Today's Plan (deduped trade table with status labels), Trade Heatmap (Plotly Treemap — green/red by P&amp;L, sized by position size)</w:t>
+              <w:t>41</w:t>
+            </w:r>
+          </w:p>
+        </w:tc>
+        <w:tc>
+          <w:tcPr>
+            <w:tcW w:type="dxa" w:w="2880"/>
+          </w:tcPr>
+          <w:p>
+            <w:r>
+              <w:t>Updated docs to v5.0</w:t>
+            </w:r>
+          </w:p>
+        </w:tc>
+        <w:tc>
+          <w:tcPr>
+            <w:tcW w:type="dxa" w:w="2880"/>
+          </w:tcPr>
+          <w:p>
+            <w:r>
+              <w:t>Trading_Agent_Documentation.docx and Trading_Agent_PRD.docx regenerated with V5 guardrails</w:t>
             </w:r>
           </w:p>
         </w:tc>
@@ -9980,27 +10083,27 @@
           </w:tcPr>
           <w:p>
             <w:r>
-              <w:t>43</w:t>
-            </w:r>
-          </w:p>
-        </w:tc>
-        <w:tc>
-          <w:tcPr>
-            <w:tcW w:type="dxa" w:w="2880"/>
-          </w:tcPr>
-          <w:p>
-            <w:r>
-              <w:t>Added automated EOD eval</w:t>
-            </w:r>
-          </w:p>
-        </w:tc>
-        <w:tc>
-          <w:tcPr>
-            <w:tcW w:type="dxa" w:w="2880"/>
-          </w:tcPr>
-          <w:p>
-            <w:r>
-              <w:t>eval.py --write flag saves score/grade/recommendations to Supabase (scan_results, scan_type=eval); EOD GitHub Actions job runs eval.py --days 30 --write automatically after every EOD close</w:t>
+              <w:t>42</w:t>
+            </w:r>
+          </w:p>
+        </w:tc>
+        <w:tc>
+          <w:tcPr>
+            <w:tcW w:type="dxa" w:w="2880"/>
+          </w:tcPr>
+          <w:p>
+            <w:r>
+              <w:t>Redesigned Summary tab</w:t>
+            </w:r>
+          </w:p>
+        </w:tc>
+        <w:tc>
+          <w:tcPr>
+            <w:tcW w:type="dxa" w:w="2880"/>
+          </w:tcPr>
+          <w:p>
+            <w:r>
+              <w:t>Replaced Trades by Sector with three sections: In Flight (live position cards), Today's Plan (deduped trade table with status labels), Trade Heatmap (Plotly Treemap — green/red by P&amp;L, sized by position size)</w:t>
             </w:r>
           </w:p>
         </w:tc>
@@ -10012,27 +10115,27 @@
           </w:tcPr>
           <w:p>
             <w:r>
-              <w:t>44</w:t>
-            </w:r>
-          </w:p>
-        </w:tc>
-        <w:tc>
-          <w:tcPr>
-            <w:tcW w:type="dxa" w:w="2880"/>
-          </w:tcPr>
-          <w:p>
-            <w:r>
-              <w:t>Added Agent Scorecard to Performance tab</w:t>
-            </w:r>
-          </w:p>
-        </w:tc>
-        <w:tc>
-          <w:tcPr>
-            <w:tcW w:type="dxa" w:w="2880"/>
-          </w:tcPr>
-          <w:p>
-            <w:r>
-              <w:t>Reads latest eval from Supabase and displays Score, Grade, Avg Daily P&amp;L, Win Days, Trade Win Rate, Actual R:R, close reason breakdown, best/worst trade, and recommendations — updated every trading day without manual action</w:t>
+              <w:t>43</w:t>
+            </w:r>
+          </w:p>
+        </w:tc>
+        <w:tc>
+          <w:tcPr>
+            <w:tcW w:type="dxa" w:w="2880"/>
+          </w:tcPr>
+          <w:p>
+            <w:r>
+              <w:t>Added automated EOD eval</w:t>
+            </w:r>
+          </w:p>
+        </w:tc>
+        <w:tc>
+          <w:tcPr>
+            <w:tcW w:type="dxa" w:w="2880"/>
+          </w:tcPr>
+          <w:p>
+            <w:r>
+              <w:t>eval.py --write flag saves score/grade/recommendations to Supabase (scan_results, scan_type=eval); EOD GitHub Actions job runs eval.py --days 30 --write automatically after every EOD close</w:t>
             </w:r>
           </w:p>
         </w:tc>
@@ -10044,27 +10147,27 @@
           </w:tcPr>
           <w:p>
             <w:r>
-              <w:t>45</w:t>
-            </w:r>
-          </w:p>
-        </w:tc>
-        <w:tc>
-          <w:tcPr>
-            <w:tcW w:type="dxa" w:w="2880"/>
-          </w:tcPr>
-          <w:p>
-            <w:r>
-              <w:t>Added Alpaca position reconciliation</w:t>
-            </w:r>
-          </w:p>
-        </w:tc>
-        <w:tc>
-          <w:tcPr>
-            <w:tcW w:type="dxa" w:w="2880"/>
-          </w:tcPr>
-          <w:p>
-            <w:r>
-              <w:t>intraday.py _reconcile_with_alpaca() runs first on every 30-min cycle; any Supabase OPEN position not in Alpaca is marked UNFILLED (P&amp;L=0) — catches the rare case where a bracket order was submitted but the entry leg never filled; dashboard and eval exclude UNFILLED alongside CLEANUP</w:t>
+              <w:t>44</w:t>
+            </w:r>
+          </w:p>
+        </w:tc>
+        <w:tc>
+          <w:tcPr>
+            <w:tcW w:type="dxa" w:w="2880"/>
+          </w:tcPr>
+          <w:p>
+            <w:r>
+              <w:t>Added Agent Scorecard to Performance tab</w:t>
+            </w:r>
+          </w:p>
+        </w:tc>
+        <w:tc>
+          <w:tcPr>
+            <w:tcW w:type="dxa" w:w="2880"/>
+          </w:tcPr>
+          <w:p>
+            <w:r>
+              <w:t>Reads latest eval from Supabase and displays Score, Grade, Avg Daily P&amp;L, Win Days, Trade Win Rate, Actual R:R, close reason breakdown, best/worst trade, and recommendations — updated every trading day without manual action</w:t>
             </w:r>
           </w:p>
         </w:tc>
@@ -10076,6 +10179,38 @@
           </w:tcPr>
           <w:p>
             <w:r>
+              <w:t>45</w:t>
+            </w:r>
+          </w:p>
+        </w:tc>
+        <w:tc>
+          <w:tcPr>
+            <w:tcW w:type="dxa" w:w="2880"/>
+          </w:tcPr>
+          <w:p>
+            <w:r>
+              <w:t>Added Alpaca position reconciliation</w:t>
+            </w:r>
+          </w:p>
+        </w:tc>
+        <w:tc>
+          <w:tcPr>
+            <w:tcW w:type="dxa" w:w="2880"/>
+          </w:tcPr>
+          <w:p>
+            <w:r>
+              <w:t>intraday.py _reconcile_with_alpaca() runs first on every 30-min cycle; any Supabase OPEN position not in Alpaca is marked UNFILLED (P&amp;L=0) — catches the rare case where a bracket order was submitted but the entry leg never filled; dashboard and eval exclude UNFILLED alongside CLEANUP</w:t>
+            </w:r>
+          </w:p>
+        </w:tc>
+      </w:tr>
+      <w:tr>
+        <w:tc>
+          <w:tcPr>
+            <w:tcW w:type="dxa" w:w="2880"/>
+          </w:tcPr>
+          <w:p>
+            <w:r>
               <w:t>46</w:t>
             </w:r>
           </w:p>
@@ -10097,6 +10232,38 @@
           <w:p>
             <w:r>
               <w:t>Trading_Agent_Documentation.docx and Trading_Agent_PRD.docx regenerated with Summary redesign, eval automation, Agent Scorecard, and Alpaca reconciliation</w:t>
+            </w:r>
+          </w:p>
+        </w:tc>
+      </w:tr>
+      <w:tr>
+        <w:tc>
+          <w:tcPr>
+            <w:tcW w:type="dxa" w:w="2880"/>
+          </w:tcPr>
+          <w:p>
+            <w:r>
+              <w:t>47</w:t>
+            </w:r>
+          </w:p>
+        </w:tc>
+        <w:tc>
+          <w:tcPr>
+            <w:tcW w:type="dxa" w:w="2880"/>
+          </w:tcPr>
+          <w:p>
+            <w:r>
+              <w:t>Added no-margin cumulative capital check and daily profit lock-in</w:t>
+            </w:r>
+          </w:p>
+        </w:tc>
+        <w:tc>
+          <w:tcPr>
+            <w:tcW w:type="dxa" w:w="2880"/>
+          </w:tcPr>
+          <w:p>
+            <w:r>
+              <w:t>guardrails.py: committed_capital tracked across full approved batch for both Alpaca and simulation — rejects any trade that would push total deployed capital past buying_power (no margin); intraday.py: LOCK_IN trigger closes all open positions when realized P&amp;L ≥ $716; dashboard shows LOCK_IN as "🎯 Day Locked"; settings.py: DAILY_LOCK_IN_TARGET = 716; docs updated to v5.2</w:t>
             </w:r>
           </w:p>
         </w:tc>

</xml_diff>

<commit_message>
docs: v5.3 — trailing stops, confidence sizing, retry logic, dashboard annotations
Co-Authored-By: Claude Sonnet 4.6 <noreply@anthropic.com>
</commit_message>
<xml_diff>
--- a/Trading_Agent_Documentation.docx
+++ b/Trading_Agent_Documentation.docx
@@ -35,7 +35,7 @@
           <w:color w:val="888888"/>
           <w:sz w:val="20"/>
         </w:rPr>
-        <w:t>Amit Garg  ·  May 2026  ·  v5.2  ·  Built with Claude Code + Anthropic API</w:t>
+        <w:t>Amit Garg  ·  May 2026  ·  v5.3  ·  Built with Claude Code + Anthropic API</w:t>
       </w:r>
     </w:p>
     <w:p>
@@ -2368,7 +2368,7 @@
         <w:ind w:left="360"/>
       </w:pPr>
       <w:r>
-        <w:t>Position sizing: $5K–$7K per trade (5–7% of $100K capital)</w:t>
+        <w:t>Position sizing: confidence-weighted — HIGH=$7,000, MEDIUM=$6,000, LOW=$5,000; risk agent _apply_confidence_sizing() overrides whatever Claude sets before running validation — ensures correct sizing even if Claude hallucinates a different value</w:t>
       </w:r>
     </w:p>
     <w:p>
@@ -2645,7 +2645,16 @@
         <w:ind w:left="360"/>
       </w:pPr>
       <w:r>
-        <w:t>Closes positions that hit +3% target (take profit) or -1% stop loss (cut loss)</w:t>
+        <w:t>Trailing stop: effective_stop = max(original_stop_loss, high_watermark × 0.99); high_watermark updated every 30-min cycle to track the highest price seen since entry; fires if price pulls back 1% from its peak while still in profit — locks in gains on strong movers before reversal; Alpaca mode calls close_position() directly (bracket auto-cancels)</w:t>
+      </w:r>
+    </w:p>
+    <w:p>
+      <w:pPr>
+        <w:pStyle w:val="ListBullet"/>
+        <w:ind w:left="360"/>
+      </w:pPr>
+      <w:r>
+        <w:t>Closes positions that hit +3% target (take profit) or effective stop (cut loss or protect gain); close_reason=TARGET or STOP</w:t>
       </w:r>
     </w:p>
     <w:p>
@@ -5208,31 +5217,19 @@
           <w:tcPr>
             <w:tcW w:type="dxa" w:w="2880"/>
           </w:tcPr>
-          <w:p>
-            <w:r>
-              <w:t>TOTAL_CAPITAL</w:t>
-            </w:r>
-          </w:p>
-        </w:tc>
-        <w:tc>
-          <w:tcPr>
-            <w:tcW w:type="dxa" w:w="2880"/>
-          </w:tcPr>
-          <w:p>
-            <w:r>
-              <w:t>$100,000</w:t>
-            </w:r>
-          </w:p>
-        </w:tc>
-        <w:tc>
-          <w:tcPr>
-            <w:tcW w:type="dxa" w:w="2880"/>
-          </w:tcPr>
-          <w:p>
-            <w:r>
-              <w:t>Starting portfolio size</w:t>
-            </w:r>
-          </w:p>
+          <w:p/>
+        </w:tc>
+        <w:tc>
+          <w:tcPr>
+            <w:tcW w:type="dxa" w:w="2880"/>
+          </w:tcPr>
+          <w:p/>
+        </w:tc>
+        <w:tc>
+          <w:tcPr>
+            <w:tcW w:type="dxa" w:w="2880"/>
+          </w:tcPr>
+          <w:p/>
         </w:tc>
       </w:tr>
       <w:tr>
@@ -5240,31 +5237,19 @@
           <w:tcPr>
             <w:tcW w:type="dxa" w:w="2880"/>
           </w:tcPr>
-          <w:p>
-            <w:r>
-              <w:t>DAILY_PROFIT_TARGET</w:t>
-            </w:r>
-          </w:p>
-        </w:tc>
-        <w:tc>
-          <w:tcPr>
-            <w:tcW w:type="dxa" w:w="2880"/>
-          </w:tcPr>
-          <w:p>
-            <w:r>
-              <w:t>$1,000</w:t>
-            </w:r>
-          </w:p>
-        </w:tc>
-        <w:tc>
-          <w:tcPr>
-            <w:tcW w:type="dxa" w:w="2880"/>
-          </w:tcPr>
-          <w:p>
-            <w:r>
-              <w:t>Target P&amp;L shown in dashboard</w:t>
-            </w:r>
-          </w:p>
+          <w:p/>
+        </w:tc>
+        <w:tc>
+          <w:tcPr>
+            <w:tcW w:type="dxa" w:w="2880"/>
+          </w:tcPr>
+          <w:p/>
+        </w:tc>
+        <w:tc>
+          <w:tcPr>
+            <w:tcW w:type="dxa" w:w="2880"/>
+          </w:tcPr>
+          <w:p/>
         </w:tc>
       </w:tr>
       <w:tr>
@@ -5274,27 +5259,27 @@
           </w:tcPr>
           <w:p>
             <w:r>
-              <w:t>MAX_POSITIONS</w:t>
-            </w:r>
-          </w:p>
-        </w:tc>
-        <w:tc>
-          <w:tcPr>
-            <w:tcW w:type="dxa" w:w="2880"/>
-          </w:tcPr>
-          <w:p>
-            <w:r>
-              <w:t>15</w:t>
-            </w:r>
-          </w:p>
-        </w:tc>
-        <w:tc>
-          <w:tcPr>
-            <w:tcW w:type="dxa" w:w="2880"/>
-          </w:tcPr>
-          <w:p>
-            <w:r>
-              <w:t>Max concurrent open positions (reduced by market conditions)</w:t>
+              <w:t>TOTAL_CAPITAL</w:t>
+            </w:r>
+          </w:p>
+        </w:tc>
+        <w:tc>
+          <w:tcPr>
+            <w:tcW w:type="dxa" w:w="2880"/>
+          </w:tcPr>
+          <w:p>
+            <w:r>
+              <w:t>$100,000</w:t>
+            </w:r>
+          </w:p>
+        </w:tc>
+        <w:tc>
+          <w:tcPr>
+            <w:tcW w:type="dxa" w:w="2880"/>
+          </w:tcPr>
+          <w:p>
+            <w:r>
+              <w:t>Starting portfolio size</w:t>
             </w:r>
           </w:p>
         </w:tc>
@@ -5306,27 +5291,27 @@
           </w:tcPr>
           <w:p>
             <w:r>
-              <w:t>MAX_POSITION_PCT</w:t>
-            </w:r>
-          </w:p>
-        </w:tc>
-        <w:tc>
-          <w:tcPr>
-            <w:tcW w:type="dxa" w:w="2880"/>
-          </w:tcPr>
-          <w:p>
-            <w:r>
-              <w:t>7%</w:t>
-            </w:r>
-          </w:p>
-        </w:tc>
-        <w:tc>
-          <w:tcPr>
-            <w:tcW w:type="dxa" w:w="2880"/>
-          </w:tcPr>
-          <w:p>
-            <w:r>
-              <w:t>Max capital per single trade ($7K)</w:t>
+              <w:t>DAILY_PROFIT_TARGET</w:t>
+            </w:r>
+          </w:p>
+        </w:tc>
+        <w:tc>
+          <w:tcPr>
+            <w:tcW w:type="dxa" w:w="2880"/>
+          </w:tcPr>
+          <w:p>
+            <w:r>
+              <w:t>$1,000</w:t>
+            </w:r>
+          </w:p>
+        </w:tc>
+        <w:tc>
+          <w:tcPr>
+            <w:tcW w:type="dxa" w:w="2880"/>
+          </w:tcPr>
+          <w:p>
+            <w:r>
+              <w:t>Target P&amp;L shown in dashboard</w:t>
             </w:r>
           </w:p>
         </w:tc>
@@ -5338,27 +5323,27 @@
           </w:tcPr>
           <w:p>
             <w:r>
-              <w:t>MIN_POSITION_PCT</w:t>
-            </w:r>
-          </w:p>
-        </w:tc>
-        <w:tc>
-          <w:tcPr>
-            <w:tcW w:type="dxa" w:w="2880"/>
-          </w:tcPr>
-          <w:p>
-            <w:r>
-              <w:t>5%</w:t>
-            </w:r>
-          </w:p>
-        </w:tc>
-        <w:tc>
-          <w:tcPr>
-            <w:tcW w:type="dxa" w:w="2880"/>
-          </w:tcPr>
-          <w:p>
-            <w:r>
-              <w:t>Min capital per single trade ($5K)</w:t>
+              <w:t>MAX_POSITIONS</w:t>
+            </w:r>
+          </w:p>
+        </w:tc>
+        <w:tc>
+          <w:tcPr>
+            <w:tcW w:type="dxa" w:w="2880"/>
+          </w:tcPr>
+          <w:p>
+            <w:r>
+              <w:t>15</w:t>
+            </w:r>
+          </w:p>
+        </w:tc>
+        <w:tc>
+          <w:tcPr>
+            <w:tcW w:type="dxa" w:w="2880"/>
+          </w:tcPr>
+          <w:p>
+            <w:r>
+              <w:t>Max concurrent open positions (reduced by market conditions)</w:t>
             </w:r>
           </w:p>
         </w:tc>
@@ -5370,27 +5355,27 @@
           </w:tcPr>
           <w:p>
             <w:r>
-              <w:t>TARGET_PCT</w:t>
-            </w:r>
-          </w:p>
-        </w:tc>
-        <w:tc>
-          <w:tcPr>
-            <w:tcW w:type="dxa" w:w="2880"/>
-          </w:tcPr>
-          <w:p>
-            <w:r>
-              <w:t>3%</w:t>
-            </w:r>
-          </w:p>
-        </w:tc>
-        <w:tc>
-          <w:tcPr>
-            <w:tcW w:type="dxa" w:w="2880"/>
-          </w:tcPr>
-          <w:p>
-            <w:r>
-              <w:t>Profit target per trade (hard rule — agent must set this exactly)</w:t>
+              <w:t>MAX_POSITION_PCT</w:t>
+            </w:r>
+          </w:p>
+        </w:tc>
+        <w:tc>
+          <w:tcPr>
+            <w:tcW w:type="dxa" w:w="2880"/>
+          </w:tcPr>
+          <w:p>
+            <w:r>
+              <w:t>7%</w:t>
+            </w:r>
+          </w:p>
+        </w:tc>
+        <w:tc>
+          <w:tcPr>
+            <w:tcW w:type="dxa" w:w="2880"/>
+          </w:tcPr>
+          <w:p>
+            <w:r>
+              <w:t>Max capital per single trade ($7K)</w:t>
             </w:r>
           </w:p>
         </w:tc>
@@ -5402,27 +5387,27 @@
           </w:tcPr>
           <w:p>
             <w:r>
-              <w:t>MAX_LOSS_PER_TRADE</w:t>
-            </w:r>
-          </w:p>
-        </w:tc>
-        <w:tc>
-          <w:tcPr>
-            <w:tcW w:type="dxa" w:w="2880"/>
-          </w:tcPr>
-          <w:p>
-            <w:r>
-              <w:t>1%</w:t>
-            </w:r>
-          </w:p>
-        </w:tc>
-        <w:tc>
-          <w:tcPr>
-            <w:tcW w:type="dxa" w:w="2880"/>
-          </w:tcPr>
-          <w:p>
-            <w:r>
-              <w:t>Stop loss threshold — rejects wider stops (hard rule)</w:t>
+              <w:t>MIN_POSITION_PCT</w:t>
+            </w:r>
+          </w:p>
+        </w:tc>
+        <w:tc>
+          <w:tcPr>
+            <w:tcW w:type="dxa" w:w="2880"/>
+          </w:tcPr>
+          <w:p>
+            <w:r>
+              <w:t>5%</w:t>
+            </w:r>
+          </w:p>
+        </w:tc>
+        <w:tc>
+          <w:tcPr>
+            <w:tcW w:type="dxa" w:w="2880"/>
+          </w:tcPr>
+          <w:p>
+            <w:r>
+              <w:t>Min capital per single trade ($5K)</w:t>
             </w:r>
           </w:p>
         </w:tc>
@@ -5434,27 +5419,27 @@
           </w:tcPr>
           <w:p>
             <w:r>
-              <w:t>MIN_REWARD_RISK</w:t>
-            </w:r>
-          </w:p>
-        </w:tc>
-        <w:tc>
-          <w:tcPr>
-            <w:tcW w:type="dxa" w:w="2880"/>
-          </w:tcPr>
-          <w:p>
-            <w:r>
-              <w:t>3.0</w:t>
-            </w:r>
-          </w:p>
-        </w:tc>
-        <w:tc>
-          <w:tcPr>
-            <w:tcW w:type="dxa" w:w="2880"/>
-          </w:tcPr>
-          <w:p>
-            <w:r>
-              <w:t>Minimum reward:risk ratio to approve a trade (3:1)</w:t>
+              <w:t>TARGET_PCT</w:t>
+            </w:r>
+          </w:p>
+        </w:tc>
+        <w:tc>
+          <w:tcPr>
+            <w:tcW w:type="dxa" w:w="2880"/>
+          </w:tcPr>
+          <w:p>
+            <w:r>
+              <w:t>3%</w:t>
+            </w:r>
+          </w:p>
+        </w:tc>
+        <w:tc>
+          <w:tcPr>
+            <w:tcW w:type="dxa" w:w="2880"/>
+          </w:tcPr>
+          <w:p>
+            <w:r>
+              <w:t>Profit target per trade (hard rule — agent must set this exactly)</w:t>
             </w:r>
           </w:p>
         </w:tc>
@@ -5466,27 +5451,27 @@
           </w:tcPr>
           <w:p>
             <w:r>
-              <w:t>SCORE_THRESHOLD</w:t>
-            </w:r>
-          </w:p>
-        </w:tc>
-        <w:tc>
-          <w:tcPr>
-            <w:tcW w:type="dxa" w:w="2880"/>
-          </w:tcPr>
-          <w:p>
-            <w:r>
-              <w:t>3</w:t>
-            </w:r>
-          </w:p>
-        </w:tc>
-        <w:tc>
-          <w:tcPr>
-            <w:tcW w:type="dxa" w:w="2880"/>
-          </w:tcPr>
-          <w:p>
-            <w:r>
-              <w:t>Minimum scanner score to be a strategy candidate</w:t>
+              <w:t>MAX_LOSS_PER_TRADE</w:t>
+            </w:r>
+          </w:p>
+        </w:tc>
+        <w:tc>
+          <w:tcPr>
+            <w:tcW w:type="dxa" w:w="2880"/>
+          </w:tcPr>
+          <w:p>
+            <w:r>
+              <w:t>1%</w:t>
+            </w:r>
+          </w:p>
+        </w:tc>
+        <w:tc>
+          <w:tcPr>
+            <w:tcW w:type="dxa" w:w="2880"/>
+          </w:tcPr>
+          <w:p>
+            <w:r>
+              <w:t>Stop loss threshold — rejects wider stops (hard rule)</w:t>
             </w:r>
           </w:p>
         </w:tc>
@@ -5498,27 +5483,27 @@
           </w:tcPr>
           <w:p>
             <w:r>
-              <w:t>RSI_OVERSOLD</w:t>
-            </w:r>
-          </w:p>
-        </w:tc>
-        <w:tc>
-          <w:tcPr>
-            <w:tcW w:type="dxa" w:w="2880"/>
-          </w:tcPr>
-          <w:p>
-            <w:r>
-              <w:t>35</w:t>
-            </w:r>
-          </w:p>
-        </w:tc>
-        <w:tc>
-          <w:tcPr>
-            <w:tcW w:type="dxa" w:w="2880"/>
-          </w:tcPr>
-          <w:p>
-            <w:r>
-              <w:t>RSI level considered oversold (buy signal)</w:t>
+              <w:t>MIN_REWARD_RISK</w:t>
+            </w:r>
+          </w:p>
+        </w:tc>
+        <w:tc>
+          <w:tcPr>
+            <w:tcW w:type="dxa" w:w="2880"/>
+          </w:tcPr>
+          <w:p>
+            <w:r>
+              <w:t>3.0</w:t>
+            </w:r>
+          </w:p>
+        </w:tc>
+        <w:tc>
+          <w:tcPr>
+            <w:tcW w:type="dxa" w:w="2880"/>
+          </w:tcPr>
+          <w:p>
+            <w:r>
+              <w:t>Minimum reward:risk ratio to approve a trade (3:1)</w:t>
             </w:r>
           </w:p>
         </w:tc>
@@ -5530,27 +5515,27 @@
           </w:tcPr>
           <w:p>
             <w:r>
-              <w:t>RSI_OVERBOUGHT</w:t>
-            </w:r>
-          </w:p>
-        </w:tc>
-        <w:tc>
-          <w:tcPr>
-            <w:tcW w:type="dxa" w:w="2880"/>
-          </w:tcPr>
-          <w:p>
-            <w:r>
-              <w:t>65</w:t>
-            </w:r>
-          </w:p>
-        </w:tc>
-        <w:tc>
-          <w:tcPr>
-            <w:tcW w:type="dxa" w:w="2880"/>
-          </w:tcPr>
-          <w:p>
-            <w:r>
-              <w:t>RSI level considered overbought (sell signal)</w:t>
+              <w:t>SCORE_THRESHOLD</w:t>
+            </w:r>
+          </w:p>
+        </w:tc>
+        <w:tc>
+          <w:tcPr>
+            <w:tcW w:type="dxa" w:w="2880"/>
+          </w:tcPr>
+          <w:p>
+            <w:r>
+              <w:t>3</w:t>
+            </w:r>
+          </w:p>
+        </w:tc>
+        <w:tc>
+          <w:tcPr>
+            <w:tcW w:type="dxa" w:w="2880"/>
+          </w:tcPr>
+          <w:p>
+            <w:r>
+              <w:t>Minimum scanner score to be a strategy candidate</w:t>
             </w:r>
           </w:p>
         </w:tc>
@@ -5562,27 +5547,27 @@
           </w:tcPr>
           <w:p>
             <w:r>
-              <w:t>MIN_VOLUME_RATIO</w:t>
-            </w:r>
-          </w:p>
-        </w:tc>
-        <w:tc>
-          <w:tcPr>
-            <w:tcW w:type="dxa" w:w="2880"/>
-          </w:tcPr>
-          <w:p>
-            <w:r>
-              <w:t>1.5x</w:t>
-            </w:r>
-          </w:p>
-        </w:tc>
-        <w:tc>
-          <w:tcPr>
-            <w:tcW w:type="dxa" w:w="2880"/>
-          </w:tcPr>
-          <w:p>
-            <w:r>
-              <w:t>Volume must be 1.5x the 20-day average</w:t>
+              <w:t>RSI_OVERSOLD</w:t>
+            </w:r>
+          </w:p>
+        </w:tc>
+        <w:tc>
+          <w:tcPr>
+            <w:tcW w:type="dxa" w:w="2880"/>
+          </w:tcPr>
+          <w:p>
+            <w:r>
+              <w:t>35</w:t>
+            </w:r>
+          </w:p>
+        </w:tc>
+        <w:tc>
+          <w:tcPr>
+            <w:tcW w:type="dxa" w:w="2880"/>
+          </w:tcPr>
+          <w:p>
+            <w:r>
+              <w:t>RSI level considered oversold (buy signal)</w:t>
             </w:r>
           </w:p>
         </w:tc>
@@ -5594,27 +5579,27 @@
           </w:tcPr>
           <w:p>
             <w:r>
-              <w:t>MIN_AVG_VOLUME</w:t>
-            </w:r>
-          </w:p>
-        </w:tc>
-        <w:tc>
-          <w:tcPr>
-            <w:tcW w:type="dxa" w:w="2880"/>
-          </w:tcPr>
-          <w:p>
-            <w:r>
-              <w:t>500,000</w:t>
-            </w:r>
-          </w:p>
-        </w:tc>
-        <w:tc>
-          <w:tcPr>
-            <w:tcW w:type="dxa" w:w="2880"/>
-          </w:tcPr>
-          <w:p>
-            <w:r>
-              <w:t>Minimum average daily volume (liquidity floor)</w:t>
+              <w:t>RSI_OVERBOUGHT</w:t>
+            </w:r>
+          </w:p>
+        </w:tc>
+        <w:tc>
+          <w:tcPr>
+            <w:tcW w:type="dxa" w:w="2880"/>
+          </w:tcPr>
+          <w:p>
+            <w:r>
+              <w:t>65</w:t>
+            </w:r>
+          </w:p>
+        </w:tc>
+        <w:tc>
+          <w:tcPr>
+            <w:tcW w:type="dxa" w:w="2880"/>
+          </w:tcPr>
+          <w:p>
+            <w:r>
+              <w:t>RSI level considered overbought (sell signal)</w:t>
             </w:r>
           </w:p>
         </w:tc>
@@ -5626,27 +5611,27 @@
           </w:tcPr>
           <w:p>
             <w:r>
-              <w:t>MIN_PRICE</w:t>
-            </w:r>
-          </w:p>
-        </w:tc>
-        <w:tc>
-          <w:tcPr>
-            <w:tcW w:type="dxa" w:w="2880"/>
-          </w:tcPr>
-          <w:p>
-            <w:r>
-              <w:t>$5.00</w:t>
-            </w:r>
-          </w:p>
-        </w:tc>
-        <w:tc>
-          <w:tcPr>
-            <w:tcW w:type="dxa" w:w="2880"/>
-          </w:tcPr>
-          <w:p>
-            <w:r>
-              <w:t>Minimum stock price (filters out penny stocks)</w:t>
+              <w:t>MIN_VOLUME_RATIO</w:t>
+            </w:r>
+          </w:p>
+        </w:tc>
+        <w:tc>
+          <w:tcPr>
+            <w:tcW w:type="dxa" w:w="2880"/>
+          </w:tcPr>
+          <w:p>
+            <w:r>
+              <w:t>1.5x</w:t>
+            </w:r>
+          </w:p>
+        </w:tc>
+        <w:tc>
+          <w:tcPr>
+            <w:tcW w:type="dxa" w:w="2880"/>
+          </w:tcPr>
+          <w:p>
+            <w:r>
+              <w:t>Volume must be 1.5x the 20-day average</w:t>
             </w:r>
           </w:p>
         </w:tc>
@@ -5658,27 +5643,27 @@
           </w:tcPr>
           <w:p>
             <w:r>
-              <w:t>MAX_PER_SECTOR</w:t>
-            </w:r>
-          </w:p>
-        </w:tc>
-        <w:tc>
-          <w:tcPr>
-            <w:tcW w:type="dxa" w:w="2880"/>
-          </w:tcPr>
-          <w:p>
-            <w:r>
-              <w:t>3</w:t>
-            </w:r>
-          </w:p>
-        </w:tc>
-        <w:tc>
-          <w:tcPr>
-            <w:tcW w:type="dxa" w:w="2880"/>
-          </w:tcPr>
-          <w:p>
-            <w:r>
-              <w:t>V2d: max positions in any single sector per day</w:t>
+              <w:t>MIN_AVG_VOLUME</w:t>
+            </w:r>
+          </w:p>
+        </w:tc>
+        <w:tc>
+          <w:tcPr>
+            <w:tcW w:type="dxa" w:w="2880"/>
+          </w:tcPr>
+          <w:p>
+            <w:r>
+              <w:t>500,000</w:t>
+            </w:r>
+          </w:p>
+        </w:tc>
+        <w:tc>
+          <w:tcPr>
+            <w:tcW w:type="dxa" w:w="2880"/>
+          </w:tcPr>
+          <w:p>
+            <w:r>
+              <w:t>Minimum average daily volume (liquidity floor)</w:t>
             </w:r>
           </w:p>
         </w:tc>
@@ -5690,27 +5675,27 @@
           </w:tcPr>
           <w:p>
             <w:r>
-              <w:t>DAILY_LOSS_LIMIT</w:t>
-            </w:r>
-          </w:p>
-        </w:tc>
-        <w:tc>
-          <w:tcPr>
-            <w:tcW w:type="dxa" w:w="2880"/>
-          </w:tcPr>
-          <w:p>
-            <w:r>
-              <w:t>-$300</w:t>
-            </w:r>
-          </w:p>
-        </w:tc>
-        <w:tc>
-          <w:tcPr>
-            <w:tcW w:type="dxa" w:w="2880"/>
-          </w:tcPr>
-          <w:p>
-            <w:r>
-              <w:t>V5: stop opening new trades if today's realized P&amp;L drops below this</w:t>
+              <w:t>MIN_PRICE</w:t>
+            </w:r>
+          </w:p>
+        </w:tc>
+        <w:tc>
+          <w:tcPr>
+            <w:tcW w:type="dxa" w:w="2880"/>
+          </w:tcPr>
+          <w:p>
+            <w:r>
+              <w:t>$5.00</w:t>
+            </w:r>
+          </w:p>
+        </w:tc>
+        <w:tc>
+          <w:tcPr>
+            <w:tcW w:type="dxa" w:w="2880"/>
+          </w:tcPr>
+          <w:p>
+            <w:r>
+              <w:t>Minimum stock price (filters out penny stocks)</w:t>
             </w:r>
           </w:p>
         </w:tc>
@@ -5722,27 +5707,27 @@
           </w:tcPr>
           <w:p>
             <w:r>
-              <w:t>PRICE_SANITY_PCT</w:t>
-            </w:r>
-          </w:p>
-        </w:tc>
-        <w:tc>
-          <w:tcPr>
-            <w:tcW w:type="dxa" w:w="2880"/>
-          </w:tcPr>
-          <w:p>
-            <w:r>
-              <w:t>5%</w:t>
-            </w:r>
-          </w:p>
-        </w:tc>
-        <w:tc>
-          <w:tcPr>
-            <w:tcW w:type="dxa" w:w="2880"/>
-          </w:tcPr>
-          <w:p>
-            <w:r>
-              <w:t>V5: reject trade if entry price is more than 5% from current market price</w:t>
+              <w:t>MAX_PER_SECTOR</w:t>
+            </w:r>
+          </w:p>
+        </w:tc>
+        <w:tc>
+          <w:tcPr>
+            <w:tcW w:type="dxa" w:w="2880"/>
+          </w:tcPr>
+          <w:p>
+            <w:r>
+              <w:t>3</w:t>
+            </w:r>
+          </w:p>
+        </w:tc>
+        <w:tc>
+          <w:tcPr>
+            <w:tcW w:type="dxa" w:w="2880"/>
+          </w:tcPr>
+          <w:p>
+            <w:r>
+              <w:t>V2d: max positions in any single sector per day</w:t>
             </w:r>
           </w:p>
         </w:tc>
@@ -5754,6 +5739,70 @@
           </w:tcPr>
           <w:p>
             <w:r>
+              <w:t>DAILY_LOSS_LIMIT</w:t>
+            </w:r>
+          </w:p>
+        </w:tc>
+        <w:tc>
+          <w:tcPr>
+            <w:tcW w:type="dxa" w:w="2880"/>
+          </w:tcPr>
+          <w:p>
+            <w:r>
+              <w:t>-$300</w:t>
+            </w:r>
+          </w:p>
+        </w:tc>
+        <w:tc>
+          <w:tcPr>
+            <w:tcW w:type="dxa" w:w="2880"/>
+          </w:tcPr>
+          <w:p>
+            <w:r>
+              <w:t>V5: stop opening new trades if today's realized P&amp;L drops below this</w:t>
+            </w:r>
+          </w:p>
+        </w:tc>
+      </w:tr>
+      <w:tr>
+        <w:tc>
+          <w:tcPr>
+            <w:tcW w:type="dxa" w:w="2880"/>
+          </w:tcPr>
+          <w:p>
+            <w:r>
+              <w:t>PRICE_SANITY_PCT</w:t>
+            </w:r>
+          </w:p>
+        </w:tc>
+        <w:tc>
+          <w:tcPr>
+            <w:tcW w:type="dxa" w:w="2880"/>
+          </w:tcPr>
+          <w:p>
+            <w:r>
+              <w:t>5%</w:t>
+            </w:r>
+          </w:p>
+        </w:tc>
+        <w:tc>
+          <w:tcPr>
+            <w:tcW w:type="dxa" w:w="2880"/>
+          </w:tcPr>
+          <w:p>
+            <w:r>
+              <w:t>V5: reject trade if entry price is more than 5% from current market price</w:t>
+            </w:r>
+          </w:p>
+        </w:tc>
+      </w:tr>
+      <w:tr>
+        <w:tc>
+          <w:tcPr>
+            <w:tcW w:type="dxa" w:w="2880"/>
+          </w:tcPr>
+          <w:p>
+            <w:r>
               <w:t>DAILY_LOCK_IN_TARGET</w:t>
             </w:r>
           </w:p>
@@ -5775,6 +5824,70 @@
           <w:p>
             <w:r>
               <w:t>V5: close all open positions and lock in gains once today's realized P&amp;L hits this threshold — set to 30-day backtest average daily P&amp;L; raise as capital compounds</w:t>
+            </w:r>
+          </w:p>
+        </w:tc>
+      </w:tr>
+      <w:tr>
+        <w:tc>
+          <w:tcPr>
+            <w:tcW w:type="dxa" w:w="2880"/>
+          </w:tcPr>
+          <w:p>
+            <w:r>
+              <w:t>TRAIL_PCT</w:t>
+            </w:r>
+          </w:p>
+        </w:tc>
+        <w:tc>
+          <w:tcPr>
+            <w:tcW w:type="dxa" w:w="2880"/>
+          </w:tcPr>
+          <w:p>
+            <w:r>
+              <w:t>1%</w:t>
+            </w:r>
+          </w:p>
+        </w:tc>
+        <w:tc>
+          <w:tcPr>
+            <w:tcW w:type="dxa" w:w="2880"/>
+          </w:tcPr>
+          <w:p>
+            <w:r>
+              <w:t>V5.3: trailing stop — close if price drops 1% from highest point seen since entry; effective_stop = max(original_stop, high_watermark × 0.99); ratchets up as stock rises in profit</w:t>
+            </w:r>
+          </w:p>
+        </w:tc>
+      </w:tr>
+      <w:tr>
+        <w:tc>
+          <w:tcPr>
+            <w:tcW w:type="dxa" w:w="2880"/>
+          </w:tcPr>
+          <w:p>
+            <w:r>
+              <w:t>POSITION_SIZE_BY_CONFIDENCE</w:t>
+            </w:r>
+          </w:p>
+        </w:tc>
+        <w:tc>
+          <w:tcPr>
+            <w:tcW w:type="dxa" w:w="2880"/>
+          </w:tcPr>
+          <w:p>
+            <w:r>
+              <w:t>HIGH=$7K / MED=$6K / LOW=$5K</w:t>
+            </w:r>
+          </w:p>
+        </w:tc>
+        <w:tc>
+          <w:tcPr>
+            <w:tcW w:type="dxa" w:w="2880"/>
+          </w:tcPr>
+          <w:p>
+            <w:r>
+              <w:t>V5.3: risk agent maps Claude confidence level to position size before validation; auto-corrects regardless of what Claude sets in the trade JSON</w:t>
             </w:r>
           </w:p>
         </w:tc>
@@ -8769,31 +8882,19 @@
           <w:tcPr>
             <w:tcW w:type="dxa" w:w="2880"/>
           </w:tcPr>
-          <w:p>
-            <w:r>
-              <w:t>1</w:t>
-            </w:r>
-          </w:p>
-        </w:tc>
-        <w:tc>
-          <w:tcPr>
-            <w:tcW w:type="dxa" w:w="2880"/>
-          </w:tcPr>
-          <w:p>
-            <w:r>
-              <w:t>Designed the architecture</w:t>
-            </w:r>
-          </w:p>
-        </w:tc>
-        <w:tc>
-          <w:tcPr>
-            <w:tcW w:type="dxa" w:w="2880"/>
-          </w:tcPr>
-          <w:p>
-            <w:r>
-              <w:t>Multi-agent pipeline — scanner → strategy → risk → portfolio</w:t>
-            </w:r>
-          </w:p>
+          <w:p/>
+        </w:tc>
+        <w:tc>
+          <w:tcPr>
+            <w:tcW w:type="dxa" w:w="2880"/>
+          </w:tcPr>
+          <w:p/>
+        </w:tc>
+        <w:tc>
+          <w:tcPr>
+            <w:tcW w:type="dxa" w:w="2880"/>
+          </w:tcPr>
+          <w:p/>
         </w:tc>
       </w:tr>
       <w:tr>
@@ -8801,31 +8902,19 @@
           <w:tcPr>
             <w:tcW w:type="dxa" w:w="2880"/>
           </w:tcPr>
-          <w:p>
-            <w:r>
-              <w:t>2</w:t>
-            </w:r>
-          </w:p>
-        </w:tc>
-        <w:tc>
-          <w:tcPr>
-            <w:tcW w:type="dxa" w:w="2880"/>
-          </w:tcPr>
-          <w:p>
-            <w:r>
-              <w:t>Built the market scanner</w:t>
-            </w:r>
-          </w:p>
-        </w:tc>
-        <w:tc>
-          <w:tcPr>
-            <w:tcW w:type="dxa" w:w="2880"/>
-          </w:tcPr>
-          <w:p>
-            <w:r>
-              <w:t>yfinance + ta library, scoring 60+ tickers initially</w:t>
-            </w:r>
-          </w:p>
+          <w:p/>
+        </w:tc>
+        <w:tc>
+          <w:tcPr>
+            <w:tcW w:type="dxa" w:w="2880"/>
+          </w:tcPr>
+          <w:p/>
+        </w:tc>
+        <w:tc>
+          <w:tcPr>
+            <w:tcW w:type="dxa" w:w="2880"/>
+          </w:tcPr>
+          <w:p/>
         </w:tc>
       </w:tr>
       <w:tr>
@@ -8833,31 +8922,19 @@
           <w:tcPr>
             <w:tcW w:type="dxa" w:w="2880"/>
           </w:tcPr>
-          <w:p>
-            <w:r>
-              <w:t>3</w:t>
-            </w:r>
-          </w:p>
-        </w:tc>
-        <w:tc>
-          <w:tcPr>
-            <w:tcW w:type="dxa" w:w="2880"/>
-          </w:tcPr>
-          <w:p>
-            <w:r>
-              <w:t>Built the strategy agent</w:t>
-            </w:r>
-          </w:p>
-        </w:tc>
-        <w:tc>
-          <w:tcPr>
-            <w:tcW w:type="dxa" w:w="2880"/>
-          </w:tcPr>
-          <w:p>
-            <w:r>
-              <w:t>Claude selects trades with entry/target/stop/reasoning</w:t>
-            </w:r>
-          </w:p>
+          <w:p/>
+        </w:tc>
+        <w:tc>
+          <w:tcPr>
+            <w:tcW w:type="dxa" w:w="2880"/>
+          </w:tcPr>
+          <w:p/>
+        </w:tc>
+        <w:tc>
+          <w:tcPr>
+            <w:tcW w:type="dxa" w:w="2880"/>
+          </w:tcPr>
+          <w:p/>
         </w:tc>
       </w:tr>
       <w:tr>
@@ -8867,27 +8944,27 @@
           </w:tcPr>
           <w:p>
             <w:r>
-              <w:t>4</w:t>
-            </w:r>
-          </w:p>
-        </w:tc>
-        <w:tc>
-          <w:tcPr>
-            <w:tcW w:type="dxa" w:w="2880"/>
-          </w:tcPr>
-          <w:p>
-            <w:r>
-              <w:t>Built the risk agent</w:t>
-            </w:r>
-          </w:p>
-        </w:tc>
-        <w:tc>
-          <w:tcPr>
-            <w:tcW w:type="dxa" w:w="2880"/>
-          </w:tcPr>
-          <w:p>
-            <w:r>
-              <w:t>Claude validates every trade against hard risk rules</w:t>
+              <w:t>1</w:t>
+            </w:r>
+          </w:p>
+        </w:tc>
+        <w:tc>
+          <w:tcPr>
+            <w:tcW w:type="dxa" w:w="2880"/>
+          </w:tcPr>
+          <w:p>
+            <w:r>
+              <w:t>Designed the architecture</w:t>
+            </w:r>
+          </w:p>
+        </w:tc>
+        <w:tc>
+          <w:tcPr>
+            <w:tcW w:type="dxa" w:w="2880"/>
+          </w:tcPr>
+          <w:p>
+            <w:r>
+              <w:t>Multi-agent pipeline — scanner → strategy → risk → portfolio</w:t>
             </w:r>
           </w:p>
         </w:tc>
@@ -8899,27 +8976,27 @@
           </w:tcPr>
           <w:p>
             <w:r>
-              <w:t>5</w:t>
-            </w:r>
-          </w:p>
-        </w:tc>
-        <w:tc>
-          <w:tcPr>
-            <w:tcW w:type="dxa" w:w="2880"/>
-          </w:tcPr>
-          <w:p>
-            <w:r>
-              <w:t>Built the portfolio agent</w:t>
-            </w:r>
-          </w:p>
-        </w:tc>
-        <w:tc>
-          <w:tcPr>
-            <w:tcW w:type="dxa" w:w="2880"/>
-          </w:tcPr>
-          <w:p>
-            <w:r>
-              <w:t>Opens and tracks simulated positions in Supabase</w:t>
+              <w:t>2</w:t>
+            </w:r>
+          </w:p>
+        </w:tc>
+        <w:tc>
+          <w:tcPr>
+            <w:tcW w:type="dxa" w:w="2880"/>
+          </w:tcPr>
+          <w:p>
+            <w:r>
+              <w:t>Built the market scanner</w:t>
+            </w:r>
+          </w:p>
+        </w:tc>
+        <w:tc>
+          <w:tcPr>
+            <w:tcW w:type="dxa" w:w="2880"/>
+          </w:tcPr>
+          <w:p>
+            <w:r>
+              <w:t>yfinance + ta library, scoring 60+ tickers initially</w:t>
             </w:r>
           </w:p>
         </w:tc>
@@ -8931,27 +9008,27 @@
           </w:tcPr>
           <w:p>
             <w:r>
-              <w:t>6</w:t>
-            </w:r>
-          </w:p>
-        </w:tc>
-        <w:tc>
-          <w:tcPr>
-            <w:tcW w:type="dxa" w:w="2880"/>
-          </w:tcPr>
-          <w:p>
-            <w:r>
-              <w:t>Built the intraday agent</w:t>
-            </w:r>
-          </w:p>
-        </w:tc>
-        <w:tc>
-          <w:tcPr>
-            <w:tcW w:type="dxa" w:w="2880"/>
-          </w:tcPr>
-          <w:p>
-            <w:r>
-              <w:t>Monitors positions every 30 min, closes on target/stop</w:t>
+              <w:t>3</w:t>
+            </w:r>
+          </w:p>
+        </w:tc>
+        <w:tc>
+          <w:tcPr>
+            <w:tcW w:type="dxa" w:w="2880"/>
+          </w:tcPr>
+          <w:p>
+            <w:r>
+              <w:t>Built the strategy agent</w:t>
+            </w:r>
+          </w:p>
+        </w:tc>
+        <w:tc>
+          <w:tcPr>
+            <w:tcW w:type="dxa" w:w="2880"/>
+          </w:tcPr>
+          <w:p>
+            <w:r>
+              <w:t>Claude selects trades with entry/target/stop/reasoning</w:t>
             </w:r>
           </w:p>
         </w:tc>
@@ -8963,27 +9040,27 @@
           </w:tcPr>
           <w:p>
             <w:r>
-              <w:t>7</w:t>
-            </w:r>
-          </w:p>
-        </w:tc>
-        <w:tc>
-          <w:tcPr>
-            <w:tcW w:type="dxa" w:w="2880"/>
-          </w:tcPr>
-          <w:p>
-            <w:r>
-              <w:t>Built the EOD agent</w:t>
-            </w:r>
-          </w:p>
-        </w:tc>
-        <w:tc>
-          <w:tcPr>
-            <w:tcW w:type="dxa" w:w="2880"/>
-          </w:tcPr>
-          <w:p>
-            <w:r>
-              <w:t>Calculates daily P&amp;L, updates portfolio capital</w:t>
+              <w:t>4</w:t>
+            </w:r>
+          </w:p>
+        </w:tc>
+        <w:tc>
+          <w:tcPr>
+            <w:tcW w:type="dxa" w:w="2880"/>
+          </w:tcPr>
+          <w:p>
+            <w:r>
+              <w:t>Built the risk agent</w:t>
+            </w:r>
+          </w:p>
+        </w:tc>
+        <w:tc>
+          <w:tcPr>
+            <w:tcW w:type="dxa" w:w="2880"/>
+          </w:tcPr>
+          <w:p>
+            <w:r>
+              <w:t>Claude validates every trade against hard risk rules</w:t>
             </w:r>
           </w:p>
         </w:tc>
@@ -8995,27 +9072,27 @@
           </w:tcPr>
           <w:p>
             <w:r>
-              <w:t>8</w:t>
-            </w:r>
-          </w:p>
-        </w:tc>
-        <w:tc>
-          <w:tcPr>
-            <w:tcW w:type="dxa" w:w="2880"/>
-          </w:tcPr>
-          <w:p>
-            <w:r>
-              <w:t>Wrote the orchestrator</w:t>
-            </w:r>
-          </w:p>
-        </w:tc>
-        <w:tc>
-          <w:tcPr>
-            <w:tcW w:type="dxa" w:w="2880"/>
-          </w:tcPr>
-          <w:p>
-            <w:r>
-              <w:t>Chains all agents, callable with --mode flag</w:t>
+              <w:t>5</w:t>
+            </w:r>
+          </w:p>
+        </w:tc>
+        <w:tc>
+          <w:tcPr>
+            <w:tcW w:type="dxa" w:w="2880"/>
+          </w:tcPr>
+          <w:p>
+            <w:r>
+              <w:t>Built the portfolio agent</w:t>
+            </w:r>
+          </w:p>
+        </w:tc>
+        <w:tc>
+          <w:tcPr>
+            <w:tcW w:type="dxa" w:w="2880"/>
+          </w:tcPr>
+          <w:p>
+            <w:r>
+              <w:t>Opens and tracks simulated positions in Supabase</w:t>
             </w:r>
           </w:p>
         </w:tc>
@@ -9027,27 +9104,27 @@
           </w:tcPr>
           <w:p>
             <w:r>
-              <w:t>9</w:t>
-            </w:r>
-          </w:p>
-        </w:tc>
-        <w:tc>
-          <w:tcPr>
-            <w:tcW w:type="dxa" w:w="2880"/>
-          </w:tcPr>
-          <w:p>
-            <w:r>
-              <w:t>Created the database schema</w:t>
-            </w:r>
-          </w:p>
-        </w:tc>
-        <w:tc>
-          <w:tcPr>
-            <w:tcW w:type="dxa" w:w="2880"/>
-          </w:tcPr>
-          <w:p>
-            <w:r>
-              <w:t>Five Supabase tables with proper indexes and constraints</w:t>
+              <w:t>6</w:t>
+            </w:r>
+          </w:p>
+        </w:tc>
+        <w:tc>
+          <w:tcPr>
+            <w:tcW w:type="dxa" w:w="2880"/>
+          </w:tcPr>
+          <w:p>
+            <w:r>
+              <w:t>Built the intraday agent</w:t>
+            </w:r>
+          </w:p>
+        </w:tc>
+        <w:tc>
+          <w:tcPr>
+            <w:tcW w:type="dxa" w:w="2880"/>
+          </w:tcPr>
+          <w:p>
+            <w:r>
+              <w:t>Monitors positions every 30 min, closes on target/stop</w:t>
             </w:r>
           </w:p>
         </w:tc>
@@ -9059,27 +9136,27 @@
           </w:tcPr>
           <w:p>
             <w:r>
-              <w:t>10</w:t>
-            </w:r>
-          </w:p>
-        </w:tc>
-        <w:tc>
-          <w:tcPr>
-            <w:tcW w:type="dxa" w:w="2880"/>
-          </w:tcPr>
-          <w:p>
-            <w:r>
-              <w:t>Set up GitHub Actions</w:t>
-            </w:r>
-          </w:p>
-        </w:tc>
-        <w:tc>
-          <w:tcPr>
-            <w:tcW w:type="dxa" w:w="2880"/>
-          </w:tcPr>
-          <w:p>
-            <w:r>
-              <w:t>Cron workflow running premarket/intraday/EOD on weekdays</w:t>
+              <w:t>7</w:t>
+            </w:r>
+          </w:p>
+        </w:tc>
+        <w:tc>
+          <w:tcPr>
+            <w:tcW w:type="dxa" w:w="2880"/>
+          </w:tcPr>
+          <w:p>
+            <w:r>
+              <w:t>Built the EOD agent</w:t>
+            </w:r>
+          </w:p>
+        </w:tc>
+        <w:tc>
+          <w:tcPr>
+            <w:tcW w:type="dxa" w:w="2880"/>
+          </w:tcPr>
+          <w:p>
+            <w:r>
+              <w:t>Calculates daily P&amp;L, updates portfolio capital</w:t>
             </w:r>
           </w:p>
         </w:tc>
@@ -9091,27 +9168,27 @@
           </w:tcPr>
           <w:p>
             <w:r>
-              <w:t>11</w:t>
-            </w:r>
-          </w:p>
-        </w:tc>
-        <w:tc>
-          <w:tcPr>
-            <w:tcW w:type="dxa" w:w="2880"/>
-          </w:tcPr>
-          <w:p>
-            <w:r>
-              <w:t>Set up Git + GitHub (SSH)</w:t>
-            </w:r>
-          </w:p>
-        </w:tc>
-        <w:tc>
-          <w:tcPr>
-            <w:tcW w:type="dxa" w:w="2880"/>
-          </w:tcPr>
-          <w:p>
-            <w:r>
-              <w:t>Generated SSH key, added to GitHub, switched remote to SSH</w:t>
+              <w:t>8</w:t>
+            </w:r>
+          </w:p>
+        </w:tc>
+        <w:tc>
+          <w:tcPr>
+            <w:tcW w:type="dxa" w:w="2880"/>
+          </w:tcPr>
+          <w:p>
+            <w:r>
+              <w:t>Wrote the orchestrator</w:t>
+            </w:r>
+          </w:p>
+        </w:tc>
+        <w:tc>
+          <w:tcPr>
+            <w:tcW w:type="dxa" w:w="2880"/>
+          </w:tcPr>
+          <w:p>
+            <w:r>
+              <w:t>Chains all agents, callable with --mode flag</w:t>
             </w:r>
           </w:p>
         </w:tc>
@@ -9123,27 +9200,27 @@
           </w:tcPr>
           <w:p>
             <w:r>
-              <w:t>12</w:t>
-            </w:r>
-          </w:p>
-        </w:tc>
-        <w:tc>
-          <w:tcPr>
-            <w:tcW w:type="dxa" w:w="2880"/>
-          </w:tcPr>
-          <w:p>
-            <w:r>
-              <w:t>Set up Supabase</w:t>
-            </w:r>
-          </w:p>
-        </w:tc>
-        <w:tc>
-          <w:tcPr>
-            <w:tcW w:type="dxa" w:w="2880"/>
-          </w:tcPr>
-          <w:p>
-            <w:r>
-              <w:t>Created project, ran schema.sql, obtained URL and service role key</w:t>
+              <w:t>9</w:t>
+            </w:r>
+          </w:p>
+        </w:tc>
+        <w:tc>
+          <w:tcPr>
+            <w:tcW w:type="dxa" w:w="2880"/>
+          </w:tcPr>
+          <w:p>
+            <w:r>
+              <w:t>Created the database schema</w:t>
+            </w:r>
+          </w:p>
+        </w:tc>
+        <w:tc>
+          <w:tcPr>
+            <w:tcW w:type="dxa" w:w="2880"/>
+          </w:tcPr>
+          <w:p>
+            <w:r>
+              <w:t>Five Supabase tables with proper indexes and constraints</w:t>
             </w:r>
           </w:p>
         </w:tc>
@@ -9155,27 +9232,27 @@
           </w:tcPr>
           <w:p>
             <w:r>
-              <w:t>13</w:t>
-            </w:r>
-          </w:p>
-        </w:tc>
-        <w:tc>
-          <w:tcPr>
-            <w:tcW w:type="dxa" w:w="2880"/>
-          </w:tcPr>
-          <w:p>
-            <w:r>
-              <w:t>Set GitHub Secrets</w:t>
-            </w:r>
-          </w:p>
-        </w:tc>
-        <w:tc>
-          <w:tcPr>
-            <w:tcW w:type="dxa" w:w="2880"/>
-          </w:tcPr>
-          <w:p>
-            <w:r>
-              <w:t>Added API keys to repo secrets for runtime injection</w:t>
+              <w:t>10</w:t>
+            </w:r>
+          </w:p>
+        </w:tc>
+        <w:tc>
+          <w:tcPr>
+            <w:tcW w:type="dxa" w:w="2880"/>
+          </w:tcPr>
+          <w:p>
+            <w:r>
+              <w:t>Set up GitHub Actions</w:t>
+            </w:r>
+          </w:p>
+        </w:tc>
+        <w:tc>
+          <w:tcPr>
+            <w:tcW w:type="dxa" w:w="2880"/>
+          </w:tcPr>
+          <w:p>
+            <w:r>
+              <w:t>Cron workflow running premarket/intraday/EOD on weekdays</w:t>
             </w:r>
           </w:p>
         </w:tc>
@@ -9187,27 +9264,27 @@
           </w:tcPr>
           <w:p>
             <w:r>
-              <w:t>14</w:t>
-            </w:r>
-          </w:p>
-        </w:tc>
-        <w:tc>
-          <w:tcPr>
-            <w:tcW w:type="dxa" w:w="2880"/>
-          </w:tcPr>
-          <w:p>
-            <w:r>
-              <w:t>End-to-end test</w:t>
-            </w:r>
-          </w:p>
-        </w:tc>
-        <w:tc>
-          <w:tcPr>
-            <w:tcW w:type="dxa" w:w="2880"/>
-          </w:tcPr>
-          <w:p>
-            <w:r>
-              <w:t>Manual premarket run via GitHub Actions — confirmed full pipeline working</w:t>
+              <w:t>11</w:t>
+            </w:r>
+          </w:p>
+        </w:tc>
+        <w:tc>
+          <w:tcPr>
+            <w:tcW w:type="dxa" w:w="2880"/>
+          </w:tcPr>
+          <w:p>
+            <w:r>
+              <w:t>Set up Git + GitHub (SSH)</w:t>
+            </w:r>
+          </w:p>
+        </w:tc>
+        <w:tc>
+          <w:tcPr>
+            <w:tcW w:type="dxa" w:w="2880"/>
+          </w:tcPr>
+          <w:p>
+            <w:r>
+              <w:t>Generated SSH key, added to GitHub, switched remote to SSH</w:t>
             </w:r>
           </w:p>
         </w:tc>
@@ -9219,27 +9296,27 @@
           </w:tcPr>
           <w:p>
             <w:r>
-              <w:t>15</w:t>
-            </w:r>
-          </w:p>
-        </w:tc>
-        <w:tc>
-          <w:tcPr>
-            <w:tcW w:type="dxa" w:w="2880"/>
-          </w:tcPr>
-          <w:p>
-            <w:r>
-              <w:t>Built the Streamlit dashboard</w:t>
-            </w:r>
-          </w:p>
-        </w:tc>
-        <w:tc>
-          <w:tcPr>
-            <w:tcW w:type="dxa" w:w="2880"/>
-          </w:tcPr>
-          <w:p>
-            <w:r>
-              <w:t>4-tab app with Today, Positions, Performance, Scan Log</w:t>
+              <w:t>12</w:t>
+            </w:r>
+          </w:p>
+        </w:tc>
+        <w:tc>
+          <w:tcPr>
+            <w:tcW w:type="dxa" w:w="2880"/>
+          </w:tcPr>
+          <w:p>
+            <w:r>
+              <w:t>Set up Supabase</w:t>
+            </w:r>
+          </w:p>
+        </w:tc>
+        <w:tc>
+          <w:tcPr>
+            <w:tcW w:type="dxa" w:w="2880"/>
+          </w:tcPr>
+          <w:p>
+            <w:r>
+              <w:t>Created project, ran schema.sql, obtained URL and service role key</w:t>
             </w:r>
           </w:p>
         </w:tc>
@@ -9251,27 +9328,27 @@
           </w:tcPr>
           <w:p>
             <w:r>
-              <w:t>16</w:t>
-            </w:r>
-          </w:p>
-        </w:tc>
-        <w:tc>
-          <w:tcPr>
-            <w:tcW w:type="dxa" w:w="2880"/>
-          </w:tcPr>
-          <w:p>
-            <w:r>
-              <w:t>Deployed to Streamlit Cloud</w:t>
-            </w:r>
-          </w:p>
-        </w:tc>
-        <w:tc>
-          <w:tcPr>
-            <w:tcW w:type="dxa" w:w="2880"/>
-          </w:tcPr>
-          <w:p>
-            <w:r>
-              <w:t>Connected repo, set secrets in TOML format, got public URL</w:t>
+              <w:t>13</w:t>
+            </w:r>
+          </w:p>
+        </w:tc>
+        <w:tc>
+          <w:tcPr>
+            <w:tcW w:type="dxa" w:w="2880"/>
+          </w:tcPr>
+          <w:p>
+            <w:r>
+              <w:t>Set GitHub Secrets</w:t>
+            </w:r>
+          </w:p>
+        </w:tc>
+        <w:tc>
+          <w:tcPr>
+            <w:tcW w:type="dxa" w:w="2880"/>
+          </w:tcPr>
+          <w:p>
+            <w:r>
+              <w:t>Added API keys to repo secrets for runtime injection</w:t>
             </w:r>
           </w:p>
         </w:tc>
@@ -9283,27 +9360,27 @@
           </w:tcPr>
           <w:p>
             <w:r>
-              <w:t>17</w:t>
-            </w:r>
-          </w:p>
-        </w:tc>
-        <w:tc>
-          <w:tcPr>
-            <w:tcW w:type="dxa" w:w="2880"/>
-          </w:tcPr>
-          <w:p>
-            <w:r>
-              <w:t>Added password protection</w:t>
-            </w:r>
-          </w:p>
-        </w:tc>
-        <w:tc>
-          <w:tcPr>
-            <w:tcW w:type="dxa" w:w="2880"/>
-          </w:tcPr>
-          <w:p>
-            <w:r>
-              <w:t>Login screen added — only authorized users can view data</w:t>
+              <w:t>14</w:t>
+            </w:r>
+          </w:p>
+        </w:tc>
+        <w:tc>
+          <w:tcPr>
+            <w:tcW w:type="dxa" w:w="2880"/>
+          </w:tcPr>
+          <w:p>
+            <w:r>
+              <w:t>End-to-end test</w:t>
+            </w:r>
+          </w:p>
+        </w:tc>
+        <w:tc>
+          <w:tcPr>
+            <w:tcW w:type="dxa" w:w="2880"/>
+          </w:tcPr>
+          <w:p>
+            <w:r>
+              <w:t>Manual premarket run via GitHub Actions — confirmed full pipeline working</w:t>
             </w:r>
           </w:p>
         </w:tc>
@@ -9315,27 +9392,27 @@
           </w:tcPr>
           <w:p>
             <w:r>
-              <w:t>18</w:t>
-            </w:r>
-          </w:p>
-        </w:tc>
-        <w:tc>
-          <w:tcPr>
-            <w:tcW w:type="dxa" w:w="2880"/>
-          </w:tcPr>
-          <w:p>
-            <w:r>
-              <w:t>Built backtest.py</w:t>
-            </w:r>
-          </w:p>
-        </w:tc>
-        <w:tc>
-          <w:tcPr>
-            <w:tcW w:type="dxa" w:w="2880"/>
-          </w:tcPr>
-          <w:p>
-            <w:r>
-              <w:t>30-day historical replay with real yfinance data, no Claude API</w:t>
+              <w:t>15</w:t>
+            </w:r>
+          </w:p>
+        </w:tc>
+        <w:tc>
+          <w:tcPr>
+            <w:tcW w:type="dxa" w:w="2880"/>
+          </w:tcPr>
+          <w:p>
+            <w:r>
+              <w:t>Built the Streamlit dashboard</w:t>
+            </w:r>
+          </w:p>
+        </w:tc>
+        <w:tc>
+          <w:tcPr>
+            <w:tcW w:type="dxa" w:w="2880"/>
+          </w:tcPr>
+          <w:p>
+            <w:r>
+              <w:t>4-tab app with Today, Positions, Performance, Scan Log</w:t>
             </w:r>
           </w:p>
         </w:tc>
@@ -9347,27 +9424,27 @@
           </w:tcPr>
           <w:p>
             <w:r>
-              <w:t>19</w:t>
-            </w:r>
-          </w:p>
-        </w:tc>
-        <w:tc>
-          <w:tcPr>
-            <w:tcW w:type="dxa" w:w="2880"/>
-          </w:tcPr>
-          <w:p>
-            <w:r>
-              <w:t>Expanded universe to 430+ tickers</w:t>
-            </w:r>
-          </w:p>
-        </w:tc>
-        <w:tc>
-          <w:tcPr>
-            <w:tcW w:type="dxa" w:w="2880"/>
-          </w:tcPr>
-          <w:p>
-            <w:r>
-              <w:t>Removed drags based on backtest, added momentum names</w:t>
+              <w:t>16</w:t>
+            </w:r>
+          </w:p>
+        </w:tc>
+        <w:tc>
+          <w:tcPr>
+            <w:tcW w:type="dxa" w:w="2880"/>
+          </w:tcPr>
+          <w:p>
+            <w:r>
+              <w:t>Deployed to Streamlit Cloud</w:t>
+            </w:r>
+          </w:p>
+        </w:tc>
+        <w:tc>
+          <w:tcPr>
+            <w:tcW w:type="dxa" w:w="2880"/>
+          </w:tcPr>
+          <w:p>
+            <w:r>
+              <w:t>Connected repo, set secrets in TOML format, got public URL</w:t>
             </w:r>
           </w:p>
         </w:tc>
@@ -9379,27 +9456,27 @@
           </w:tcPr>
           <w:p>
             <w:r>
-              <w:t>20</w:t>
-            </w:r>
-          </w:p>
-        </w:tc>
-        <w:tc>
-          <w:tcPr>
-            <w:tcW w:type="dxa" w:w="2880"/>
-          </w:tcPr>
-          <w:p>
-            <w:r>
-              <w:t>Tuned to 3% target, 15 positions, 3:1 R:R</w:t>
-            </w:r>
-          </w:p>
-        </w:tc>
-        <w:tc>
-          <w:tcPr>
-            <w:tcW w:type="dxa" w:w="2880"/>
-          </w:tcPr>
-          <w:p>
-            <w:r>
-              <w:t>Backtest showed $750/day avg at B grade (93% win days)</w:t>
+              <w:t>17</w:t>
+            </w:r>
+          </w:p>
+        </w:tc>
+        <w:tc>
+          <w:tcPr>
+            <w:tcW w:type="dxa" w:w="2880"/>
+          </w:tcPr>
+          <w:p>
+            <w:r>
+              <w:t>Added password protection</w:t>
+            </w:r>
+          </w:p>
+        </w:tc>
+        <w:tc>
+          <w:tcPr>
+            <w:tcW w:type="dxa" w:w="2880"/>
+          </w:tcPr>
+          <w:p>
+            <w:r>
+              <w:t>Login screen added — only authorized users can view data</w:t>
             </w:r>
           </w:p>
         </w:tc>
@@ -9411,27 +9488,27 @@
           </w:tcPr>
           <w:p>
             <w:r>
-              <w:t>21</w:t>
-            </w:r>
-          </w:p>
-        </w:tc>
-        <w:tc>
-          <w:tcPr>
-            <w:tcW w:type="dxa" w:w="2880"/>
-          </w:tcPr>
-          <w:p>
-            <w:r>
-              <w:t>Built eval.py</w:t>
-            </w:r>
-          </w:p>
-        </w:tc>
-        <w:tc>
-          <w:tcPr>
-            <w:tcW w:type="dxa" w:w="2880"/>
-          </w:tcPr>
-          <w:p>
-            <w:r>
-              <w:t>Weekly grading script: A/B/C/D based on P&amp;L, win rate, reward:risk</w:t>
+              <w:t>18</w:t>
+            </w:r>
+          </w:p>
+        </w:tc>
+        <w:tc>
+          <w:tcPr>
+            <w:tcW w:type="dxa" w:w="2880"/>
+          </w:tcPr>
+          <w:p>
+            <w:r>
+              <w:t>Built backtest.py</w:t>
+            </w:r>
+          </w:p>
+        </w:tc>
+        <w:tc>
+          <w:tcPr>
+            <w:tcW w:type="dxa" w:w="2880"/>
+          </w:tcPr>
+          <w:p>
+            <w:r>
+              <w:t>30-day historical replay with real yfinance data, no Claude API</w:t>
             </w:r>
           </w:p>
         </w:tc>
@@ -9443,27 +9520,27 @@
           </w:tcPr>
           <w:p>
             <w:r>
-              <w:t>22</w:t>
-            </w:r>
-          </w:p>
-        </w:tc>
-        <w:tc>
-          <w:tcPr>
-            <w:tcW w:type="dxa" w:w="2880"/>
-          </w:tcPr>
-          <w:p>
-            <w:r>
-              <w:t>Built V2a — Market Context Agent</w:t>
-            </w:r>
-          </w:p>
-        </w:tc>
-        <w:tc>
-          <w:tcPr>
-            <w:tcW w:type="dxa" w:w="2880"/>
-          </w:tcPr>
-          <w:p>
-            <w:r>
-              <w:t>VIX gate + futures signal + international markets</w:t>
+              <w:t>19</w:t>
+            </w:r>
+          </w:p>
+        </w:tc>
+        <w:tc>
+          <w:tcPr>
+            <w:tcW w:type="dxa" w:w="2880"/>
+          </w:tcPr>
+          <w:p>
+            <w:r>
+              <w:t>Expanded universe to 430+ tickers</w:t>
+            </w:r>
+          </w:p>
+        </w:tc>
+        <w:tc>
+          <w:tcPr>
+            <w:tcW w:type="dxa" w:w="2880"/>
+          </w:tcPr>
+          <w:p>
+            <w:r>
+              <w:t>Removed drags based on backtest, added momentum names</w:t>
             </w:r>
           </w:p>
         </w:tc>
@@ -9475,27 +9552,27 @@
           </w:tcPr>
           <w:p>
             <w:r>
-              <w:t>23</w:t>
-            </w:r>
-          </w:p>
-        </w:tc>
-        <w:tc>
-          <w:tcPr>
-            <w:tcW w:type="dxa" w:w="2880"/>
-          </w:tcPr>
-          <w:p>
-            <w:r>
-              <w:t>Built V2b — News Intelligence Agent</w:t>
-            </w:r>
-          </w:p>
-        </w:tc>
-        <w:tc>
-          <w:tcPr>
-            <w:tcW w:type="dxa" w:w="2880"/>
-          </w:tcPr>
-          <w:p>
-            <w:r>
-              <w:t>Earnings blackout + news headlines context for Claude</w:t>
+              <w:t>20</w:t>
+            </w:r>
+          </w:p>
+        </w:tc>
+        <w:tc>
+          <w:tcPr>
+            <w:tcW w:type="dxa" w:w="2880"/>
+          </w:tcPr>
+          <w:p>
+            <w:r>
+              <w:t>Tuned to 3% target, 15 positions, 3:1 R:R</w:t>
+            </w:r>
+          </w:p>
+        </w:tc>
+        <w:tc>
+          <w:tcPr>
+            <w:tcW w:type="dxa" w:w="2880"/>
+          </w:tcPr>
+          <w:p>
+            <w:r>
+              <w:t>Backtest showed $750/day avg at B grade (93% win days)</w:t>
             </w:r>
           </w:p>
         </w:tc>
@@ -9507,27 +9584,27 @@
           </w:tcPr>
           <w:p>
             <w:r>
-              <w:t>24</w:t>
-            </w:r>
-          </w:p>
-        </w:tc>
-        <w:tc>
-          <w:tcPr>
-            <w:tcW w:type="dxa" w:w="2880"/>
-          </w:tcPr>
-          <w:p>
-            <w:r>
-              <w:t>Redesigned dashboard to workflow view</w:t>
-            </w:r>
-          </w:p>
-        </w:tc>
-        <w:tc>
-          <w:tcPr>
-            <w:tcW w:type="dxa" w:w="2880"/>
-          </w:tcPr>
-          <w:p>
-            <w:r>
-              <w:t>Today tab shows all 4 steps: market → scan → plan → positions</w:t>
+              <w:t>21</w:t>
+            </w:r>
+          </w:p>
+        </w:tc>
+        <w:tc>
+          <w:tcPr>
+            <w:tcW w:type="dxa" w:w="2880"/>
+          </w:tcPr>
+          <w:p>
+            <w:r>
+              <w:t>Built eval.py</w:t>
+            </w:r>
+          </w:p>
+        </w:tc>
+        <w:tc>
+          <w:tcPr>
+            <w:tcW w:type="dxa" w:w="2880"/>
+          </w:tcPr>
+          <w:p>
+            <w:r>
+              <w:t>Weekly grading script: A/B/C/D based on P&amp;L, win rate, reward:risk</w:t>
             </w:r>
           </w:p>
         </w:tc>
@@ -9539,27 +9616,27 @@
           </w:tcPr>
           <w:p>
             <w:r>
-              <w:t>25</w:t>
-            </w:r>
-          </w:p>
-        </w:tc>
-        <w:tc>
-          <w:tcPr>
-            <w:tcW w:type="dxa" w:w="2880"/>
-          </w:tcPr>
-          <w:p>
-            <w:r>
-              <w:t>Built V2c — Fear &amp; Greed + economic calendar</w:t>
-            </w:r>
-          </w:p>
-        </w:tc>
-        <w:tc>
-          <w:tcPr>
-            <w:tcW w:type="dxa" w:w="2880"/>
-          </w:tcPr>
-          <w:p>
-            <w:r>
-              <w:t>alternative.me F&amp;G Index + FOMC/CPI/NFP hardcoded dates</w:t>
+              <w:t>22</w:t>
+            </w:r>
+          </w:p>
+        </w:tc>
+        <w:tc>
+          <w:tcPr>
+            <w:tcW w:type="dxa" w:w="2880"/>
+          </w:tcPr>
+          <w:p>
+            <w:r>
+              <w:t>Built V2a — Market Context Agent</w:t>
+            </w:r>
+          </w:p>
+        </w:tc>
+        <w:tc>
+          <w:tcPr>
+            <w:tcW w:type="dxa" w:w="2880"/>
+          </w:tcPr>
+          <w:p>
+            <w:r>
+              <w:t>VIX gate + futures signal + international markets</w:t>
             </w:r>
           </w:p>
         </w:tc>
@@ -9571,27 +9648,27 @@
           </w:tcPr>
           <w:p>
             <w:r>
-              <w:t>26</w:t>
-            </w:r>
-          </w:p>
-        </w:tc>
-        <w:tc>
-          <w:tcPr>
-            <w:tcW w:type="dxa" w:w="2880"/>
-          </w:tcPr>
-          <w:p>
-            <w:r>
-              <w:t>Tuned V2c to confirming signal (v2.3)</w:t>
-            </w:r>
-          </w:p>
-        </w:tc>
-        <w:tc>
-          <w:tcPr>
-            <w:tcW w:type="dxa" w:w="2880"/>
-          </w:tcPr>
-          <w:p>
-            <w:r>
-              <w:t>F&amp;G standalone gate was too aggressive — now requires VIX or futures confirmation</w:t>
+              <w:t>23</w:t>
+            </w:r>
+          </w:p>
+        </w:tc>
+        <w:tc>
+          <w:tcPr>
+            <w:tcW w:type="dxa" w:w="2880"/>
+          </w:tcPr>
+          <w:p>
+            <w:r>
+              <w:t>Built V2b — News Intelligence Agent</w:t>
+            </w:r>
+          </w:p>
+        </w:tc>
+        <w:tc>
+          <w:tcPr>
+            <w:tcW w:type="dxa" w:w="2880"/>
+          </w:tcPr>
+          <w:p>
+            <w:r>
+              <w:t>Earnings blackout + news headlines context for Claude</w:t>
             </w:r>
           </w:p>
         </w:tc>
@@ -9603,27 +9680,27 @@
           </w:tcPr>
           <w:p>
             <w:r>
-              <w:t>27</w:t>
-            </w:r>
-          </w:p>
-        </w:tc>
-        <w:tc>
-          <w:tcPr>
-            <w:tcW w:type="dxa" w:w="2880"/>
-          </w:tcPr>
-          <w:p>
-            <w:r>
-              <w:t>Built V3a — Universe Refresh Agent</w:t>
-            </w:r>
-          </w:p>
-        </w:tc>
-        <w:tc>
-          <w:tcPr>
-            <w:tcW w:type="dxa" w:w="2880"/>
-          </w:tcPr>
-          <w:p>
-            <w:r>
-              <w:t>Weekly S&amp;P500+Nasdaq100 screener; 458 tickers saved to Supabase on first run</w:t>
+              <w:t>24</w:t>
+            </w:r>
+          </w:p>
+        </w:tc>
+        <w:tc>
+          <w:tcPr>
+            <w:tcW w:type="dxa" w:w="2880"/>
+          </w:tcPr>
+          <w:p>
+            <w:r>
+              <w:t>Redesigned dashboard to workflow view</w:t>
+            </w:r>
+          </w:p>
+        </w:tc>
+        <w:tc>
+          <w:tcPr>
+            <w:tcW w:type="dxa" w:w="2880"/>
+          </w:tcPr>
+          <w:p>
+            <w:r>
+              <w:t>Today tab shows all 4 steps: market → scan → plan → positions</w:t>
             </w:r>
           </w:p>
         </w:tc>
@@ -9635,27 +9712,27 @@
           </w:tcPr>
           <w:p>
             <w:r>
-              <w:t>28</w:t>
-            </w:r>
-          </w:p>
-        </w:tc>
-        <w:tc>
-          <w:tcPr>
-            <w:tcW w:type="dxa" w:w="2880"/>
-          </w:tcPr>
-          <w:p>
-            <w:r>
-              <w:t>Added company names to dashboard tables</w:t>
-            </w:r>
-          </w:p>
-        </w:tc>
-        <w:tc>
-          <w:tcPr>
-            <w:tcW w:type="dxa" w:w="2880"/>
-          </w:tcPr>
-          <w:p>
-            <w:r>
-              <w:t>config/company_names.py static dict, company column in all ticker tables</w:t>
+              <w:t>25</w:t>
+            </w:r>
+          </w:p>
+        </w:tc>
+        <w:tc>
+          <w:tcPr>
+            <w:tcW w:type="dxa" w:w="2880"/>
+          </w:tcPr>
+          <w:p>
+            <w:r>
+              <w:t>Built V2c — Fear &amp; Greed + economic calendar</w:t>
+            </w:r>
+          </w:p>
+        </w:tc>
+        <w:tc>
+          <w:tcPr>
+            <w:tcW w:type="dxa" w:w="2880"/>
+          </w:tcPr>
+          <w:p>
+            <w:r>
+              <w:t>alternative.me F&amp;G Index + FOMC/CPI/NFP hardcoded dates</w:t>
             </w:r>
           </w:p>
         </w:tc>
@@ -9667,27 +9744,27 @@
           </w:tcPr>
           <w:p>
             <w:r>
-              <w:t>29</w:t>
-            </w:r>
-          </w:p>
-        </w:tc>
-        <w:tc>
-          <w:tcPr>
-            <w:tcW w:type="dxa" w:w="2880"/>
-          </w:tcPr>
-          <w:p>
-            <w:r>
-              <w:t>Generated documentation and PRD</w:t>
-            </w:r>
-          </w:p>
-        </w:tc>
-        <w:tc>
-          <w:tcPr>
-            <w:tcW w:type="dxa" w:w="2880"/>
-          </w:tcPr>
-          <w:p>
-            <w:r>
-              <w:t>Word documents updated to v3.0</w:t>
+              <w:t>26</w:t>
+            </w:r>
+          </w:p>
+        </w:tc>
+        <w:tc>
+          <w:tcPr>
+            <w:tcW w:type="dxa" w:w="2880"/>
+          </w:tcPr>
+          <w:p>
+            <w:r>
+              <w:t>Tuned V2c to confirming signal (v2.3)</w:t>
+            </w:r>
+          </w:p>
+        </w:tc>
+        <w:tc>
+          <w:tcPr>
+            <w:tcW w:type="dxa" w:w="2880"/>
+          </w:tcPr>
+          <w:p>
+            <w:r>
+              <w:t>F&amp;G standalone gate was too aggressive — now requires VIX or futures confirmation</w:t>
             </w:r>
           </w:p>
         </w:tc>
@@ -9699,27 +9776,27 @@
           </w:tcPr>
           <w:p>
             <w:r>
-              <w:t>30</w:t>
-            </w:r>
-          </w:p>
-        </w:tc>
-        <w:tc>
-          <w:tcPr>
-            <w:tcW w:type="dxa" w:w="2880"/>
-          </w:tcPr>
-          <w:p>
-            <w:r>
-              <w:t>Built V2g — Alpaca broker</w:t>
-            </w:r>
-          </w:p>
-        </w:tc>
-        <w:tc>
-          <w:tcPr>
-            <w:tcW w:type="dxa" w:w="2880"/>
-          </w:tcPr>
-          <w:p>
-            <w:r>
-              <w:t>agents/alpaca_broker.py: bracket orders, position sync, fill price on close</w:t>
+              <w:t>27</w:t>
+            </w:r>
+          </w:p>
+        </w:tc>
+        <w:tc>
+          <w:tcPr>
+            <w:tcW w:type="dxa" w:w="2880"/>
+          </w:tcPr>
+          <w:p>
+            <w:r>
+              <w:t>Built V3a — Universe Refresh Agent</w:t>
+            </w:r>
+          </w:p>
+        </w:tc>
+        <w:tc>
+          <w:tcPr>
+            <w:tcW w:type="dxa" w:w="2880"/>
+          </w:tcPr>
+          <w:p>
+            <w:r>
+              <w:t>Weekly S&amp;P500+Nasdaq100 screener; 458 tickers saved to Supabase on first run</w:t>
             </w:r>
           </w:p>
         </w:tc>
@@ -9731,27 +9808,27 @@
           </w:tcPr>
           <w:p>
             <w:r>
-              <w:t>31</w:t>
-            </w:r>
-          </w:p>
-        </w:tc>
-        <w:tc>
-          <w:tcPr>
-            <w:tcW w:type="dxa" w:w="2880"/>
-          </w:tcPr>
-          <w:p>
-            <w:r>
-              <w:t>Updated portfolio.py with broker abstraction</w:t>
-            </w:r>
-          </w:p>
-        </w:tc>
-        <w:tc>
-          <w:tcPr>
-            <w:tcW w:type="dxa" w:w="2880"/>
-          </w:tcPr>
-          <w:p>
-            <w:r>
-              <w:t>simulation default, alpaca mode with order submission and sync</w:t>
+              <w:t>28</w:t>
+            </w:r>
+          </w:p>
+        </w:tc>
+        <w:tc>
+          <w:tcPr>
+            <w:tcW w:type="dxa" w:w="2880"/>
+          </w:tcPr>
+          <w:p>
+            <w:r>
+              <w:t>Added company names to dashboard tables</w:t>
+            </w:r>
+          </w:p>
+        </w:tc>
+        <w:tc>
+          <w:tcPr>
+            <w:tcW w:type="dxa" w:w="2880"/>
+          </w:tcPr>
+          <w:p>
+            <w:r>
+              <w:t>config/company_names.py static dict, company column in all ticker tables</w:t>
             </w:r>
           </w:p>
         </w:tc>
@@ -9763,27 +9840,27 @@
           </w:tcPr>
           <w:p>
             <w:r>
-              <w:t>32</w:t>
-            </w:r>
-          </w:p>
-        </w:tc>
-        <w:tc>
-          <w:tcPr>
-            <w:tcW w:type="dxa" w:w="2880"/>
-          </w:tcPr>
-          <w:p>
-            <w:r>
-              <w:t>Updated trading.yml with Alpaca secrets and --broker flag</w:t>
-            </w:r>
-          </w:p>
-        </w:tc>
-        <w:tc>
-          <w:tcPr>
-            <w:tcW w:type="dxa" w:w="2880"/>
-          </w:tcPr>
-          <w:p>
-            <w:r>
-              <w:t>default broker=alpaca for scheduled runs; manual dispatch has broker input option</w:t>
+              <w:t>29</w:t>
+            </w:r>
+          </w:p>
+        </w:tc>
+        <w:tc>
+          <w:tcPr>
+            <w:tcW w:type="dxa" w:w="2880"/>
+          </w:tcPr>
+          <w:p>
+            <w:r>
+              <w:t>Generated documentation and PRD</w:t>
+            </w:r>
+          </w:p>
+        </w:tc>
+        <w:tc>
+          <w:tcPr>
+            <w:tcW w:type="dxa" w:w="2880"/>
+          </w:tcPr>
+          <w:p>
+            <w:r>
+              <w:t>Word documents updated to v3.0</w:t>
             </w:r>
           </w:p>
         </w:tc>
@@ -9795,27 +9872,27 @@
           </w:tcPr>
           <w:p>
             <w:r>
-              <w:t>33</w:t>
-            </w:r>
-          </w:p>
-        </w:tc>
-        <w:tc>
-          <w:tcPr>
-            <w:tcW w:type="dxa" w:w="2880"/>
-          </w:tcPr>
-          <w:p>
-            <w:r>
-              <w:t>Fixed risk agent floating point false rejects</w:t>
-            </w:r>
-          </w:p>
-        </w:tc>
-        <w:tc>
-          <w:tcPr>
-            <w:tcW w:type="dxa" w:w="2880"/>
-          </w:tcPr>
-          <w:p>
-            <w:r>
-              <w:t>stop loss and reward:risk comparison precision; 2dp display in rejection messages</w:t>
+              <w:t>30</w:t>
+            </w:r>
+          </w:p>
+        </w:tc>
+        <w:tc>
+          <w:tcPr>
+            <w:tcW w:type="dxa" w:w="2880"/>
+          </w:tcPr>
+          <w:p>
+            <w:r>
+              <w:t>Built V2g — Alpaca broker</w:t>
+            </w:r>
+          </w:p>
+        </w:tc>
+        <w:tc>
+          <w:tcPr>
+            <w:tcW w:type="dxa" w:w="2880"/>
+          </w:tcPr>
+          <w:p>
+            <w:r>
+              <w:t>agents/alpaca_broker.py: bracket orders, position sync, fill price on close</w:t>
             </w:r>
           </w:p>
         </w:tc>
@@ -9827,27 +9904,27 @@
           </w:tcPr>
           <w:p>
             <w:r>
-              <w:t>34</w:t>
-            </w:r>
-          </w:p>
-        </w:tc>
-        <w:tc>
-          <w:tcPr>
-            <w:tcW w:type="dxa" w:w="2880"/>
-          </w:tcPr>
-          <w:p>
-            <w:r>
-              <w:t>Generated v4.0 documentation and architecture diagrams</w:t>
-            </w:r>
-          </w:p>
-        </w:tc>
-        <w:tc>
-          <w:tcPr>
-            <w:tcW w:type="dxa" w:w="2880"/>
-          </w:tcPr>
-          <w:p>
-            <w:r>
-              <w:t>Word docs updated to v4.0; two PNG architecture diagrams embedded</w:t>
+              <w:t>31</w:t>
+            </w:r>
+          </w:p>
+        </w:tc>
+        <w:tc>
+          <w:tcPr>
+            <w:tcW w:type="dxa" w:w="2880"/>
+          </w:tcPr>
+          <w:p>
+            <w:r>
+              <w:t>Updated portfolio.py with broker abstraction</w:t>
+            </w:r>
+          </w:p>
+        </w:tc>
+        <w:tc>
+          <w:tcPr>
+            <w:tcW w:type="dxa" w:w="2880"/>
+          </w:tcPr>
+          <w:p>
+            <w:r>
+              <w:t>simulation default, alpaca mode with order submission and sync</w:t>
             </w:r>
           </w:p>
         </w:tc>
@@ -9859,27 +9936,27 @@
           </w:tcPr>
           <w:p>
             <w:r>
-              <w:t>35</w:t>
-            </w:r>
-          </w:p>
-        </w:tc>
-        <w:tc>
-          <w:tcPr>
-            <w:tcW w:type="dxa" w:w="2880"/>
-          </w:tcPr>
-          <w:p>
-            <w:r>
-              <w:t>Built V2d — Sector correlation guard</w:t>
-            </w:r>
-          </w:p>
-        </w:tc>
-        <w:tc>
-          <w:tcPr>
-            <w:tcW w:type="dxa" w:w="2880"/>
-          </w:tcPr>
-          <w:p>
-            <w:r>
-              <w:t>agents/sector_guard.py: fetches sector via yfinance, caps at 3 per sector, Unknown passes through; MAX_PER_SECTOR=3 in settings.py; step 3.5 in orchestrator; dashboard shows sector-blocked trades</w:t>
+              <w:t>32</w:t>
+            </w:r>
+          </w:p>
+        </w:tc>
+        <w:tc>
+          <w:tcPr>
+            <w:tcW w:type="dxa" w:w="2880"/>
+          </w:tcPr>
+          <w:p>
+            <w:r>
+              <w:t>Updated trading.yml with Alpaca secrets and --broker flag</w:t>
+            </w:r>
+          </w:p>
+        </w:tc>
+        <w:tc>
+          <w:tcPr>
+            <w:tcW w:type="dxa" w:w="2880"/>
+          </w:tcPr>
+          <w:p>
+            <w:r>
+              <w:t>default broker=alpaca for scheduled runs; manual dispatch has broker input option</w:t>
             </w:r>
           </w:p>
         </w:tc>
@@ -9891,27 +9968,27 @@
           </w:tcPr>
           <w:p>
             <w:r>
-              <w:t>36</w:t>
-            </w:r>
-          </w:p>
-        </w:tc>
-        <w:tc>
-          <w:tcPr>
-            <w:tcW w:type="dxa" w:w="2880"/>
-          </w:tcPr>
-          <w:p>
-            <w:r>
-              <w:t>Fixed strategy.py JSON extraction</w:t>
-            </w:r>
-          </w:p>
-        </w:tc>
-        <w:tc>
-          <w:tcPr>
-            <w:tcW w:type="dxa" w:w="2880"/>
-          </w:tcPr>
-          <w:p>
-            <w:r>
-              <w:t>Regex on outermost { } or [ ] — handles markdown fence edge cases that produced empty string on json.loads</w:t>
+              <w:t>33</w:t>
+            </w:r>
+          </w:p>
+        </w:tc>
+        <w:tc>
+          <w:tcPr>
+            <w:tcW w:type="dxa" w:w="2880"/>
+          </w:tcPr>
+          <w:p>
+            <w:r>
+              <w:t>Fixed risk agent floating point false rejects</w:t>
+            </w:r>
+          </w:p>
+        </w:tc>
+        <w:tc>
+          <w:tcPr>
+            <w:tcW w:type="dxa" w:w="2880"/>
+          </w:tcPr>
+          <w:p>
+            <w:r>
+              <w:t>stop loss and reward:risk comparison precision; 2dp display in rejection messages</w:t>
             </w:r>
           </w:p>
         </w:tc>
@@ -9923,27 +10000,27 @@
           </w:tcPr>
           <w:p>
             <w:r>
-              <w:t>37</w:t>
-            </w:r>
-          </w:p>
-        </w:tc>
-        <w:tc>
-          <w:tcPr>
-            <w:tcW w:type="dxa" w:w="2880"/>
-          </w:tcPr>
-          <w:p>
-            <w:r>
-              <w:t>Built V5 guardrails</w:t>
-            </w:r>
-          </w:p>
-        </w:tc>
-        <w:tc>
-          <w:tcPr>
-            <w:tcW w:type="dxa" w:w="2880"/>
-          </w:tcPr>
-          <w:p>
-            <w:r>
-              <w:t>agents/guardrails.py: 6 safety checks — action whitelist, ticker whitelist, duplicate guard, price sanity (±5%), capital check, daily loss limit (-$300)</w:t>
+              <w:t>34</w:t>
+            </w:r>
+          </w:p>
+        </w:tc>
+        <w:tc>
+          <w:tcPr>
+            <w:tcW w:type="dxa" w:w="2880"/>
+          </w:tcPr>
+          <w:p>
+            <w:r>
+              <w:t>Generated v4.0 documentation and architecture diagrams</w:t>
+            </w:r>
+          </w:p>
+        </w:tc>
+        <w:tc>
+          <w:tcPr>
+            <w:tcW w:type="dxa" w:w="2880"/>
+          </w:tcPr>
+          <w:p>
+            <w:r>
+              <w:t>Word docs updated to v4.0; two PNG architecture diagrams embedded</w:t>
             </w:r>
           </w:p>
         </w:tc>
@@ -9955,27 +10032,27 @@
           </w:tcPr>
           <w:p>
             <w:r>
-              <w:t>38</w:t>
-            </w:r>
-          </w:p>
-        </w:tc>
-        <w:tc>
-          <w:tcPr>
-            <w:tcW w:type="dxa" w:w="2880"/>
-          </w:tcPr>
-          <w:p>
-            <w:r>
-              <w:t>Added concurrent run lock</w:t>
-            </w:r>
-          </w:p>
-        </w:tc>
-        <w:tc>
-          <w:tcPr>
-            <w:tcW w:type="dxa" w:w="2880"/>
-          </w:tcPr>
-          <w:p>
-            <w:r>
-              <w:t>orchestrator.py checks for existing premarket scan_results at startup — exits immediately if already ran today, preventing duplicate positions from overlapping GitHub Actions runs</w:t>
+              <w:t>35</w:t>
+            </w:r>
+          </w:p>
+        </w:tc>
+        <w:tc>
+          <w:tcPr>
+            <w:tcW w:type="dxa" w:w="2880"/>
+          </w:tcPr>
+          <w:p>
+            <w:r>
+              <w:t>Built V2d — Sector correlation guard</w:t>
+            </w:r>
+          </w:p>
+        </w:tc>
+        <w:tc>
+          <w:tcPr>
+            <w:tcW w:type="dxa" w:w="2880"/>
+          </w:tcPr>
+          <w:p>
+            <w:r>
+              <w:t>agents/sector_guard.py: fetches sector via yfinance, caps at 3 per sector, Unknown passes through; MAX_PER_SECTOR=3 in settings.py; step 3.5 in orchestrator; dashboard shows sector-blocked trades</w:t>
             </w:r>
           </w:p>
         </w:tc>
@@ -9987,27 +10064,27 @@
           </w:tcPr>
           <w:p>
             <w:r>
-              <w:t>39</w:t>
-            </w:r>
-          </w:p>
-        </w:tc>
-        <w:tc>
-          <w:tcPr>
-            <w:tcW w:type="dxa" w:w="2880"/>
-          </w:tcPr>
-          <w:p>
-            <w:r>
-              <w:t>EOD close retry for Alpaca</w:t>
-            </w:r>
-          </w:p>
-        </w:tc>
-        <w:tc>
-          <w:tcPr>
-            <w:tcW w:type="dxa" w:w="2880"/>
-          </w:tcPr>
-          <w:p>
-            <w:r>
-              <w:t>portfolio.py close_all_positions(): retries Alpaca close once after 2s on failure; warns loudly if still failing</w:t>
+              <w:t>36</w:t>
+            </w:r>
+          </w:p>
+        </w:tc>
+        <w:tc>
+          <w:tcPr>
+            <w:tcW w:type="dxa" w:w="2880"/>
+          </w:tcPr>
+          <w:p>
+            <w:r>
+              <w:t>Fixed strategy.py JSON extraction</w:t>
+            </w:r>
+          </w:p>
+        </w:tc>
+        <w:tc>
+          <w:tcPr>
+            <w:tcW w:type="dxa" w:w="2880"/>
+          </w:tcPr>
+          <w:p>
+            <w:r>
+              <w:t>Regex on outermost { } or [ ] — handles markdown fence edge cases that produced empty string on json.loads</w:t>
             </w:r>
           </w:p>
         </w:tc>
@@ -10019,27 +10096,27 @@
           </w:tcPr>
           <w:p>
             <w:r>
-              <w:t>40</w:t>
-            </w:r>
-          </w:p>
-        </w:tc>
-        <w:tc>
-          <w:tcPr>
-            <w:tcW w:type="dxa" w:w="2880"/>
-          </w:tcPr>
-          <w:p>
-            <w:r>
-              <w:t>Fixed sector_blocked/guardrail_blocked persistence</w:t>
-            </w:r>
-          </w:p>
-        </w:tc>
-        <w:tc>
-          <w:tcPr>
-            <w:tcW w:type="dxa" w:w="2880"/>
-          </w:tcPr>
-          <w:p>
-            <w:r>
-              <w:t>scan_results JSONB updated with actual values after both sector guard and guardrails (previously always stored as [])</w:t>
+              <w:t>37</w:t>
+            </w:r>
+          </w:p>
+        </w:tc>
+        <w:tc>
+          <w:tcPr>
+            <w:tcW w:type="dxa" w:w="2880"/>
+          </w:tcPr>
+          <w:p>
+            <w:r>
+              <w:t>Built V5 guardrails</w:t>
+            </w:r>
+          </w:p>
+        </w:tc>
+        <w:tc>
+          <w:tcPr>
+            <w:tcW w:type="dxa" w:w="2880"/>
+          </w:tcPr>
+          <w:p>
+            <w:r>
+              <w:t>agents/guardrails.py: 6 safety checks — action whitelist, ticker whitelist, duplicate guard, price sanity (±5%), capital check, daily loss limit (-$300)</w:t>
             </w:r>
           </w:p>
         </w:tc>
@@ -10051,27 +10128,27 @@
           </w:tcPr>
           <w:p>
             <w:r>
-              <w:t>41</w:t>
-            </w:r>
-          </w:p>
-        </w:tc>
-        <w:tc>
-          <w:tcPr>
-            <w:tcW w:type="dxa" w:w="2880"/>
-          </w:tcPr>
-          <w:p>
-            <w:r>
-              <w:t>Updated docs to v5.0</w:t>
-            </w:r>
-          </w:p>
-        </w:tc>
-        <w:tc>
-          <w:tcPr>
-            <w:tcW w:type="dxa" w:w="2880"/>
-          </w:tcPr>
-          <w:p>
-            <w:r>
-              <w:t>Trading_Agent_Documentation.docx and Trading_Agent_PRD.docx regenerated with V5 guardrails</w:t>
+              <w:t>38</w:t>
+            </w:r>
+          </w:p>
+        </w:tc>
+        <w:tc>
+          <w:tcPr>
+            <w:tcW w:type="dxa" w:w="2880"/>
+          </w:tcPr>
+          <w:p>
+            <w:r>
+              <w:t>Added concurrent run lock</w:t>
+            </w:r>
+          </w:p>
+        </w:tc>
+        <w:tc>
+          <w:tcPr>
+            <w:tcW w:type="dxa" w:w="2880"/>
+          </w:tcPr>
+          <w:p>
+            <w:r>
+              <w:t>orchestrator.py checks for existing premarket scan_results at startup — exits immediately if already ran today, preventing duplicate positions from overlapping GitHub Actions runs</w:t>
             </w:r>
           </w:p>
         </w:tc>
@@ -10083,27 +10160,27 @@
           </w:tcPr>
           <w:p>
             <w:r>
-              <w:t>42</w:t>
-            </w:r>
-          </w:p>
-        </w:tc>
-        <w:tc>
-          <w:tcPr>
-            <w:tcW w:type="dxa" w:w="2880"/>
-          </w:tcPr>
-          <w:p>
-            <w:r>
-              <w:t>Redesigned Summary tab</w:t>
-            </w:r>
-          </w:p>
-        </w:tc>
-        <w:tc>
-          <w:tcPr>
-            <w:tcW w:type="dxa" w:w="2880"/>
-          </w:tcPr>
-          <w:p>
-            <w:r>
-              <w:t>Replaced Trades by Sector with three sections: In Flight (live position cards), Today's Plan (deduped trade table with status labels), Trade Heatmap (Plotly Treemap — green/red by P&amp;L, sized by position size)</w:t>
+              <w:t>39</w:t>
+            </w:r>
+          </w:p>
+        </w:tc>
+        <w:tc>
+          <w:tcPr>
+            <w:tcW w:type="dxa" w:w="2880"/>
+          </w:tcPr>
+          <w:p>
+            <w:r>
+              <w:t>EOD close retry for Alpaca</w:t>
+            </w:r>
+          </w:p>
+        </w:tc>
+        <w:tc>
+          <w:tcPr>
+            <w:tcW w:type="dxa" w:w="2880"/>
+          </w:tcPr>
+          <w:p>
+            <w:r>
+              <w:t>portfolio.py close_all_positions(): retries Alpaca close once after 2s on failure; warns loudly if still failing</w:t>
             </w:r>
           </w:p>
         </w:tc>
@@ -10115,27 +10192,27 @@
           </w:tcPr>
           <w:p>
             <w:r>
-              <w:t>43</w:t>
-            </w:r>
-          </w:p>
-        </w:tc>
-        <w:tc>
-          <w:tcPr>
-            <w:tcW w:type="dxa" w:w="2880"/>
-          </w:tcPr>
-          <w:p>
-            <w:r>
-              <w:t>Added automated EOD eval</w:t>
-            </w:r>
-          </w:p>
-        </w:tc>
-        <w:tc>
-          <w:tcPr>
-            <w:tcW w:type="dxa" w:w="2880"/>
-          </w:tcPr>
-          <w:p>
-            <w:r>
-              <w:t>eval.py --write flag saves score/grade/recommendations to Supabase (scan_results, scan_type=eval); EOD GitHub Actions job runs eval.py --days 30 --write automatically after every EOD close</w:t>
+              <w:t>40</w:t>
+            </w:r>
+          </w:p>
+        </w:tc>
+        <w:tc>
+          <w:tcPr>
+            <w:tcW w:type="dxa" w:w="2880"/>
+          </w:tcPr>
+          <w:p>
+            <w:r>
+              <w:t>Fixed sector_blocked/guardrail_blocked persistence</w:t>
+            </w:r>
+          </w:p>
+        </w:tc>
+        <w:tc>
+          <w:tcPr>
+            <w:tcW w:type="dxa" w:w="2880"/>
+          </w:tcPr>
+          <w:p>
+            <w:r>
+              <w:t>scan_results JSONB updated with actual values after both sector guard and guardrails (previously always stored as [])</w:t>
             </w:r>
           </w:p>
         </w:tc>
@@ -10147,27 +10224,27 @@
           </w:tcPr>
           <w:p>
             <w:r>
-              <w:t>44</w:t>
-            </w:r>
-          </w:p>
-        </w:tc>
-        <w:tc>
-          <w:tcPr>
-            <w:tcW w:type="dxa" w:w="2880"/>
-          </w:tcPr>
-          <w:p>
-            <w:r>
-              <w:t>Added Agent Scorecard to Performance tab</w:t>
-            </w:r>
-          </w:p>
-        </w:tc>
-        <w:tc>
-          <w:tcPr>
-            <w:tcW w:type="dxa" w:w="2880"/>
-          </w:tcPr>
-          <w:p>
-            <w:r>
-              <w:t>Reads latest eval from Supabase and displays Score, Grade, Avg Daily P&amp;L, Win Days, Trade Win Rate, Actual R:R, close reason breakdown, best/worst trade, and recommendations — updated every trading day without manual action</w:t>
+              <w:t>41</w:t>
+            </w:r>
+          </w:p>
+        </w:tc>
+        <w:tc>
+          <w:tcPr>
+            <w:tcW w:type="dxa" w:w="2880"/>
+          </w:tcPr>
+          <w:p>
+            <w:r>
+              <w:t>Updated docs to v5.0</w:t>
+            </w:r>
+          </w:p>
+        </w:tc>
+        <w:tc>
+          <w:tcPr>
+            <w:tcW w:type="dxa" w:w="2880"/>
+          </w:tcPr>
+          <w:p>
+            <w:r>
+              <w:t>Trading_Agent_Documentation.docx and Trading_Agent_PRD.docx regenerated with V5 guardrails</w:t>
             </w:r>
           </w:p>
         </w:tc>
@@ -10179,27 +10256,27 @@
           </w:tcPr>
           <w:p>
             <w:r>
-              <w:t>45</w:t>
-            </w:r>
-          </w:p>
-        </w:tc>
-        <w:tc>
-          <w:tcPr>
-            <w:tcW w:type="dxa" w:w="2880"/>
-          </w:tcPr>
-          <w:p>
-            <w:r>
-              <w:t>Added Alpaca position reconciliation</w:t>
-            </w:r>
-          </w:p>
-        </w:tc>
-        <w:tc>
-          <w:tcPr>
-            <w:tcW w:type="dxa" w:w="2880"/>
-          </w:tcPr>
-          <w:p>
-            <w:r>
-              <w:t>intraday.py _reconcile_with_alpaca() runs first on every 30-min cycle; any Supabase OPEN position not in Alpaca is marked UNFILLED (P&amp;L=0) — catches the rare case where a bracket order was submitted but the entry leg never filled; dashboard and eval exclude UNFILLED alongside CLEANUP</w:t>
+              <w:t>42</w:t>
+            </w:r>
+          </w:p>
+        </w:tc>
+        <w:tc>
+          <w:tcPr>
+            <w:tcW w:type="dxa" w:w="2880"/>
+          </w:tcPr>
+          <w:p>
+            <w:r>
+              <w:t>Redesigned Summary tab</w:t>
+            </w:r>
+          </w:p>
+        </w:tc>
+        <w:tc>
+          <w:tcPr>
+            <w:tcW w:type="dxa" w:w="2880"/>
+          </w:tcPr>
+          <w:p>
+            <w:r>
+              <w:t>Replaced Trades by Sector with three sections: In Flight (live position cards), Today's Plan (deduped trade table with status labels), Trade Heatmap (Plotly Treemap — green/red by P&amp;L, sized by position size)</w:t>
             </w:r>
           </w:p>
         </w:tc>
@@ -10211,27 +10288,27 @@
           </w:tcPr>
           <w:p>
             <w:r>
-              <w:t>46</w:t>
-            </w:r>
-          </w:p>
-        </w:tc>
-        <w:tc>
-          <w:tcPr>
-            <w:tcW w:type="dxa" w:w="2880"/>
-          </w:tcPr>
-          <w:p>
-            <w:r>
-              <w:t>Updated docs to v5.1</w:t>
-            </w:r>
-          </w:p>
-        </w:tc>
-        <w:tc>
-          <w:tcPr>
-            <w:tcW w:type="dxa" w:w="2880"/>
-          </w:tcPr>
-          <w:p>
-            <w:r>
-              <w:t>Trading_Agent_Documentation.docx and Trading_Agent_PRD.docx regenerated with Summary redesign, eval automation, Agent Scorecard, and Alpaca reconciliation</w:t>
+              <w:t>43</w:t>
+            </w:r>
+          </w:p>
+        </w:tc>
+        <w:tc>
+          <w:tcPr>
+            <w:tcW w:type="dxa" w:w="2880"/>
+          </w:tcPr>
+          <w:p>
+            <w:r>
+              <w:t>Added automated EOD eval</w:t>
+            </w:r>
+          </w:p>
+        </w:tc>
+        <w:tc>
+          <w:tcPr>
+            <w:tcW w:type="dxa" w:w="2880"/>
+          </w:tcPr>
+          <w:p>
+            <w:r>
+              <w:t>eval.py --write flag saves score/grade/recommendations to Supabase (scan_results, scan_type=eval); EOD GitHub Actions job runs eval.py --days 30 --write automatically after every EOD close</w:t>
             </w:r>
           </w:p>
         </w:tc>
@@ -10243,6 +10320,102 @@
           </w:tcPr>
           <w:p>
             <w:r>
+              <w:t>44</w:t>
+            </w:r>
+          </w:p>
+        </w:tc>
+        <w:tc>
+          <w:tcPr>
+            <w:tcW w:type="dxa" w:w="2880"/>
+          </w:tcPr>
+          <w:p>
+            <w:r>
+              <w:t>Added Agent Scorecard to Performance tab</w:t>
+            </w:r>
+          </w:p>
+        </w:tc>
+        <w:tc>
+          <w:tcPr>
+            <w:tcW w:type="dxa" w:w="2880"/>
+          </w:tcPr>
+          <w:p>
+            <w:r>
+              <w:t>Reads latest eval from Supabase and displays Score, Grade, Avg Daily P&amp;L, Win Days, Trade Win Rate, Actual R:R, close reason breakdown, best/worst trade, and recommendations — updated every trading day without manual action</w:t>
+            </w:r>
+          </w:p>
+        </w:tc>
+      </w:tr>
+      <w:tr>
+        <w:tc>
+          <w:tcPr>
+            <w:tcW w:type="dxa" w:w="2880"/>
+          </w:tcPr>
+          <w:p>
+            <w:r>
+              <w:t>45</w:t>
+            </w:r>
+          </w:p>
+        </w:tc>
+        <w:tc>
+          <w:tcPr>
+            <w:tcW w:type="dxa" w:w="2880"/>
+          </w:tcPr>
+          <w:p>
+            <w:r>
+              <w:t>Added Alpaca position reconciliation</w:t>
+            </w:r>
+          </w:p>
+        </w:tc>
+        <w:tc>
+          <w:tcPr>
+            <w:tcW w:type="dxa" w:w="2880"/>
+          </w:tcPr>
+          <w:p>
+            <w:r>
+              <w:t>intraday.py _reconcile_with_alpaca() runs first on every 30-min cycle; any Supabase OPEN position not in Alpaca is marked UNFILLED (P&amp;L=0) — catches the rare case where a bracket order was submitted but the entry leg never filled; dashboard and eval exclude UNFILLED alongside CLEANUP</w:t>
+            </w:r>
+          </w:p>
+        </w:tc>
+      </w:tr>
+      <w:tr>
+        <w:tc>
+          <w:tcPr>
+            <w:tcW w:type="dxa" w:w="2880"/>
+          </w:tcPr>
+          <w:p>
+            <w:r>
+              <w:t>46</w:t>
+            </w:r>
+          </w:p>
+        </w:tc>
+        <w:tc>
+          <w:tcPr>
+            <w:tcW w:type="dxa" w:w="2880"/>
+          </w:tcPr>
+          <w:p>
+            <w:r>
+              <w:t>Updated docs to v5.1</w:t>
+            </w:r>
+          </w:p>
+        </w:tc>
+        <w:tc>
+          <w:tcPr>
+            <w:tcW w:type="dxa" w:w="2880"/>
+          </w:tcPr>
+          <w:p>
+            <w:r>
+              <w:t>Trading_Agent_Documentation.docx and Trading_Agent_PRD.docx regenerated with Summary redesign, eval automation, Agent Scorecard, and Alpaca reconciliation</w:t>
+            </w:r>
+          </w:p>
+        </w:tc>
+      </w:tr>
+      <w:tr>
+        <w:tc>
+          <w:tcPr>
+            <w:tcW w:type="dxa" w:w="2880"/>
+          </w:tcPr>
+          <w:p>
+            <w:r>
               <w:t>47</w:t>
             </w:r>
           </w:p>
@@ -10264,6 +10437,102 @@
           <w:p>
             <w:r>
               <w:t>guardrails.py: committed_capital tracked across full approved batch for both Alpaca and simulation — rejects any trade that would push total deployed capital past buying_power (no margin); intraday.py: LOCK_IN trigger closes all open positions when realized P&amp;L ≥ $716; dashboard shows LOCK_IN as "🎯 Day Locked"; settings.py: DAILY_LOCK_IN_TARGET = 716; docs updated to v5.2</w:t>
+            </w:r>
+          </w:p>
+        </w:tc>
+      </w:tr>
+      <w:tr>
+        <w:tc>
+          <w:tcPr>
+            <w:tcW w:type="dxa" w:w="2880"/>
+          </w:tcPr>
+          <w:p>
+            <w:r>
+              <w:t>48</w:t>
+            </w:r>
+          </w:p>
+        </w:tc>
+        <w:tc>
+          <w:tcPr>
+            <w:tcW w:type="dxa" w:w="2880"/>
+          </w:tcPr>
+          <w:p>
+            <w:r>
+              <w:t>Added GitHub Actions retry logic</w:t>
+            </w:r>
+          </w:p>
+        </w:tc>
+        <w:tc>
+          <w:tcPr>
+            <w:tcW w:type="dxa" w:w="2880"/>
+          </w:tcPr>
+          <w:p>
+            <w:r>
+              <w:t>trading.yml: Run agent step retries up to 3 times with 60s backoff before failing — handles transient yfinance/Alpaca/API failures without manual rerun; concurrent run lock ensures retries after partial success exit cleanly</w:t>
+            </w:r>
+          </w:p>
+        </w:tc>
+      </w:tr>
+      <w:tr>
+        <w:tc>
+          <w:tcPr>
+            <w:tcW w:type="dxa" w:w="2880"/>
+          </w:tcPr>
+          <w:p>
+            <w:r>
+              <w:t>49</w:t>
+            </w:r>
+          </w:p>
+        </w:tc>
+        <w:tc>
+          <w:tcPr>
+            <w:tcW w:type="dxa" w:w="2880"/>
+          </w:tcPr>
+          <w:p>
+            <w:r>
+              <w:t>Trailing stops + confidence-weighted position sizing</w:t>
+            </w:r>
+          </w:p>
+        </w:tc>
+        <w:tc>
+          <w:tcPr>
+            <w:tcW w:type="dxa" w:w="2880"/>
+          </w:tcPr>
+          <w:p>
+            <w:r>
+              <w:t>portfolio.py: high_watermark per position updated each intraday cycle; eff_stop = max(original_stop, peak × 0.99) ratchets as stock rises; Alpaca mode: close_position() fires when trail triggers (bracket auto-cancels); risk.py: _apply_confidence_sizing() maps HIGH→$7K, MEDIUM→$6K, LOW→$5K before validation; strategy.py prompt updated; settings.py: TRAIL_PCT=0.01, POSITION_SIZE_BY_CONFIDENCE; schema.sql: high_watermark column (ALTER TABLE run in Supabase)</w:t>
+            </w:r>
+          </w:p>
+        </w:tc>
+      </w:tr>
+      <w:tr>
+        <w:tc>
+          <w:tcPr>
+            <w:tcW w:type="dxa" w:w="2880"/>
+          </w:tcPr>
+          <w:p>
+            <w:r>
+              <w:t>50</w:t>
+            </w:r>
+          </w:p>
+        </w:tc>
+        <w:tc>
+          <w:tcPr>
+            <w:tcW w:type="dxa" w:w="2880"/>
+          </w:tcPr>
+          <w:p>
+            <w:r>
+              <w:t>Dashboard trailing stop annotations + docs v5.3</w:t>
+            </w:r>
+          </w:p>
+        </w:tc>
+        <w:tc>
+          <w:tcPr>
+            <w:tcW w:type="dxa" w:w="2880"/>
+          </w:tcPr>
+          <w:p>
+            <w:r>
+              <w:t>fmt_stop() helper shows "Trail $X.XX ↑" on In Flight cards (Summary, Today, Positions tabs) when stop has ratcheted; trade_status() shows "🔶 Trail Stop" for STOP closes with positive P&amp;L vs "🔴 Stop Hit" for losses; docs updated to v5.3</w:t>
             </w:r>
           </w:p>
         </w:tc>

</xml_diff>

<commit_message>
docs: update all documentation and architecture to v5.6
- generate_changelog.py: new living session-by-session changelog document
  (Trading_Agent_Changelog.docx) — covers v5.6, v5.5, v5.4, v5.0–v5.3
  with What/Why/Impact per feature and confidence score per version
- generate_doc.py: v5.5 → v5.6; added version history entries 65–72;
  updated What's Next table with June 1 gate and post-fix sprint
- generate_prd.py: v5.5 → v5.6; added v5.6 feature rows to PRD table
- generate_features.py: added native trailing stop as shipped v5.6 feature
- generate_architecture.py: v5.5 → v5.6 in all diagram titles
- All .docx and .png files regenerated

Co-Authored-By: Claude Sonnet 4.6 <noreply@anthropic.com>
</commit_message>
<xml_diff>
--- a/Trading_Agent_Documentation.docx
+++ b/Trading_Agent_Documentation.docx
@@ -35,7 +35,7 @@
           <w:color w:val="888888"/>
           <w:sz w:val="20"/>
         </w:rPr>
-        <w:t>Amit Garg  ·  May 2026  ·  v5.5  ·  Built with Claude Code + Anthropic API</w:t>
+        <w:t>Amit Garg  ·  May 2026  ·  v5.6  ·  Built with Claude Code + Anthropic API</w:t>
       </w:r>
     </w:p>
     <w:p>
@@ -10000,6 +10000,166 @@
           <w:tcPr>
             <w:tcW w:type="dxa" w:w="2880"/>
           </w:tcPr>
+          <w:p/>
+        </w:tc>
+        <w:tc>
+          <w:tcPr>
+            <w:tcW w:type="dxa" w:w="2880"/>
+          </w:tcPr>
+          <w:p/>
+        </w:tc>
+        <w:tc>
+          <w:tcPr>
+            <w:tcW w:type="dxa" w:w="2880"/>
+          </w:tcPr>
+          <w:p/>
+        </w:tc>
+      </w:tr>
+      <w:tr>
+        <w:tc>
+          <w:tcPr>
+            <w:tcW w:type="dxa" w:w="2880"/>
+          </w:tcPr>
+          <w:p/>
+        </w:tc>
+        <w:tc>
+          <w:tcPr>
+            <w:tcW w:type="dxa" w:w="2880"/>
+          </w:tcPr>
+          <w:p/>
+        </w:tc>
+        <w:tc>
+          <w:tcPr>
+            <w:tcW w:type="dxa" w:w="2880"/>
+          </w:tcPr>
+          <w:p/>
+        </w:tc>
+      </w:tr>
+      <w:tr>
+        <w:tc>
+          <w:tcPr>
+            <w:tcW w:type="dxa" w:w="2880"/>
+          </w:tcPr>
+          <w:p/>
+        </w:tc>
+        <w:tc>
+          <w:tcPr>
+            <w:tcW w:type="dxa" w:w="2880"/>
+          </w:tcPr>
+          <w:p/>
+        </w:tc>
+        <w:tc>
+          <w:tcPr>
+            <w:tcW w:type="dxa" w:w="2880"/>
+          </w:tcPr>
+          <w:p/>
+        </w:tc>
+      </w:tr>
+      <w:tr>
+        <w:tc>
+          <w:tcPr>
+            <w:tcW w:type="dxa" w:w="2880"/>
+          </w:tcPr>
+          <w:p/>
+        </w:tc>
+        <w:tc>
+          <w:tcPr>
+            <w:tcW w:type="dxa" w:w="2880"/>
+          </w:tcPr>
+          <w:p/>
+        </w:tc>
+        <w:tc>
+          <w:tcPr>
+            <w:tcW w:type="dxa" w:w="2880"/>
+          </w:tcPr>
+          <w:p/>
+        </w:tc>
+      </w:tr>
+      <w:tr>
+        <w:tc>
+          <w:tcPr>
+            <w:tcW w:type="dxa" w:w="2880"/>
+          </w:tcPr>
+          <w:p/>
+        </w:tc>
+        <w:tc>
+          <w:tcPr>
+            <w:tcW w:type="dxa" w:w="2880"/>
+          </w:tcPr>
+          <w:p/>
+        </w:tc>
+        <w:tc>
+          <w:tcPr>
+            <w:tcW w:type="dxa" w:w="2880"/>
+          </w:tcPr>
+          <w:p/>
+        </w:tc>
+      </w:tr>
+      <w:tr>
+        <w:tc>
+          <w:tcPr>
+            <w:tcW w:type="dxa" w:w="2880"/>
+          </w:tcPr>
+          <w:p/>
+        </w:tc>
+        <w:tc>
+          <w:tcPr>
+            <w:tcW w:type="dxa" w:w="2880"/>
+          </w:tcPr>
+          <w:p/>
+        </w:tc>
+        <w:tc>
+          <w:tcPr>
+            <w:tcW w:type="dxa" w:w="2880"/>
+          </w:tcPr>
+          <w:p/>
+        </w:tc>
+      </w:tr>
+      <w:tr>
+        <w:tc>
+          <w:tcPr>
+            <w:tcW w:type="dxa" w:w="2880"/>
+          </w:tcPr>
+          <w:p/>
+        </w:tc>
+        <w:tc>
+          <w:tcPr>
+            <w:tcW w:type="dxa" w:w="2880"/>
+          </w:tcPr>
+          <w:p/>
+        </w:tc>
+        <w:tc>
+          <w:tcPr>
+            <w:tcW w:type="dxa" w:w="2880"/>
+          </w:tcPr>
+          <w:p/>
+        </w:tc>
+      </w:tr>
+      <w:tr>
+        <w:tc>
+          <w:tcPr>
+            <w:tcW w:type="dxa" w:w="2880"/>
+          </w:tcPr>
+          <w:p/>
+        </w:tc>
+        <w:tc>
+          <w:tcPr>
+            <w:tcW w:type="dxa" w:w="2880"/>
+          </w:tcPr>
+          <w:p/>
+        </w:tc>
+        <w:tc>
+          <w:tcPr>
+            <w:tcW w:type="dxa" w:w="2880"/>
+          </w:tcPr>
+          <w:p/>
+        </w:tc>
+      </w:tr>
+      <w:tr>
+        <w:tc>
+          <w:tcPr>
+            <w:tcW w:type="dxa" w:w="2880"/>
+          </w:tcPr>
           <w:p>
             <w:r>
               <w:t>1</w:t>
@@ -12039,6 +12199,262 @@
           <w:p>
             <w:r>
               <w:t>Trading_Agent_Documentation.docx, Trading_Agent_PRD.docx, Trading_Agent_Features.docx regenerated; architecture diagrams (high-level + low-level) updated with full 13-step pipeline, ML feedback loop, cron-job.org triggers, interdependencies</w:t>
+            </w:r>
+          </w:p>
+        </w:tc>
+      </w:tr>
+      <w:tr>
+        <w:tc>
+          <w:tcPr>
+            <w:tcW w:type="dxa" w:w="2880"/>
+          </w:tcPr>
+          <w:p>
+            <w:r>
+              <w:t>65</w:t>
+            </w:r>
+          </w:p>
+        </w:tc>
+        <w:tc>
+          <w:tcPr>
+            <w:tcW w:type="dxa" w:w="2880"/>
+          </w:tcPr>
+          <w:p>
+            <w:r>
+              <w:t>Native Alpaca trailing stop (v5.6)</w:t>
+            </w:r>
+          </w:p>
+        </w:tc>
+        <w:tc>
+          <w:tcPr>
+            <w:tcW w:type="dxa" w:w="2880"/>
+          </w:tcPr>
+          <w:p>
+            <w:r>
+              <w:t>USE_NATIVE_TRAILING_STOP feature flag (True); submit_bracket_order() uses StopLossRequest(trail_percent=TRAIL_PCT*100); native_trail_active boolean per position; refresh_positions() skips manual trail check when active; dashboard fmt_stop() shows "Trail 1% ↑ (native)"</w:t>
+            </w:r>
+          </w:p>
+        </w:tc>
+      </w:tr>
+      <w:tr>
+        <w:tc>
+          <w:tcPr>
+            <w:tcW w:type="dxa" w:w="2880"/>
+          </w:tcPr>
+          <w:p>
+            <w:r>
+              <w:t>66</w:t>
+            </w:r>
+          </w:p>
+        </w:tc>
+        <w:tc>
+          <w:tcPr>
+            <w:tcW w:type="dxa" w:w="2880"/>
+          </w:tcPr>
+          <w:p>
+            <w:r>
+              <w:t>Exit mechanism tracking</w:t>
+            </w:r>
+          </w:p>
+        </w:tc>
+        <w:tc>
+          <w:tcPr>
+            <w:tcW w:type="dxa" w:w="2880"/>
+          </w:tcPr>
+          <w:p>
+            <w:r>
+              <w:t>exit_mechanism column added to positions (NATIVE_TRAIL, TARGET, MANUAL_TRAIL, STOP, EOD); all close paths in portfolio.py and alpaca_broker.get_order_fill() populate it; trailing_stop leg type distinguished from fixed stop leg</w:t>
+            </w:r>
+          </w:p>
+        </w:tc>
+      </w:tr>
+      <w:tr>
+        <w:tc>
+          <w:tcPr>
+            <w:tcW w:type="dxa" w:w="2880"/>
+          </w:tcPr>
+          <w:p>
+            <w:r>
+              <w:t>67</w:t>
+            </w:r>
+          </w:p>
+        </w:tc>
+        <w:tc>
+          <w:tcPr>
+            <w:tcW w:type="dxa" w:w="2880"/>
+          </w:tcPr>
+          <w:p>
+            <w:r>
+              <w:t>eval.py — VERDICT summary</w:t>
+            </w:r>
+          </w:p>
+        </w:tc>
+        <w:tc>
+          <w:tcPr>
+            <w:tcW w:type="dxa" w:w="2880"/>
+          </w:tcPr>
+          <w:p>
+            <w:r>
+              <w:t>Plain-language What's working / Watch / Action required section at top of eval output; synthesizes all metrics into a 10-second read with specific actionable calls</w:t>
+            </w:r>
+          </w:p>
+        </w:tc>
+      </w:tr>
+      <w:tr>
+        <w:tc>
+          <w:tcPr>
+            <w:tcW w:type="dxa" w:w="2880"/>
+          </w:tcPr>
+          <w:p>
+            <w:r>
+              <w:t>68</w:t>
+            </w:r>
+          </w:p>
+        </w:tc>
+        <w:tc>
+          <w:tcPr>
+            <w:tcW w:type="dxa" w:w="2880"/>
+          </w:tcPr>
+          <w:p>
+            <w:r>
+              <w:t>eval.py — annotated metrics</w:t>
+            </w:r>
+          </w:p>
+        </w:tc>
+        <w:tc>
+          <w:tcPr>
+            <w:tcW w:type="dxa" w:w="2880"/>
+          </w:tcPr>
+          <w:p>
+            <w:r>
+              <w:t>Inline ✅/⚠️/❌ flags with benchmark targets on every number; grade score broken into P&amp;L (40pts) / win-day (30pts) / win-rate (30pts) components; exit reason distribution with healthy mix interpretation</w:t>
+            </w:r>
+          </w:p>
+        </w:tc>
+      </w:tr>
+      <w:tr>
+        <w:tc>
+          <w:tcPr>
+            <w:tcW w:type="dxa" w:w="2880"/>
+          </w:tcPr>
+          <w:p>
+            <w:r>
+              <w:t>69</w:t>
+            </w:r>
+          </w:p>
+        </w:tc>
+        <w:tc>
+          <w:tcPr>
+            <w:tcW w:type="dxa" w:w="2880"/>
+          </w:tcPr>
+          <w:p>
+            <w:r>
+              <w:t>eval.py — integrity checks</w:t>
+            </w:r>
+          </w:p>
+        </w:tc>
+        <w:tc>
+          <w:tcPr>
+            <w:tcW w:type="dxa" w:w="2880"/>
+          </w:tcPr>
+          <w:p>
+            <w:r>
+              <w:t>UNFILLED rate, orphaned open positions, duplicate ticker detection, missing exit_mechanism count, loss-limit day count, lock-in trigger count — all previously invisible</w:t>
+            </w:r>
+          </w:p>
+        </w:tc>
+      </w:tr>
+      <w:tr>
+        <w:tc>
+          <w:tcPr>
+            <w:tcW w:type="dxa" w:w="2880"/>
+          </w:tcPr>
+          <w:p>
+            <w:r>
+              <w:t>70</w:t>
+            </w:r>
+          </w:p>
+        </w:tc>
+        <w:tc>
+          <w:tcPr>
+            <w:tcW w:type="dxa" w:w="2880"/>
+          </w:tcPr>
+          <w:p>
+            <w:r>
+              <w:t>eval.py — Claude quality checks</w:t>
+            </w:r>
+          </w:p>
+        </w:tc>
+        <w:tc>
+          <w:tcPr>
+            <w:tcW w:type="dxa" w:w="2880"/>
+          </w:tcPr>
+          <w:p>
+            <w:r>
+              <w:t>R:R integrity per planned trade (guardrails don't enforce R:R — Claude can slip &lt;3:1 trades); position size bounds check; confidence cohort table: HIGH/MEDIUM/LOW win rate, avg P&amp;L, total P&amp;L with signal on whether HIGH outperforms LOW</w:t>
+            </w:r>
+          </w:p>
+        </w:tc>
+      </w:tr>
+      <w:tr>
+        <w:tc>
+          <w:tcPr>
+            <w:tcW w:type="dxa" w:w="2880"/>
+          </w:tcPr>
+          <w:p>
+            <w:r>
+              <w:t>71</w:t>
+            </w:r>
+          </w:p>
+        </w:tc>
+        <w:tc>
+          <w:tcPr>
+            <w:tcW w:type="dxa" w:w="2880"/>
+          </w:tcPr>
+          <w:p>
+            <w:r>
+              <w:t>eval.py — trailing stop validation</w:t>
+            </w:r>
+          </w:p>
+        </w:tc>
+        <w:tc>
+          <w:tcPr>
+            <w:tcW w:type="dxa" w:w="2880"/>
+          </w:tcPr>
+          <w:p>
+            <w:r>
+              <w:t>Native vs manual cohort comparison; delta on win rate and avg P&amp;L; explicit confirmation when NATIVE_TRAIL exits are clean with no double-sells; ⏳ flag when no stop exits yet</w:t>
+            </w:r>
+          </w:p>
+        </w:tc>
+      </w:tr>
+      <w:tr>
+        <w:tc>
+          <w:tcPr>
+            <w:tcW w:type="dxa" w:w="2880"/>
+          </w:tcPr>
+          <w:p>
+            <w:r>
+              <w:t>72</w:t>
+            </w:r>
+          </w:p>
+        </w:tc>
+        <w:tc>
+          <w:tcPr>
+            <w:tcW w:type="dxa" w:w="2880"/>
+          </w:tcPr>
+          <w:p>
+            <w:r>
+              <w:t>Updated docs and architecture to v5.6</w:t>
+            </w:r>
+          </w:p>
+        </w:tc>
+        <w:tc>
+          <w:tcPr>
+            <w:tcW w:type="dxa" w:w="2880"/>
+          </w:tcPr>
+          <w:p>
+            <w:r>
+              <w:t>All generate_*.py scripts updated; Trading_Agent_Changelog.docx created as living session-by-session record of what was built, why, and impact</w:t>
             </w:r>
           </w:p>
         </w:tc>
@@ -13777,7 +14193,7 @@
         <w:spacing w:after="120"/>
       </w:pPr>
       <w:r>
-        <w:t>The system is live and running at v5.5. All execution friction fixes and the ML scorer are deployed. Next steps:</w:t>
+        <w:t>The system is live and running at v5.6. Native trailing stop is enabled on paper. 2-week validation gate open (2026-05-18 → 2026-06-01). Next steps:</w:t>
       </w:r>
     </w:p>
     <w:tbl>
@@ -13977,177 +14393,93 @@
           <w:tcPr>
             <w:tcW w:type="dxa" w:w="2880"/>
           </w:tcPr>
-          <w:p/>
-        </w:tc>
-        <w:tc>
-          <w:tcPr>
-            <w:tcW w:type="dxa" w:w="2880"/>
-          </w:tcPr>
-          <w:p/>
-        </w:tc>
-        <w:tc>
-          <w:tcPr>
-            <w:tcW w:type="dxa" w:w="2880"/>
-          </w:tcPr>
-          <w:p/>
-        </w:tc>
-      </w:tr>
-      <w:tr>
-        <w:tc>
-          <w:tcPr>
-            <w:tcW w:type="dxa" w:w="2880"/>
-          </w:tcPr>
-          <w:p>
-            <w:r>
-              <w:t>Native trailing stop (OTO-OCO)</w:t>
-            </w:r>
-          </w:p>
-        </w:tc>
-        <w:tc>
-          <w:tcPr>
-            <w:tcW w:type="dxa" w:w="2880"/>
-          </w:tcPr>
-          <w:p>
-            <w:r>
-              <w:t>Replace 15-min polling with Alpaca native trail_percent — P0 before real money deployment; needs feature flag + unit tests + 2-week A/B paper test</w:t>
-            </w:r>
-          </w:p>
-        </w:tc>
-        <w:tc>
-          <w:tcPr>
-            <w:tcW w:type="dxa" w:w="2880"/>
-          </w:tcPr>
-          <w:p>
-            <w:r>
-              <w:t>P0 — pre-real-money</w:t>
-            </w:r>
-          </w:p>
-        </w:tc>
-      </w:tr>
-      <w:tr>
-        <w:tc>
-          <w:tcPr>
-            <w:tcW w:type="dxa" w:w="2880"/>
-          </w:tcPr>
-          <w:p>
-            <w:r>
-              <w:t>2-week paper validation</w:t>
-            </w:r>
-          </w:p>
-        </w:tc>
-        <w:tc>
-          <w:tcPr>
-            <w:tcW w:type="dxa" w:w="2880"/>
-          </w:tcPr>
-          <w:p>
-            <w:r>
-              <w:t>Validate all friction fixes live over 2 weeks; rerun backtest; target 6+/10 confidence before real capital</w:t>
-            </w:r>
-          </w:p>
-        </w:tc>
-        <w:tc>
-          <w:tcPr>
-            <w:tcW w:type="dxa" w:w="2880"/>
-          </w:tcPr>
-          <w:p>
-            <w:r>
-              <w:t>P0 — pre-real-money</w:t>
-            </w:r>
-          </w:p>
-        </w:tc>
-      </w:tr>
-      <w:tr>
-        <w:tc>
-          <w:tcPr>
-            <w:tcW w:type="dxa" w:w="2880"/>
-          </w:tcPr>
-          <w:p>
-            <w:r>
-              <w:t>V2e — Sector rotation scoring</w:t>
-            </w:r>
-          </w:p>
-        </w:tc>
-        <w:tc>
-          <w:tcPr>
-            <w:tcW w:type="dxa" w:w="2880"/>
-          </w:tcPr>
-          <w:p>
-            <w:r>
-              <w:t>Favor sectors showing relative strength this week; deprioritize lagging sectors</w:t>
-            </w:r>
-          </w:p>
-        </w:tc>
-        <w:tc>
-          <w:tcPr>
-            <w:tcW w:type="dxa" w:w="2880"/>
-          </w:tcPr>
-          <w:p>
-            <w:r>
-              <w:t>Next — feature sprint</w:t>
-            </w:r>
-          </w:p>
-        </w:tc>
-      </w:tr>
-      <w:tr>
-        <w:tc>
-          <w:tcPr>
-            <w:tcW w:type="dxa" w:w="2880"/>
-          </w:tcPr>
-          <w:p>
-            <w:r>
-              <w:t>V2f — Momentum confirmation</w:t>
-            </w:r>
-          </w:p>
-        </w:tc>
-        <w:tc>
-          <w:tcPr>
-            <w:tcW w:type="dxa" w:w="2880"/>
-          </w:tcPr>
-          <w:p>
-            <w:r>
-              <w:t>15-minute rule: wait for confirmed breakout before entry; reduces false signals on gap-and-fade setups</w:t>
-            </w:r>
-          </w:p>
-        </w:tc>
-        <w:tc>
-          <w:tcPr>
-            <w:tcW w:type="dxa" w:w="2880"/>
-          </w:tcPr>
-          <w:p>
-            <w:r>
-              <w:t>Planned</w:t>
-            </w:r>
-          </w:p>
-        </w:tc>
-      </w:tr>
-      <w:tr>
-        <w:tc>
-          <w:tcPr>
-            <w:tcW w:type="dxa" w:w="2880"/>
-          </w:tcPr>
-          <w:p>
-            <w:r>
-              <w:t>Alerts</w:t>
-            </w:r>
-          </w:p>
-        </w:tc>
-        <w:tc>
-          <w:tcPr>
-            <w:tcW w:type="dxa" w:w="2880"/>
-          </w:tcPr>
-          <w:p>
-            <w:r>
-              <w:t>SMS/email on position close (target hit or stop triggered)</w:t>
-            </w:r>
-          </w:p>
-        </w:tc>
-        <w:tc>
-          <w:tcPr>
-            <w:tcW w:type="dxa" w:w="2880"/>
-          </w:tcPr>
-          <w:p>
-            <w:r>
-              <w:t>Planned</w:t>
+          <w:p>
+            <w:r>
+              <w:t>2-week paper validation gate</w:t>
+            </w:r>
+          </w:p>
+        </w:tc>
+        <w:tc>
+          <w:tcPr>
+            <w:tcW w:type="dxa" w:w="2880"/>
+          </w:tcPr>
+          <w:p>
+            <w:r>
+              <w:t>Run python3 eval.py --days 14 on June 1; confirm NATIVE_TRAIL exits firing correctly, win rate ≥80%, avg P&amp;L ≥$500/day, no integrity flags</w:t>
+            </w:r>
+          </w:p>
+        </w:tc>
+        <w:tc>
+          <w:tcPr>
+            <w:tcW w:type="dxa" w:w="2880"/>
+          </w:tcPr>
+          <w:p>
+            <w:r>
+              <w:t>P0 — gate: 2026-06-01</w:t>
+            </w:r>
+          </w:p>
+        </w:tc>
+      </w:tr>
+      <w:tr>
+        <w:tc>
+          <w:tcPr>
+            <w:tcW w:type="dxa" w:w="2880"/>
+          </w:tcPr>
+          <w:p>
+            <w:r>
+              <w:t>Post-fix backtest</w:t>
+            </w:r>
+          </w:p>
+        </w:tc>
+        <w:tc>
+          <w:tcPr>
+            <w:tcW w:type="dxa" w:w="2880"/>
+          </w:tcPr>
+          <w:p>
+            <w:r>
+              <w:t>python3 backtest.py --days 30 --top 15; compare to $716/day pre-fix baseline</w:t>
+            </w:r>
+          </w:p>
+        </w:tc>
+        <w:tc>
+          <w:tcPr>
+            <w:tcW w:type="dxa" w:w="2880"/>
+          </w:tcPr>
+          <w:p>
+            <w:r>
+              <w:t>After June 1</w:t>
+            </w:r>
+          </w:p>
+        </w:tc>
+      </w:tr>
+      <w:tr>
+        <w:tc>
+          <w:tcPr>
+            <w:tcW w:type="dxa" w:w="2880"/>
+          </w:tcPr>
+          <w:p>
+            <w:r>
+              <w:t>Real money capital sizing</w:t>
+            </w:r>
+          </w:p>
+        </w:tc>
+        <w:tc>
+          <w:tcPr>
+            <w:tcW w:type="dxa" w:w="2880"/>
+          </w:tcPr>
+          <w:p>
+            <w:r>
+              <w:t>Decide capital amount; rescale POSITION_SIZE_BY_CONFIDENCE and DAILY_LOCK_IN_TARGET proportionally</w:t>
+            </w:r>
+          </w:p>
+        </w:tc>
+        <w:tc>
+          <w:tcPr>
+            <w:tcW w:type="dxa" w:w="2880"/>
+          </w:tcPr>
+          <w:p>
+            <w:r>
+              <w:t>After June 1</w:t>
             </w:r>
           </w:p>
         </w:tc>
@@ -14169,17 +14501,17 @@
           </w:tcPr>
           <w:p>
             <w:r>
-              <w:t>Run paper trading for 30 days to verify AUC 0.78 translates to higher win rate vs baseline; compare ml_score-ranked vs unranked runs</w:t>
-            </w:r>
-          </w:p>
-        </w:tc>
-        <w:tc>
-          <w:tcPr>
-            <w:tcW w:type="dxa" w:w="2880"/>
-          </w:tcPr>
-          <w:p>
-            <w:r>
-              <w:t>Next</w:t>
+              <w:t>Compare win rate vs baseline (no scorer) over 30 days paper; validate AUC 0.78 holds live</w:t>
+            </w:r>
+          </w:p>
+        </w:tc>
+        <w:tc>
+          <w:tcPr>
+            <w:tcW w:type="dxa" w:w="2880"/>
+          </w:tcPr>
+          <w:p>
+            <w:r>
+              <w:t>Next sprint</w:t>
             </w:r>
           </w:p>
         </w:tc>
@@ -14211,39 +14543,71 @@
           </w:tcPr>
           <w:p>
             <w:r>
-              <w:t>Real Edge backlog</w:t>
-            </w:r>
-          </w:p>
-        </w:tc>
-      </w:tr>
-      <w:tr>
-        <w:tc>
-          <w:tcPr>
-            <w:tcW w:type="dxa" w:w="2880"/>
-          </w:tcPr>
-          <w:p>
-            <w:r>
-              <w:t>Market regime classifier</w:t>
-            </w:r>
-          </w:p>
-        </w:tc>
-        <w:tc>
-          <w:tcPr>
-            <w:tcW w:type="dxa" w:w="2880"/>
-          </w:tcPr>
-          <w:p>
-            <w:r>
-              <w:t>Label trending vs ranging vs reversal days; adjust strategy per regime</w:t>
-            </w:r>
-          </w:p>
-        </w:tc>
-        <w:tc>
-          <w:tcPr>
-            <w:tcW w:type="dxa" w:w="2880"/>
-          </w:tcPr>
-          <w:p>
-            <w:r>
-              <w:t>Real Edge backlog</w:t>
+              <w:t>Backlog</w:t>
+            </w:r>
+          </w:p>
+        </w:tc>
+      </w:tr>
+      <w:tr>
+        <w:tc>
+          <w:tcPr>
+            <w:tcW w:type="dxa" w:w="2880"/>
+          </w:tcPr>
+          <w:p>
+            <w:r>
+              <w:t>Options flow signal</w:t>
+            </w:r>
+          </w:p>
+        </w:tc>
+        <w:tc>
+          <w:tcPr>
+            <w:tcW w:type="dxa" w:w="2880"/>
+          </w:tcPr>
+          <w:p>
+            <w:r>
+              <w:t>Unusual options activity as leading indicator for next-day momentum plays</w:t>
+            </w:r>
+          </w:p>
+        </w:tc>
+        <w:tc>
+          <w:tcPr>
+            <w:tcW w:type="dxa" w:w="2880"/>
+          </w:tcPr>
+          <w:p>
+            <w:r>
+              <w:t>Backlog</w:t>
+            </w:r>
+          </w:p>
+        </w:tc>
+      </w:tr>
+      <w:tr>
+        <w:tc>
+          <w:tcPr>
+            <w:tcW w:type="dxa" w:w="2880"/>
+          </w:tcPr>
+          <w:p>
+            <w:r>
+              <w:t>Insider buying (Form 4)</w:t>
+            </w:r>
+          </w:p>
+        </w:tc>
+        <w:tc>
+          <w:tcPr>
+            <w:tcW w:type="dxa" w:w="2880"/>
+          </w:tcPr>
+          <w:p>
+            <w:r>
+              <w:t>SEC Form 4 filings as conviction signal; weight Claude selection toward insider-bought tickers</w:t>
+            </w:r>
+          </w:p>
+        </w:tc>
+        <w:tc>
+          <w:tcPr>
+            <w:tcW w:type="dxa" w:w="2880"/>
+          </w:tcPr>
+          <w:p>
+            <w:r>
+              <w:t>Backlog</w:t>
             </w:r>
           </w:p>
         </w:tc>

</xml_diff>